<commit_message>
Add "BasePath Component Fails to Trigger Build Error or Documentation Lacks Sufficient Guidelines When Required Namespace Is Missing in .NET 10 to .NET 11 Upgraded Apps" issue details
</commit_message>
<xml_diff>
--- a/Evidence/BlazorWebApp-BasePath-Validation.docx
+++ b/Evidence/BlazorWebApp-BasePath-Validation.docx
@@ -13506,6 +13506,619 @@
         </w:rPr>
       </w:pPr>
     </w:p>
+    <w:p>
+      <w:pPr>
+        <w:rPr>
+          <w:b/>
+          <w:bCs/>
+        </w:rPr>
+      </w:pPr>
+      <w:r>
+        <w:rPr>
+          <w:b/>
+          <w:bCs/>
+        </w:rPr>
+        <w:t>Problems</w:t>
+      </w:r>
+    </w:p>
+    <w:p>
+      <w:pPr>
+        <w:rPr>
+          <w:b/>
+          <w:bCs/>
+        </w:rPr>
+      </w:pPr>
+      <w:r>
+        <w:rPr>
+          <w:b/>
+          <w:bCs/>
+        </w:rPr>
+        <w:lastRenderedPageBreak/>
+        <w:t>1.</w:t>
+      </w:r>
+      <w:r>
+        <w:rPr>
+          <w:rFonts w:ascii="Segoe UI" w:eastAsia="Times New Roman" w:hAnsi="Segoe UI" w:cs="Segoe UI"/>
+          <w:kern w:val="0"/>
+          <w:sz w:val="21"/>
+          <w:szCs w:val="21"/>
+          <w14:ligatures w14:val="none"/>
+        </w:rPr>
+        <w:t xml:space="preserve"> </w:t>
+      </w:r>
+      <w:proofErr w:type="spellStart"/>
+      <w:r>
+        <w:rPr>
+          <w:b/>
+          <w:bCs/>
+        </w:rPr>
+        <w:t>BasePath</w:t>
+      </w:r>
+      <w:proofErr w:type="spellEnd"/>
+      <w:r>
+        <w:rPr>
+          <w:b/>
+          <w:bCs/>
+        </w:rPr>
+        <w:t xml:space="preserve"> Component Fails to Trigger Build Error or Documentation Lacks Sufficient Guidelines When Required Namespace Is Missing in .NET 10 to .NET 11 Upgraded Apps</w:t>
+      </w:r>
+    </w:p>
+    <w:p>
+      <w:pPr>
+        <w:rPr>
+          <w:b/>
+          <w:bCs/>
+        </w:rPr>
+      </w:pPr>
+    </w:p>
+    <w:p>
+      <w:r>
+        <w:rPr>
+          <w:b/>
+          <w:bCs/>
+        </w:rPr>
+        <w:t>Short Summary</w:t>
+      </w:r>
+    </w:p>
+    <w:p>
+      <w:r>
+        <w:t>A Blazor Web App upgraded from .NET 10 to .NET 11 does not report a build error when the &lt;</w:t>
+      </w:r>
+      <w:proofErr w:type="spellStart"/>
+      <w:r>
+        <w:t>BasePath</w:t>
+      </w:r>
+      <w:proofErr w:type="spellEnd"/>
+      <w:r>
+        <w:t xml:space="preserve"> /&gt; component is used without its required namespace, nor does the documentation provide adequate guidelines regarding this dependency. Although the application builds successfully with only a warning, the browser treats the unrendered &lt;</w:t>
+      </w:r>
+      <w:proofErr w:type="spellStart"/>
+      <w:r>
+        <w:t>BasePath</w:t>
+      </w:r>
+      <w:proofErr w:type="spellEnd"/>
+      <w:r>
+        <w:t xml:space="preserve"> /&gt; tag as an unknown element, causing all subsequent &lt;head&gt; elements to be incorrectly pushed into the &lt;body&gt; tag at runtime.</w:t>
+      </w:r>
+      <w:r>
+        <w:br/>
+      </w:r>
+    </w:p>
+    <w:p>
+      <w:r>
+        <w:rPr>
+          <w:b/>
+          <w:bCs/>
+        </w:rPr>
+        <w:t>What Happened</w:t>
+      </w:r>
+    </w:p>
+    <w:p>
+      <w:r>
+        <w:t xml:space="preserve">After replacing the &lt;base </w:t>
+      </w:r>
+      <w:proofErr w:type="spellStart"/>
+      <w:r>
+        <w:t>href</w:t>
+      </w:r>
+      <w:proofErr w:type="spellEnd"/>
+      <w:r>
+        <w:t>="/" /&gt; element with the &lt;</w:t>
+      </w:r>
+      <w:proofErr w:type="spellStart"/>
+      <w:r>
+        <w:t>BasePath</w:t>
+      </w:r>
+      <w:proofErr w:type="spellEnd"/>
+      <w:r>
+        <w:t xml:space="preserve"> /&gt; component in a Blazor Web App upgraded from .NET 10 to .NET 11, the application builds and launches successfully with only a warning—even when the required @using </w:t>
+      </w:r>
+      <w:proofErr w:type="spellStart"/>
+      <w:proofErr w:type="gramStart"/>
+      <w:r>
+        <w:t>Microsoft.AspNetCore.Components.Endpoints</w:t>
+      </w:r>
+      <w:proofErr w:type="spellEnd"/>
+      <w:proofErr w:type="gramEnd"/>
+      <w:r>
+        <w:t xml:space="preserve"> namespace is missing from _</w:t>
+      </w:r>
+      <w:proofErr w:type="spellStart"/>
+      <w:r>
+        <w:t>Imports.razor</w:t>
+      </w:r>
+      <w:proofErr w:type="spellEnd"/>
+      <w:r>
+        <w:t>.</w:t>
+      </w:r>
+    </w:p>
+    <w:p>
+      <w:r>
+        <w:t xml:space="preserve">No build errors are reported, and the current documentation lacks explicit instructions regarding this </w:t>
+      </w:r>
+      <w:proofErr w:type="gramStart"/>
+      <w:r>
+        <w:t>setup</w:t>
+      </w:r>
+      <w:proofErr w:type="gramEnd"/>
+      <w:r>
+        <w:t>. Because the component is unrecognized by the compiler, the literal &lt;</w:t>
+      </w:r>
+      <w:proofErr w:type="spellStart"/>
+      <w:r>
+        <w:t>BasePath</w:t>
+      </w:r>
+      <w:proofErr w:type="spellEnd"/>
+      <w:r>
+        <w:t xml:space="preserve"> /&gt; tag is </w:t>
+      </w:r>
+      <w:proofErr w:type="gramStart"/>
+      <w:r>
+        <w:t>outputted</w:t>
+      </w:r>
+      <w:proofErr w:type="gramEnd"/>
+      <w:r>
+        <w:t xml:space="preserve"> directly to the browser. This invalid HTML structure causes the browser to prematurely close the &lt;head&gt; section and force all subsequent expected &lt;head&gt; elements into the &lt;body&gt; tag at runtime.</w:t>
+      </w:r>
+      <w:r>
+        <w:br/>
+      </w:r>
+    </w:p>
+    <w:p>
+      <w:r>
+        <w:rPr>
+          <w:b/>
+          <w:bCs/>
+        </w:rPr>
+        <w:t>What You Expected Instead</w:t>
+      </w:r>
+    </w:p>
+    <w:p>
+      <w:r>
+        <w:t>One of the following should occur:</w:t>
+      </w:r>
+    </w:p>
+    <w:p>
+      <w:pPr>
+        <w:numPr>
+          <w:ilvl w:val="0"/>
+          <w:numId w:val="9"/>
+        </w:numPr>
+        <w:rPr>
+          <w:b/>
+          <w:bCs/>
+        </w:rPr>
+      </w:pPr>
+      <w:r>
+        <w:rPr>
+          <w:b/>
+          <w:bCs/>
+        </w:rPr>
+        <w:t>Build Validation:</w:t>
+      </w:r>
+      <w:r>
+        <w:t xml:space="preserve"> A build error should occur, clearly indicating that the required namespace is missing.</w:t>
+      </w:r>
+    </w:p>
+    <w:p>
+      <w:pPr>
+        <w:numPr>
+          <w:ilvl w:val="0"/>
+          <w:numId w:val="9"/>
+        </w:numPr>
+        <w:rPr>
+          <w:b/>
+          <w:bCs/>
+        </w:rPr>
+      </w:pPr>
+      <w:r>
+        <w:rPr>
+          <w:b/>
+          <w:bCs/>
+        </w:rPr>
+        <w:t>Documentation Guidelines:</w:t>
+      </w:r>
+      <w:r>
+        <w:t xml:space="preserve"> If this silent fallback behavior is intentional by design, the official documentation should explicitly state the component's required namespace and mention that it preserves the casing of the requested sub-path to prevent developer confusion.</w:t>
+      </w:r>
+    </w:p>
+    <w:p>
+      <w:r>
+        <w:t> </w:t>
+      </w:r>
+    </w:p>
+    <w:p>
+      <w:r>
+        <w:rPr>
+          <w:b/>
+          <w:bCs/>
+        </w:rPr>
+        <w:t>Steps to Reproduce</w:t>
+      </w:r>
+    </w:p>
+    <w:p>
+      <w:pPr>
+        <w:numPr>
+          <w:ilvl w:val="0"/>
+          <w:numId w:val="10"/>
+        </w:numPr>
+      </w:pPr>
+      <w:r>
+        <w:lastRenderedPageBreak/>
+        <w:t>Create a Blazor Web App in .NET 10 using one of the following render modes:</w:t>
+      </w:r>
+    </w:p>
+    <w:p>
+      <w:pPr>
+        <w:numPr>
+          <w:ilvl w:val="1"/>
+          <w:numId w:val="10"/>
+        </w:numPr>
+      </w:pPr>
+      <w:r>
+        <w:t>Static SSR</w:t>
+      </w:r>
+    </w:p>
+    <w:p>
+      <w:pPr>
+        <w:numPr>
+          <w:ilvl w:val="1"/>
+          <w:numId w:val="10"/>
+        </w:numPr>
+      </w:pPr>
+      <w:r>
+        <w:t>Interactive Server</w:t>
+      </w:r>
+    </w:p>
+    <w:p>
+      <w:pPr>
+        <w:numPr>
+          <w:ilvl w:val="1"/>
+          <w:numId w:val="10"/>
+        </w:numPr>
+      </w:pPr>
+      <w:r>
+        <w:t xml:space="preserve">Interactive </w:t>
+      </w:r>
+      <w:proofErr w:type="spellStart"/>
+      <w:r>
+        <w:t>WebAssembly</w:t>
+      </w:r>
+      <w:proofErr w:type="spellEnd"/>
+    </w:p>
+    <w:p>
+      <w:pPr>
+        <w:numPr>
+          <w:ilvl w:val="0"/>
+          <w:numId w:val="10"/>
+        </w:numPr>
+      </w:pPr>
+      <w:r>
+        <w:t>Update the project's Target Framework Moniker (TFM) in the .</w:t>
+      </w:r>
+      <w:proofErr w:type="spellStart"/>
+      <w:r>
+        <w:t>csproj</w:t>
+      </w:r>
+      <w:proofErr w:type="spellEnd"/>
+      <w:r>
+        <w:t xml:space="preserve"> file from net10.0 to net11.0:</w:t>
+      </w:r>
+      <w:r>
+        <w:br/>
+        <w:t xml:space="preserve">&lt;Project </w:t>
+      </w:r>
+      <w:proofErr w:type="spellStart"/>
+      <w:r>
+        <w:t>Sdk</w:t>
+      </w:r>
+      <w:proofErr w:type="spellEnd"/>
+      <w:r>
+        <w:t>="</w:t>
+      </w:r>
+      <w:proofErr w:type="spellStart"/>
+      <w:proofErr w:type="gramStart"/>
+      <w:r>
+        <w:t>Microsoft.NET.Sdk.Web</w:t>
+      </w:r>
+      <w:proofErr w:type="spellEnd"/>
+      <w:proofErr w:type="gramEnd"/>
+      <w:r>
+        <w:t>"&gt;</w:t>
+      </w:r>
+      <w:r>
+        <w:br/>
+        <w:t xml:space="preserve">  &lt;</w:t>
+      </w:r>
+      <w:proofErr w:type="spellStart"/>
+      <w:r>
+        <w:t>PropertyGroup</w:t>
+      </w:r>
+      <w:proofErr w:type="spellEnd"/>
+      <w:r>
+        <w:t>&gt;</w:t>
+      </w:r>
+      <w:r>
+        <w:br/>
+        <w:t>-   &lt;</w:t>
+      </w:r>
+      <w:proofErr w:type="spellStart"/>
+      <w:r>
+        <w:t>TargetFramework</w:t>
+      </w:r>
+      <w:proofErr w:type="spellEnd"/>
+      <w:r>
+        <w:t>&gt;net10.0&lt;/</w:t>
+      </w:r>
+      <w:proofErr w:type="spellStart"/>
+      <w:r>
+        <w:t>TargetFramework</w:t>
+      </w:r>
+      <w:proofErr w:type="spellEnd"/>
+      <w:r>
+        <w:t>&gt;</w:t>
+      </w:r>
+      <w:r>
+        <w:br/>
+        <w:t>+   &lt;</w:t>
+      </w:r>
+      <w:proofErr w:type="spellStart"/>
+      <w:r>
+        <w:t>TargetFramework</w:t>
+      </w:r>
+      <w:proofErr w:type="spellEnd"/>
+      <w:r>
+        <w:t>&gt;net11.0&lt;/</w:t>
+      </w:r>
+      <w:proofErr w:type="spellStart"/>
+      <w:r>
+        <w:t>TargetFramework</w:t>
+      </w:r>
+      <w:proofErr w:type="spellEnd"/>
+      <w:r>
+        <w:t>&gt;</w:t>
+      </w:r>
+      <w:r>
+        <w:br/>
+        <w:t xml:space="preserve">  &lt;/</w:t>
+      </w:r>
+      <w:proofErr w:type="spellStart"/>
+      <w:r>
+        <w:t>PropertyGroup</w:t>
+      </w:r>
+      <w:proofErr w:type="spellEnd"/>
+      <w:r>
+        <w:t>&gt;</w:t>
+      </w:r>
+      <w:r>
+        <w:br/>
+        <w:t>&lt;/Project&gt;</w:t>
+      </w:r>
+    </w:p>
+    <w:p>
+      <w:pPr>
+        <w:numPr>
+          <w:ilvl w:val="0"/>
+          <w:numId w:val="10"/>
+        </w:numPr>
+      </w:pPr>
+      <w:r>
+        <w:t xml:space="preserve">In </w:t>
+      </w:r>
+      <w:proofErr w:type="spellStart"/>
+      <w:r>
+        <w:t>App.razor</w:t>
+      </w:r>
+      <w:proofErr w:type="spellEnd"/>
+      <w:r>
+        <w:t>, replace:</w:t>
+      </w:r>
+      <w:r>
+        <w:br/>
+        <w:t xml:space="preserve">&lt;base </w:t>
+      </w:r>
+      <w:proofErr w:type="spellStart"/>
+      <w:r>
+        <w:t>href</w:t>
+      </w:r>
+      <w:proofErr w:type="spellEnd"/>
+      <w:r>
+        <w:t>="/" /&gt;</w:t>
+      </w:r>
+      <w:r>
+        <w:br/>
+      </w:r>
+      <w:r>
+        <w:br/>
+        <w:t>with:</w:t>
+      </w:r>
+      <w:r>
+        <w:br/>
+        <w:t>&lt;</w:t>
+      </w:r>
+      <w:proofErr w:type="spellStart"/>
+      <w:r>
+        <w:t>BasePath</w:t>
+      </w:r>
+      <w:proofErr w:type="spellEnd"/>
+      <w:r>
+        <w:t xml:space="preserve"> /&gt;</w:t>
+      </w:r>
+    </w:p>
+    <w:p>
+      <w:pPr>
+        <w:numPr>
+          <w:ilvl w:val="0"/>
+          <w:numId w:val="10"/>
+        </w:numPr>
+      </w:pPr>
+      <w:r>
+        <w:t xml:space="preserve">Build and run the application </w:t>
+      </w:r>
+      <w:r>
+        <w:rPr>
+          <w:b/>
+          <w:bCs/>
+        </w:rPr>
+        <w:t>without</w:t>
+      </w:r>
+      <w:r>
+        <w:t xml:space="preserve"> adding the following namespace to _</w:t>
+      </w:r>
+      <w:proofErr w:type="spellStart"/>
+      <w:r>
+        <w:t>Imports.razor</w:t>
+      </w:r>
+      <w:proofErr w:type="spellEnd"/>
+      <w:r>
+        <w:t xml:space="preserve"> or </w:t>
+      </w:r>
+      <w:proofErr w:type="spellStart"/>
+      <w:r>
+        <w:t>App.razor</w:t>
+      </w:r>
+      <w:proofErr w:type="spellEnd"/>
+      <w:r>
+        <w:t>:</w:t>
+      </w:r>
+      <w:r>
+        <w:br/>
+        <w:t xml:space="preserve">@using </w:t>
+      </w:r>
+      <w:proofErr w:type="spellStart"/>
+      <w:proofErr w:type="gramStart"/>
+      <w:r>
+        <w:t>Microsoft.AspNetCore.Components.Endpoints</w:t>
+      </w:r>
+      <w:proofErr w:type="spellEnd"/>
+      <w:proofErr w:type="gramEnd"/>
+    </w:p>
+    <w:p/>
+    <w:p>
+      <w:r>
+        <w:rPr>
+          <w:b/>
+          <w:bCs/>
+        </w:rPr>
+        <w:t>Actual Result</w:t>
+      </w:r>
+    </w:p>
+    <w:p>
+      <w:r>
+        <w:t>The application builds and launches successfully without any build errors, and the official documentation lacks clear guidelines regarding the necessary namespace setup. At runtime, the compiler outputs the literal &lt;</w:t>
+      </w:r>
+      <w:proofErr w:type="spellStart"/>
+      <w:r>
+        <w:t>BasePath</w:t>
+      </w:r>
+      <w:proofErr w:type="spellEnd"/>
+      <w:r>
+        <w:t xml:space="preserve"> /&gt; string as text, which breaks the HTML parsing structure and forces subsequent &lt;head&gt; elements into the &lt;body&gt; tag.</w:t>
+      </w:r>
+    </w:p>
+    <w:p/>
+    <w:p>
+      <w:r>
+        <w:rPr>
+          <w:b/>
+          <w:bCs/>
+        </w:rPr>
+        <w:t>Expected Result</w:t>
+      </w:r>
+    </w:p>
+    <w:p>
+      <w:r>
+        <w:t xml:space="preserve">The build should fail with a clear compiler error indicating that the </w:t>
+      </w:r>
+      <w:proofErr w:type="spellStart"/>
+      <w:proofErr w:type="gramStart"/>
+      <w:r>
+        <w:t>Microsoft.AspNetCore.Components.Endpoints</w:t>
+      </w:r>
+      <w:proofErr w:type="spellEnd"/>
+      <w:proofErr w:type="gramEnd"/>
+      <w:r>
+        <w:t xml:space="preserve"> namespace is required to use the &lt;</w:t>
+      </w:r>
+      <w:proofErr w:type="spellStart"/>
+      <w:r>
+        <w:t>BasePath</w:t>
+      </w:r>
+      <w:proofErr w:type="spellEnd"/>
+      <w:r>
+        <w:t xml:space="preserve"> /&gt; component. Alternatively, if a build failure is not possible by design, the </w:t>
+      </w:r>
+      <w:r>
+        <w:lastRenderedPageBreak/>
+        <w:t>official documentation must provide sufficient guidelines by detailing the required namespace and stating that the component preserves sub-path casing.</w:t>
+      </w:r>
+    </w:p>
+    <w:p/>
+    <w:p>
+      <w:r>
+        <w:rPr>
+          <w:b/>
+          <w:bCs/>
+        </w:rPr>
+        <w:t xml:space="preserve">Evidence: </w:t>
+      </w:r>
+      <w:hyperlink r:id="rId37" w:history="1">
+        <w:r>
+          <w:rPr>
+            <w:rStyle w:val="Hyperlink"/>
+          </w:rPr>
+          <w:t>BlazorWebApp-BasePath-Validation/Evidence/net10-to-net11-upgrade/Issue_BasePath_MissingNamespace.zip at main · BharatRamsf3693/</w:t>
+        </w:r>
+        <w:proofErr w:type="spellStart"/>
+        <w:r>
+          <w:rPr>
+            <w:rStyle w:val="Hyperlink"/>
+          </w:rPr>
+          <w:t>BlazorWebApp</w:t>
+        </w:r>
+        <w:proofErr w:type="spellEnd"/>
+        <w:r>
+          <w:rPr>
+            <w:rStyle w:val="Hyperlink"/>
+          </w:rPr>
+          <w:t>-</w:t>
+        </w:r>
+        <w:proofErr w:type="spellStart"/>
+        <w:r>
+          <w:rPr>
+            <w:rStyle w:val="Hyperlink"/>
+          </w:rPr>
+          <w:t>BasePath</w:t>
+        </w:r>
+        <w:proofErr w:type="spellEnd"/>
+        <w:r>
+          <w:rPr>
+            <w:rStyle w:val="Hyperlink"/>
+          </w:rPr>
+          <w:t>-Validation</w:t>
+        </w:r>
+      </w:hyperlink>
+    </w:p>
     <w:sectPr>
       <w:pgSz w:w="12240" w:h="15840"/>
       <w:pgMar w:top="1440" w:right="1440" w:bottom="1440" w:left="1440" w:header="720" w:footer="720" w:gutter="0"/>
@@ -13781,6 +14394,119 @@
     </w:lvl>
   </w:abstractNum>
   <w:abstractNum w:abstractNumId="2" w15:restartNumberingAfterBreak="0">
+    <w:nsid w:val="143B5D2B"/>
+    <w:multiLevelType w:val="multilevel"/>
+    <w:tmpl w:val="165C0ADC"/>
+    <w:lvl w:ilvl="0">
+      <w:start w:val="1"/>
+      <w:numFmt w:val="decimal"/>
+      <w:lvlText w:val="%1."/>
+      <w:lvlJc w:val="left"/>
+      <w:pPr>
+        <w:tabs>
+          <w:tab w:val="num" w:pos="720"/>
+        </w:tabs>
+        <w:ind w:left="720" w:hanging="360"/>
+      </w:pPr>
+    </w:lvl>
+    <w:lvl w:ilvl="1" w:tentative="1">
+      <w:start w:val="1"/>
+      <w:numFmt w:val="decimal"/>
+      <w:lvlText w:val="%2."/>
+      <w:lvlJc w:val="left"/>
+      <w:pPr>
+        <w:tabs>
+          <w:tab w:val="num" w:pos="1440"/>
+        </w:tabs>
+        <w:ind w:left="1440" w:hanging="360"/>
+      </w:pPr>
+    </w:lvl>
+    <w:lvl w:ilvl="2" w:tentative="1">
+      <w:start w:val="1"/>
+      <w:numFmt w:val="decimal"/>
+      <w:lvlText w:val="%3."/>
+      <w:lvlJc w:val="left"/>
+      <w:pPr>
+        <w:tabs>
+          <w:tab w:val="num" w:pos="2160"/>
+        </w:tabs>
+        <w:ind w:left="2160" w:hanging="360"/>
+      </w:pPr>
+    </w:lvl>
+    <w:lvl w:ilvl="3" w:tentative="1">
+      <w:start w:val="1"/>
+      <w:numFmt w:val="decimal"/>
+      <w:lvlText w:val="%4."/>
+      <w:lvlJc w:val="left"/>
+      <w:pPr>
+        <w:tabs>
+          <w:tab w:val="num" w:pos="2880"/>
+        </w:tabs>
+        <w:ind w:left="2880" w:hanging="360"/>
+      </w:pPr>
+    </w:lvl>
+    <w:lvl w:ilvl="4" w:tentative="1">
+      <w:start w:val="1"/>
+      <w:numFmt w:val="decimal"/>
+      <w:lvlText w:val="%5."/>
+      <w:lvlJc w:val="left"/>
+      <w:pPr>
+        <w:tabs>
+          <w:tab w:val="num" w:pos="3600"/>
+        </w:tabs>
+        <w:ind w:left="3600" w:hanging="360"/>
+      </w:pPr>
+    </w:lvl>
+    <w:lvl w:ilvl="5" w:tentative="1">
+      <w:start w:val="1"/>
+      <w:numFmt w:val="decimal"/>
+      <w:lvlText w:val="%6."/>
+      <w:lvlJc w:val="left"/>
+      <w:pPr>
+        <w:tabs>
+          <w:tab w:val="num" w:pos="4320"/>
+        </w:tabs>
+        <w:ind w:left="4320" w:hanging="360"/>
+      </w:pPr>
+    </w:lvl>
+    <w:lvl w:ilvl="6" w:tentative="1">
+      <w:start w:val="1"/>
+      <w:numFmt w:val="decimal"/>
+      <w:lvlText w:val="%7."/>
+      <w:lvlJc w:val="left"/>
+      <w:pPr>
+        <w:tabs>
+          <w:tab w:val="num" w:pos="5040"/>
+        </w:tabs>
+        <w:ind w:left="5040" w:hanging="360"/>
+      </w:pPr>
+    </w:lvl>
+    <w:lvl w:ilvl="7" w:tentative="1">
+      <w:start w:val="1"/>
+      <w:numFmt w:val="decimal"/>
+      <w:lvlText w:val="%8."/>
+      <w:lvlJc w:val="left"/>
+      <w:pPr>
+        <w:tabs>
+          <w:tab w:val="num" w:pos="5760"/>
+        </w:tabs>
+        <w:ind w:left="5760" w:hanging="360"/>
+      </w:pPr>
+    </w:lvl>
+    <w:lvl w:ilvl="8" w:tentative="1">
+      <w:start w:val="1"/>
+      <w:numFmt w:val="decimal"/>
+      <w:lvlText w:val="%9."/>
+      <w:lvlJc w:val="left"/>
+      <w:pPr>
+        <w:tabs>
+          <w:tab w:val="num" w:pos="6480"/>
+        </w:tabs>
+        <w:ind w:left="6480" w:hanging="360"/>
+      </w:pPr>
+    </w:lvl>
+  </w:abstractNum>
+  <w:abstractNum w:abstractNumId="3" w15:restartNumberingAfterBreak="0">
     <w:nsid w:val="212D6DCE"/>
     <w:multiLevelType w:val="multilevel"/>
     <w:tmpl w:val="8E280250"/>
@@ -13929,7 +14655,7 @@
       </w:rPr>
     </w:lvl>
   </w:abstractNum>
-  <w:abstractNum w:abstractNumId="3" w15:restartNumberingAfterBreak="0">
+  <w:abstractNum w:abstractNumId="4" w15:restartNumberingAfterBreak="0">
     <w:nsid w:val="2EDC5EF3"/>
     <w:multiLevelType w:val="multilevel"/>
     <w:tmpl w:val="CC5219CC"/>
@@ -14078,7 +14804,7 @@
       </w:rPr>
     </w:lvl>
   </w:abstractNum>
-  <w:abstractNum w:abstractNumId="4" w15:restartNumberingAfterBreak="0">
+  <w:abstractNum w:abstractNumId="5" w15:restartNumberingAfterBreak="0">
     <w:nsid w:val="2F4B1DF6"/>
     <w:multiLevelType w:val="multilevel"/>
     <w:tmpl w:val="4080E33A"/>
@@ -14227,7 +14953,124 @@
       </w:rPr>
     </w:lvl>
   </w:abstractNum>
-  <w:abstractNum w:abstractNumId="5" w15:restartNumberingAfterBreak="0">
+  <w:abstractNum w:abstractNumId="6" w15:restartNumberingAfterBreak="0">
+    <w:nsid w:val="42C11B26"/>
+    <w:multiLevelType w:val="multilevel"/>
+    <w:tmpl w:val="7AE64520"/>
+    <w:lvl w:ilvl="0">
+      <w:start w:val="1"/>
+      <w:numFmt w:val="decimal"/>
+      <w:lvlText w:val="%1."/>
+      <w:lvlJc w:val="left"/>
+      <w:pPr>
+        <w:tabs>
+          <w:tab w:val="num" w:pos="720"/>
+        </w:tabs>
+        <w:ind w:left="720" w:hanging="360"/>
+      </w:pPr>
+    </w:lvl>
+    <w:lvl w:ilvl="1">
+      <w:start w:val="1"/>
+      <w:numFmt w:val="bullet"/>
+      <w:lvlText w:val="o"/>
+      <w:lvlJc w:val="left"/>
+      <w:pPr>
+        <w:tabs>
+          <w:tab w:val="num" w:pos="1440"/>
+        </w:tabs>
+        <w:ind w:left="1440" w:hanging="360"/>
+      </w:pPr>
+      <w:rPr>
+        <w:rFonts w:ascii="Courier New" w:hAnsi="Courier New" w:hint="default"/>
+        <w:sz w:val="20"/>
+      </w:rPr>
+    </w:lvl>
+    <w:lvl w:ilvl="2" w:tentative="1">
+      <w:start w:val="1"/>
+      <w:numFmt w:val="decimal"/>
+      <w:lvlText w:val="%3."/>
+      <w:lvlJc w:val="left"/>
+      <w:pPr>
+        <w:tabs>
+          <w:tab w:val="num" w:pos="2160"/>
+        </w:tabs>
+        <w:ind w:left="2160" w:hanging="360"/>
+      </w:pPr>
+    </w:lvl>
+    <w:lvl w:ilvl="3" w:tentative="1">
+      <w:start w:val="1"/>
+      <w:numFmt w:val="decimal"/>
+      <w:lvlText w:val="%4."/>
+      <w:lvlJc w:val="left"/>
+      <w:pPr>
+        <w:tabs>
+          <w:tab w:val="num" w:pos="2880"/>
+        </w:tabs>
+        <w:ind w:left="2880" w:hanging="360"/>
+      </w:pPr>
+    </w:lvl>
+    <w:lvl w:ilvl="4" w:tentative="1">
+      <w:start w:val="1"/>
+      <w:numFmt w:val="decimal"/>
+      <w:lvlText w:val="%5."/>
+      <w:lvlJc w:val="left"/>
+      <w:pPr>
+        <w:tabs>
+          <w:tab w:val="num" w:pos="3600"/>
+        </w:tabs>
+        <w:ind w:left="3600" w:hanging="360"/>
+      </w:pPr>
+    </w:lvl>
+    <w:lvl w:ilvl="5" w:tentative="1">
+      <w:start w:val="1"/>
+      <w:numFmt w:val="decimal"/>
+      <w:lvlText w:val="%6."/>
+      <w:lvlJc w:val="left"/>
+      <w:pPr>
+        <w:tabs>
+          <w:tab w:val="num" w:pos="4320"/>
+        </w:tabs>
+        <w:ind w:left="4320" w:hanging="360"/>
+      </w:pPr>
+    </w:lvl>
+    <w:lvl w:ilvl="6" w:tentative="1">
+      <w:start w:val="1"/>
+      <w:numFmt w:val="decimal"/>
+      <w:lvlText w:val="%7."/>
+      <w:lvlJc w:val="left"/>
+      <w:pPr>
+        <w:tabs>
+          <w:tab w:val="num" w:pos="5040"/>
+        </w:tabs>
+        <w:ind w:left="5040" w:hanging="360"/>
+      </w:pPr>
+    </w:lvl>
+    <w:lvl w:ilvl="7" w:tentative="1">
+      <w:start w:val="1"/>
+      <w:numFmt w:val="decimal"/>
+      <w:lvlText w:val="%8."/>
+      <w:lvlJc w:val="left"/>
+      <w:pPr>
+        <w:tabs>
+          <w:tab w:val="num" w:pos="5760"/>
+        </w:tabs>
+        <w:ind w:left="5760" w:hanging="360"/>
+      </w:pPr>
+    </w:lvl>
+    <w:lvl w:ilvl="8" w:tentative="1">
+      <w:start w:val="1"/>
+      <w:numFmt w:val="decimal"/>
+      <w:lvlText w:val="%9."/>
+      <w:lvlJc w:val="left"/>
+      <w:pPr>
+        <w:tabs>
+          <w:tab w:val="num" w:pos="6480"/>
+        </w:tabs>
+        <w:ind w:left="6480" w:hanging="360"/>
+      </w:pPr>
+    </w:lvl>
+  </w:abstractNum>
+  <w:abstractNum w:abstractNumId="7" w15:restartNumberingAfterBreak="0">
     <w:nsid w:val="6544398A"/>
     <w:multiLevelType w:val="multilevel"/>
     <w:tmpl w:val="33D860BE"/>
@@ -14376,7 +15219,7 @@
       </w:rPr>
     </w:lvl>
   </w:abstractNum>
-  <w:abstractNum w:abstractNumId="6" w15:restartNumberingAfterBreak="0">
+  <w:abstractNum w:abstractNumId="8" w15:restartNumberingAfterBreak="0">
     <w:nsid w:val="6E4A6323"/>
     <w:multiLevelType w:val="multilevel"/>
     <w:tmpl w:val="FC2CE164"/>
@@ -14525,7 +15368,7 @@
       </w:rPr>
     </w:lvl>
   </w:abstractNum>
-  <w:abstractNum w:abstractNumId="7" w15:restartNumberingAfterBreak="0">
+  <w:abstractNum w:abstractNumId="9" w15:restartNumberingAfterBreak="0">
     <w:nsid w:val="7D283401"/>
     <w:multiLevelType w:val="multilevel"/>
     <w:tmpl w:val="7B2CC87A"/>
@@ -14675,13 +15518,13 @@
     </w:lvl>
   </w:abstractNum>
   <w:num w:numId="1" w16cid:durableId="1625233335">
-    <w:abstractNumId w:val="4"/>
+    <w:abstractNumId w:val="5"/>
   </w:num>
   <w:num w:numId="2" w16cid:durableId="1421364274">
-    <w:abstractNumId w:val="7"/>
+    <w:abstractNumId w:val="9"/>
   </w:num>
   <w:num w:numId="3" w16cid:durableId="550532365">
-    <w:abstractNumId w:val="6"/>
+    <w:abstractNumId w:val="8"/>
   </w:num>
   <w:num w:numId="4" w16cid:durableId="963272197">
     <w:abstractNumId w:val="0"/>
@@ -14690,16 +15533,28 @@
     </w:lvlOverride>
   </w:num>
   <w:num w:numId="5" w16cid:durableId="1933584062">
-    <w:abstractNumId w:val="5"/>
+    <w:abstractNumId w:val="7"/>
   </w:num>
   <w:num w:numId="6" w16cid:durableId="724834537">
     <w:abstractNumId w:val="1"/>
   </w:num>
   <w:num w:numId="7" w16cid:durableId="232668361">
+    <w:abstractNumId w:val="4"/>
+  </w:num>
+  <w:num w:numId="8" w16cid:durableId="2045520129">
     <w:abstractNumId w:val="3"/>
   </w:num>
-  <w:num w:numId="8" w16cid:durableId="2045520129">
+  <w:num w:numId="9" w16cid:durableId="1466115828">
     <w:abstractNumId w:val="2"/>
+    <w:lvlOverride w:ilvl="0">
+      <w:startOverride w:val="1"/>
+    </w:lvlOverride>
+  </w:num>
+  <w:num w:numId="10" w16cid:durableId="1406948550">
+    <w:abstractNumId w:val="6"/>
+    <w:lvlOverride w:ilvl="0">
+      <w:startOverride w:val="1"/>
+    </w:lvlOverride>
   </w:num>
 </w:numbering>
 </file>
@@ -15307,7 +16162,6 @@
   <w:style w:type="character" w:default="1" w:styleId="DefaultParagraphFont">
     <w:name w:val="Default Paragraph Font"/>
     <w:uiPriority w:val="1"/>
-    <w:semiHidden/>
     <w:unhideWhenUsed/>
   </w:style>
   <w:style w:type="table" w:default="1" w:styleId="TableNormal">
@@ -15644,6 +16498,18 @@
       <w:shd w:val="clear" w:color="auto" w:fill="E1DFDD"/>
     </w:rPr>
   </w:style>
+  <w:style w:type="character" w:styleId="FollowedHyperlink">
+    <w:name w:val="FollowedHyperlink"/>
+    <w:basedOn w:val="DefaultParagraphFont"/>
+    <w:uiPriority w:val="99"/>
+    <w:semiHidden/>
+    <w:unhideWhenUsed/>
+    <w:rsid w:val="00E779DB"/>
+    <w:rPr>
+      <w:color w:val="96607D" w:themeColor="followedHyperlink"/>
+      <w:u w:val="single"/>
+    </w:rPr>
+  </w:style>
 </w:styles>
 </file>
 

</xml_diff>

<commit_message>
Add `BasePath Component Fails to Preserve Sub-path Casing Behind a Reverse Proxy` issue details
</commit_message>
<xml_diff>
--- a/Evidence/BlazorWebApp-BasePath-Validation.docx
+++ b/Evidence/BlazorWebApp-BasePath-Validation.docx
@@ -96,13 +96,8 @@
         </w:tabs>
       </w:pPr>
       <w:r>
-        <w:t xml:space="preserve">Interactive </w:t>
-      </w:r>
-      <w:proofErr w:type="spellStart"/>
-      <w:r>
-        <w:t>WebAssembly</w:t>
-      </w:r>
-      <w:proofErr w:type="spellEnd"/>
+        <w:t>Interactive WebAssembly</w:t>
+      </w:r>
     </w:p>
     <w:p>
       <w:pPr>
@@ -189,63 +184,7 @@
           <w:rPr>
             <w:rStyle w:val="Hyperlink"/>
           </w:rPr>
-          <w:t>BharatRamsf3693/</w:t>
-        </w:r>
-        <w:proofErr w:type="spellStart"/>
-        <w:r>
-          <w:rPr>
-            <w:rStyle w:val="Hyperlink"/>
-          </w:rPr>
-          <w:t>BlazorWebApp</w:t>
-        </w:r>
-        <w:proofErr w:type="spellEnd"/>
-        <w:r>
-          <w:rPr>
-            <w:rStyle w:val="Hyperlink"/>
-          </w:rPr>
-          <w:t>-</w:t>
-        </w:r>
-        <w:proofErr w:type="spellStart"/>
-        <w:r>
-          <w:rPr>
-            <w:rStyle w:val="Hyperlink"/>
-          </w:rPr>
-          <w:t>BasePath</w:t>
-        </w:r>
-        <w:proofErr w:type="spellEnd"/>
-        <w:r>
-          <w:rPr>
-            <w:rStyle w:val="Hyperlink"/>
-          </w:rPr>
-          <w:t xml:space="preserve">-Validation: </w:t>
-        </w:r>
-        <w:proofErr w:type="spellStart"/>
-        <w:r>
-          <w:rPr>
-            <w:rStyle w:val="Hyperlink"/>
-          </w:rPr>
-          <w:t>BlazorWebApp</w:t>
-        </w:r>
-        <w:proofErr w:type="spellEnd"/>
-        <w:r>
-          <w:rPr>
-            <w:rStyle w:val="Hyperlink"/>
-          </w:rPr>
-          <w:t>-</w:t>
-        </w:r>
-        <w:proofErr w:type="spellStart"/>
-        <w:r>
-          <w:rPr>
-            <w:rStyle w:val="Hyperlink"/>
-          </w:rPr>
-          <w:t>BasePath</w:t>
-        </w:r>
-        <w:proofErr w:type="spellEnd"/>
-        <w:r>
-          <w:rPr>
-            <w:rStyle w:val="Hyperlink"/>
-          </w:rPr>
-          <w:t>-Validation</w:t>
+          <w:t>BharatRamsf3693/BlazorWebApp-BasePath-Validation: BlazorWebApp-BasePath-Validation</w:t>
         </w:r>
       </w:hyperlink>
     </w:p>
@@ -267,7 +206,7 @@
         <w:t xml:space="preserve"> </w:t>
       </w:r>
       <w:r>
-        <w:t>4</w:t>
+        <w:t>3</w:t>
       </w:r>
       <w:r>
         <w:t xml:space="preserve"> critical issues and 1 observation</w:t>
@@ -503,15 +442,7 @@
             </w:r>
             <w:r>
               <w:lastRenderedPageBreak/>
-              <w:t xml:space="preserve">scripts, </w:t>
-            </w:r>
-            <w:proofErr w:type="gramStart"/>
-            <w:r>
-              <w:t>stylesheets</w:t>
-            </w:r>
-            <w:proofErr w:type="gramEnd"/>
-            <w:r>
-              <w:t xml:space="preserve"> and images.</w:t>
+              <w:t>scripts, stylesheets and images.</w:t>
             </w:r>
           </w:p>
         </w:tc>
@@ -990,17 +921,8 @@
                       <w:b/>
                       <w:bCs/>
                     </w:rPr>
-                    <w:t xml:space="preserve">Interactive </w:t>
-                  </w:r>
-                  <w:proofErr w:type="spellStart"/>
-                  <w:r>
-                    <w:rPr>
-                      <w:b/>
-                      <w:bCs/>
-                    </w:rPr>
-                    <w:t>WebAssembly</w:t>
-                  </w:r>
-                  <w:proofErr w:type="spellEnd"/>
+                    <w:t>Interactive WebAssembly</w:t>
+                  </w:r>
                 </w:p>
               </w:tc>
               <w:tc>
@@ -1341,17 +1263,8 @@
                       <w:b/>
                       <w:bCs/>
                     </w:rPr>
-                    <w:t xml:space="preserve">Interactive </w:t>
-                  </w:r>
-                  <w:proofErr w:type="spellStart"/>
-                  <w:r>
-                    <w:rPr>
-                      <w:b/>
-                      <w:bCs/>
-                    </w:rPr>
-                    <w:t>WebAssembly</w:t>
-                  </w:r>
-                  <w:proofErr w:type="spellEnd"/>
+                    <w:t>Interactive WebAssembly</w:t>
+                  </w:r>
                 </w:p>
               </w:tc>
               <w:tc>
@@ -1487,15 +1400,7 @@
           </w:tcPr>
           <w:p>
             <w:r>
-              <w:t xml:space="preserve">The rendered &lt;base </w:t>
-            </w:r>
-            <w:proofErr w:type="spellStart"/>
-            <w:r>
-              <w:t>href</w:t>
-            </w:r>
-            <w:proofErr w:type="spellEnd"/>
-            <w:r>
-              <w:t>&gt; matches the prefix the app is served under, including its casing, rather than the casing the app was mounted with.</w:t>
+              <w:t>The rendered &lt;base href&gt; matches the prefix the app is served under, including its casing, rather than the casing the app was mounted with.</w:t>
             </w:r>
           </w:p>
           <w:p>
@@ -2119,17 +2024,8 @@
                       <w:b/>
                       <w:bCs/>
                     </w:rPr>
-                    <w:t xml:space="preserve">Interactive </w:t>
-                  </w:r>
-                  <w:proofErr w:type="spellStart"/>
-                  <w:r>
-                    <w:rPr>
-                      <w:b/>
-                      <w:bCs/>
-                    </w:rPr>
-                    <w:t>WebAssembly</w:t>
-                  </w:r>
-                  <w:proofErr w:type="spellEnd"/>
+                    <w:t>Interactive WebAssembly</w:t>
+                  </w:r>
                 </w:p>
               </w:tc>
               <w:tc>
@@ -2702,7 +2598,6 @@
                     </w:rPr>
                     <w:t xml:space="preserve">Interactive </w:t>
                   </w:r>
-                  <w:proofErr w:type="spellStart"/>
                   <w:r>
                     <w:rPr>
                       <w:b/>
@@ -2711,7 +2606,6 @@
                     <w:lastRenderedPageBreak/>
                     <w:t>WebAssembly</w:t>
                   </w:r>
-                  <w:proofErr w:type="spellEnd"/>
                 </w:p>
               </w:tc>
               <w:tc>
@@ -3221,13 +3115,8 @@
                   </w:r>
                   <w:r>
                     <w:br/>
-                    <w:t xml:space="preserve">Failure </w:t>
-                  </w:r>
-                  <w:proofErr w:type="gramStart"/>
-                  <w:r>
-                    <w:t>reason:.</w:t>
-                  </w:r>
-                  <w:proofErr w:type="gramEnd"/>
+                    <w:t>Failure reason:.</w:t>
+                  </w:r>
                   <w:r>
                     <w:br/>
                     <w:t> </w:t>
@@ -3235,15 +3124,7 @@
                 </w:p>
                 <w:p>
                   <w:r>
-                    <w:t>Case Sensitivity in Proxies: Casing changes in the reverse proxy do not affect the &lt;</w:t>
-                  </w:r>
-                  <w:proofErr w:type="spellStart"/>
-                  <w:r>
-                    <w:t>BasePath</w:t>
-                  </w:r>
-                  <w:proofErr w:type="spellEnd"/>
-                  <w:r>
-                    <w:t xml:space="preserve"> /&gt; component of the application.</w:t>
+                    <w:t>Case Sensitivity in Proxies: Casing changes in the reverse proxy do not affect the &lt;BasePath /&gt; component of the application.</w:t>
                   </w:r>
                 </w:p>
                 <w:p>
@@ -3255,23 +3136,7 @@
                   </w:pPr>
                   <w:r>
                     <w:lastRenderedPageBreak/>
-                    <w:t xml:space="preserve">Proxy </w:t>
-                  </w:r>
-                  <w:proofErr w:type="spellStart"/>
-                  <w:r>
-                    <w:t>subpath</w:t>
-                  </w:r>
-                  <w:proofErr w:type="spellEnd"/>
-                  <w:r>
-                    <w:t>: /</w:t>
-                  </w:r>
-                  <w:proofErr w:type="spellStart"/>
-                  <w:r>
-                    <w:t>StaticSsr</w:t>
-                  </w:r>
-                  <w:proofErr w:type="spellEnd"/>
-                  <w:r>
-                    <w:t>/</w:t>
+                    <w:t>Proxy subpath: /StaticSsr/</w:t>
                   </w:r>
                 </w:p>
                 <w:p>
@@ -3282,23 +3147,7 @@
                     </w:numPr>
                   </w:pPr>
                   <w:r>
-                    <w:t xml:space="preserve">App </w:t>
-                  </w:r>
-                  <w:proofErr w:type="spellStart"/>
-                  <w:r>
-                    <w:t>subpath</w:t>
-                  </w:r>
-                  <w:proofErr w:type="spellEnd"/>
-                  <w:r>
-                    <w:t>: /</w:t>
-                  </w:r>
-                  <w:proofErr w:type="spellStart"/>
-                  <w:r>
-                    <w:t>staticssr</w:t>
-                  </w:r>
-                  <w:proofErr w:type="spellEnd"/>
-                  <w:r>
-                    <w:t>/</w:t>
+                    <w:t>App subpath: /staticssr/</w:t>
                   </w:r>
                 </w:p>
                 <w:p>
@@ -3309,47 +3158,7 @@
                     </w:numPr>
                   </w:pPr>
                   <w:r>
-                    <w:t>Result: The &lt;</w:t>
-                  </w:r>
-                  <w:proofErr w:type="spellStart"/>
-                  <w:r>
-                    <w:t>BasePath</w:t>
-                  </w:r>
-                  <w:proofErr w:type="spellEnd"/>
-                  <w:r>
-                    <w:t xml:space="preserve"> /&gt; component renders &lt;base </w:t>
-                  </w:r>
-                  <w:proofErr w:type="spellStart"/>
-                  <w:r>
-                    <w:t>href</w:t>
-                  </w:r>
-                  <w:proofErr w:type="spellEnd"/>
-                  <w:r>
-                    <w:t>="/</w:t>
-                  </w:r>
-                  <w:proofErr w:type="spellStart"/>
-                  <w:r>
-                    <w:t>staticssr</w:t>
-                  </w:r>
-                  <w:proofErr w:type="spellEnd"/>
-                  <w:r>
-                    <w:t xml:space="preserve">/"&gt; instead of &lt;base </w:t>
-                  </w:r>
-                  <w:proofErr w:type="spellStart"/>
-                  <w:r>
-                    <w:t>href</w:t>
-                  </w:r>
-                  <w:proofErr w:type="spellEnd"/>
-                  <w:r>
-                    <w:t>="/</w:t>
-                  </w:r>
-                  <w:proofErr w:type="spellStart"/>
-                  <w:r>
-                    <w:t>StaticSsr</w:t>
-                  </w:r>
-                  <w:proofErr w:type="spellEnd"/>
-                  <w:r>
-                    <w:t>/"&gt;.</w:t>
+                    <w:t>Result: The &lt;BasePath /&gt; component renders &lt;base href="/staticssr/"&gt; instead of &lt;base href="/StaticSsr/"&gt;.</w:t>
                   </w:r>
                 </w:p>
               </w:tc>
@@ -3614,15 +3423,7 @@
                       <w:b/>
                       <w:bCs/>
                     </w:rPr>
-                    <w:t xml:space="preserve">Interactive </w:t>
-                  </w:r>
-                  <w:proofErr w:type="spellStart"/>
-                  <w:r>
-                    <w:rPr>
-                      <w:b/>
-                      <w:bCs/>
-                    </w:rPr>
-                    <w:t>Web</w:t>
+                    <w:t>Interactive Web</w:t>
                   </w:r>
                   <w:r>
                     <w:rPr>
@@ -3632,7 +3433,6 @@
                     <w:lastRenderedPageBreak/>
                     <w:t>Assembly</w:t>
                   </w:r>
-                  <w:proofErr w:type="spellEnd"/>
                 </w:p>
               </w:tc>
               <w:tc>
@@ -3887,13 +3687,8 @@
                   </w:r>
                   <w:r>
                     <w:br/>
-                    <w:t xml:space="preserve">Failure </w:t>
-                  </w:r>
-                  <w:proofErr w:type="gramStart"/>
-                  <w:r>
-                    <w:t>reason:.</w:t>
-                  </w:r>
-                  <w:proofErr w:type="gramEnd"/>
+                    <w:t>Failure reason:.</w:t>
+                  </w:r>
                   <w:r>
                     <w:br/>
                     <w:t> </w:t>
@@ -3901,15 +3696,7 @@
                 </w:p>
                 <w:p>
                   <w:r>
-                    <w:t>Case Sensitivity in Proxies: Casing changes in the reverse proxy do not affect the &lt;</w:t>
-                  </w:r>
-                  <w:proofErr w:type="spellStart"/>
-                  <w:r>
-                    <w:t>BasePath</w:t>
-                  </w:r>
-                  <w:proofErr w:type="spellEnd"/>
-                  <w:r>
-                    <w:t xml:space="preserve"> /&gt; component of the application.</w:t>
+                    <w:t>Case Sensitivity in Proxies: Casing changes in the reverse proxy do not affect the &lt;BasePath /&gt; component of the application.</w:t>
                   </w:r>
                 </w:p>
                 <w:p>
@@ -3920,23 +3707,7 @@
                     </w:numPr>
                   </w:pPr>
                   <w:r>
-                    <w:t xml:space="preserve">Proxy </w:t>
-                  </w:r>
-                  <w:proofErr w:type="spellStart"/>
-                  <w:r>
-                    <w:t>subpath</w:t>
-                  </w:r>
-                  <w:proofErr w:type="spellEnd"/>
-                  <w:r>
-                    <w:t>: /</w:t>
-                  </w:r>
-                  <w:proofErr w:type="spellStart"/>
-                  <w:r>
-                    <w:t>StaticSsr</w:t>
-                  </w:r>
-                  <w:proofErr w:type="spellEnd"/>
-                  <w:r>
-                    <w:t>/</w:t>
+                    <w:t>Proxy subpath: /StaticSsr/</w:t>
                   </w:r>
                 </w:p>
                 <w:p>
@@ -3947,23 +3718,7 @@
                     </w:numPr>
                   </w:pPr>
                   <w:r>
-                    <w:t xml:space="preserve">App </w:t>
-                  </w:r>
-                  <w:proofErr w:type="spellStart"/>
-                  <w:r>
-                    <w:t>subpath</w:t>
-                  </w:r>
-                  <w:proofErr w:type="spellEnd"/>
-                  <w:r>
-                    <w:t>: /</w:t>
-                  </w:r>
-                  <w:proofErr w:type="spellStart"/>
-                  <w:r>
-                    <w:t>staticssr</w:t>
-                  </w:r>
-                  <w:proofErr w:type="spellEnd"/>
-                  <w:r>
-                    <w:t>/</w:t>
+                    <w:t>App subpath: /staticssr/</w:t>
                   </w:r>
                 </w:p>
                 <w:p>
@@ -3974,51 +3729,11 @@
                     </w:numPr>
                   </w:pPr>
                   <w:r>
-                    <w:t>Result: The &lt;</w:t>
-                  </w:r>
-                  <w:proofErr w:type="spellStart"/>
-                  <w:r>
-                    <w:t>BasePath</w:t>
-                  </w:r>
-                  <w:proofErr w:type="spellEnd"/>
-                  <w:r>
-                    <w:t xml:space="preserve"> /&gt; component renders &lt;base </w:t>
-                  </w:r>
-                  <w:proofErr w:type="spellStart"/>
-                  <w:r>
-                    <w:t>href</w:t>
-                  </w:r>
-                  <w:proofErr w:type="spellEnd"/>
-                  <w:r>
-                    <w:t>="/</w:t>
-                  </w:r>
-                  <w:proofErr w:type="spellStart"/>
-                  <w:r>
-                    <w:t>staticssr</w:t>
-                  </w:r>
-                  <w:proofErr w:type="spellEnd"/>
-                  <w:r>
-                    <w:t xml:space="preserve">/"&gt; </w:t>
+                    <w:t xml:space="preserve">Result: The &lt;BasePath /&gt; component renders &lt;base href="/staticssr/"&gt; </w:t>
                   </w:r>
                   <w:r>
                     <w:lastRenderedPageBreak/>
-                    <w:t xml:space="preserve">instead of &lt;base </w:t>
-                  </w:r>
-                  <w:proofErr w:type="spellStart"/>
-                  <w:r>
-                    <w:t>href</w:t>
-                  </w:r>
-                  <w:proofErr w:type="spellEnd"/>
-                  <w:r>
-                    <w:t>="/</w:t>
-                  </w:r>
-                  <w:proofErr w:type="spellStart"/>
-                  <w:r>
-                    <w:t>StaticSsr</w:t>
-                  </w:r>
-                  <w:proofErr w:type="spellEnd"/>
-                  <w:r>
-                    <w:t>/"&gt;.</w:t>
+                    <w:t>instead of &lt;base href="/StaticSsr/"&gt;.</w:t>
                   </w:r>
                 </w:p>
               </w:tc>
@@ -4287,17 +4002,8 @@
                       <w:b/>
                       <w:bCs/>
                     </w:rPr>
-                    <w:t xml:space="preserve">Interactive </w:t>
-                  </w:r>
-                  <w:proofErr w:type="spellStart"/>
-                  <w:r>
-                    <w:rPr>
-                      <w:b/>
-                      <w:bCs/>
-                    </w:rPr>
-                    <w:t>WebAssembly</w:t>
-                  </w:r>
-                  <w:proofErr w:type="spellEnd"/>
+                    <w:t>Interactive WebAssembly</w:t>
+                  </w:r>
                 </w:p>
               </w:tc>
               <w:tc>
@@ -4483,42 +4189,14 @@
                 <w:rPr>
                   <w:rStyle w:val="Hyperlink"/>
                 </w:rPr>
-                <w:t>BlazorWebApp-BasePath-Validation/Evidence/net11-new-app/ServerLog.log at main · BharatRamsf3693/</w:t>
-              </w:r>
-              <w:proofErr w:type="spellStart"/>
-              <w:r>
-                <w:rPr>
-                  <w:rStyle w:val="Hyperlink"/>
-                </w:rPr>
-                <w:t>BlazorWebAp</w:t>
+                <w:t>BlazorWebApp-BasePath-Validation/Evidence/net11-new-app/ServerLog.log at main · BharatRamsf3693/BlazorWebAp</w:t>
               </w:r>
               <w:r>
                 <w:rPr>
                   <w:rStyle w:val="Hyperlink"/>
                 </w:rPr>
                 <w:lastRenderedPageBreak/>
-                <w:t>p</w:t>
-              </w:r>
-              <w:proofErr w:type="spellEnd"/>
-              <w:r>
-                <w:rPr>
-                  <w:rStyle w:val="Hyperlink"/>
-                </w:rPr>
-                <w:t>-</w:t>
-              </w:r>
-              <w:proofErr w:type="spellStart"/>
-              <w:r>
-                <w:rPr>
-                  <w:rStyle w:val="Hyperlink"/>
-                </w:rPr>
-                <w:t>BasePath</w:t>
-              </w:r>
-              <w:proofErr w:type="spellEnd"/>
-              <w:r>
-                <w:rPr>
-                  <w:rStyle w:val="Hyperlink"/>
-                </w:rPr>
-                <w:t>-Validation</w:t>
+                <w:t>p-BasePath-Validation</w:t>
               </w:r>
             </w:hyperlink>
           </w:p>
@@ -4546,35 +4224,7 @@
                 <w:rPr>
                   <w:rStyle w:val="Hyperlink"/>
                 </w:rPr>
-                <w:t>BlazorWebApp-BasePath-Validation/Evidence/net11-new-app/ReverseProxy/ServerLog.log at main · BharatRamsf3693/</w:t>
-              </w:r>
-              <w:proofErr w:type="spellStart"/>
-              <w:r>
-                <w:rPr>
-                  <w:rStyle w:val="Hyperlink"/>
-                </w:rPr>
-                <w:t>BlazorWebApp</w:t>
-              </w:r>
-              <w:proofErr w:type="spellEnd"/>
-              <w:r>
-                <w:rPr>
-                  <w:rStyle w:val="Hyperlink"/>
-                </w:rPr>
-                <w:t>-</w:t>
-              </w:r>
-              <w:proofErr w:type="spellStart"/>
-              <w:r>
-                <w:rPr>
-                  <w:rStyle w:val="Hyperlink"/>
-                </w:rPr>
-                <w:t>BasePath</w:t>
-              </w:r>
-              <w:proofErr w:type="spellEnd"/>
-              <w:r>
-                <w:rPr>
-                  <w:rStyle w:val="Hyperlink"/>
-                </w:rPr>
-                <w:t>-Validation</w:t>
+                <w:t>BlazorWebApp-BasePath-Validation/Evidence/net11-new-app/ReverseProxy/ServerLog.log at main · BharatRamsf3693/BlazorWebApp-BasePath-Validation</w:t>
               </w:r>
             </w:hyperlink>
           </w:p>
@@ -4586,15 +4236,7 @@
               </w:rPr>
             </w:pPr>
             <w:r>
-              <w:t xml:space="preserve">Logs of Static SSR, Interactive Server, and Interactive </w:t>
-            </w:r>
-            <w:proofErr w:type="spellStart"/>
-            <w:r>
-              <w:t>WebAssembly</w:t>
-            </w:r>
-            <w:proofErr w:type="spellEnd"/>
-            <w:r>
-              <w:t xml:space="preserve"> samples are contained within each server log file.</w:t>
+              <w:t>Logs of Static SSR, Interactive Server, and Interactive WebAssembly samples are contained within each server log file.</w:t>
             </w:r>
           </w:p>
         </w:tc>
@@ -5112,17 +4754,8 @@
                       <w:b/>
                       <w:bCs/>
                     </w:rPr>
-                    <w:t xml:space="preserve">Interactive </w:t>
-                  </w:r>
-                  <w:proofErr w:type="spellStart"/>
-                  <w:r>
-                    <w:rPr>
-                      <w:b/>
-                      <w:bCs/>
-                    </w:rPr>
-                    <w:t>WebAssembly</w:t>
-                  </w:r>
-                  <w:proofErr w:type="spellEnd"/>
+                    <w:t>Interactive WebAssembly</w:t>
+                  </w:r>
                 </w:p>
               </w:tc>
               <w:tc>
@@ -5464,17 +5097,8 @@
                       <w:b/>
                       <w:bCs/>
                     </w:rPr>
-                    <w:t xml:space="preserve">Interactive </w:t>
-                  </w:r>
-                  <w:proofErr w:type="spellStart"/>
-                  <w:r>
-                    <w:rPr>
-                      <w:b/>
-                      <w:bCs/>
-                    </w:rPr>
-                    <w:t>WebAssembly</w:t>
-                  </w:r>
-                  <w:proofErr w:type="spellEnd"/>
+                    <w:t>Interactive WebAssembly</w:t>
+                  </w:r>
                 </w:p>
               </w:tc>
               <w:tc>
@@ -6072,17 +5696,8 @@
                       <w:b/>
                       <w:bCs/>
                     </w:rPr>
-                    <w:t xml:space="preserve">Interactive </w:t>
-                  </w:r>
-                  <w:proofErr w:type="spellStart"/>
-                  <w:r>
-                    <w:rPr>
-                      <w:b/>
-                      <w:bCs/>
-                    </w:rPr>
-                    <w:t>WebAssembly</w:t>
-                  </w:r>
-                  <w:proofErr w:type="spellEnd"/>
+                    <w:t>Interactive WebAssembly</w:t>
+                  </w:r>
                 </w:p>
               </w:tc>
               <w:tc>
@@ -6423,17 +6038,8 @@
                       <w:b/>
                       <w:bCs/>
                     </w:rPr>
-                    <w:t xml:space="preserve">Interactive </w:t>
-                  </w:r>
-                  <w:proofErr w:type="spellStart"/>
-                  <w:r>
-                    <w:rPr>
-                      <w:b/>
-                      <w:bCs/>
-                    </w:rPr>
-                    <w:t>WebAssembly</w:t>
-                  </w:r>
-                  <w:proofErr w:type="spellEnd"/>
+                    <w:t>Interactive WebAssembly</w:t>
+                  </w:r>
                 </w:p>
               </w:tc>
               <w:tc>
@@ -7031,17 +6637,8 @@
                       <w:b/>
                       <w:bCs/>
                     </w:rPr>
-                    <w:t xml:space="preserve">Interactive </w:t>
-                  </w:r>
-                  <w:proofErr w:type="spellStart"/>
-                  <w:r>
-                    <w:rPr>
-                      <w:b/>
-                      <w:bCs/>
-                    </w:rPr>
-                    <w:t>WebAssembly</w:t>
-                  </w:r>
-                  <w:proofErr w:type="spellEnd"/>
+                    <w:t>Interactive WebAssembly</w:t>
+                  </w:r>
                 </w:p>
               </w:tc>
               <w:tc>
@@ -7382,17 +6979,8 @@
                       <w:b/>
                       <w:bCs/>
                     </w:rPr>
-                    <w:t xml:space="preserve">Interactive </w:t>
-                  </w:r>
-                  <w:proofErr w:type="spellStart"/>
-                  <w:r>
-                    <w:rPr>
-                      <w:b/>
-                      <w:bCs/>
-                    </w:rPr>
-                    <w:t>WebAssembly</w:t>
-                  </w:r>
-                  <w:proofErr w:type="spellEnd"/>
+                    <w:t>Interactive WebAssembly</w:t>
+                  </w:r>
                 </w:p>
               </w:tc>
               <w:tc>
@@ -7998,17 +7586,8 @@
                       <w:b/>
                       <w:bCs/>
                     </w:rPr>
-                    <w:t xml:space="preserve">Interactive </w:t>
-                  </w:r>
-                  <w:proofErr w:type="spellStart"/>
-                  <w:r>
-                    <w:rPr>
-                      <w:b/>
-                      <w:bCs/>
-                    </w:rPr>
-                    <w:t>WebAssembly</w:t>
-                  </w:r>
-                  <w:proofErr w:type="spellEnd"/>
+                    <w:t>Interactive WebAssembly</w:t>
+                  </w:r>
                 </w:p>
               </w:tc>
               <w:tc>
@@ -8349,17 +7928,8 @@
                       <w:b/>
                       <w:bCs/>
                     </w:rPr>
-                    <w:t xml:space="preserve">Interactive </w:t>
-                  </w:r>
-                  <w:proofErr w:type="spellStart"/>
-                  <w:r>
-                    <w:rPr>
-                      <w:b/>
-                      <w:bCs/>
-                    </w:rPr>
-                    <w:t>WebAssembly</w:t>
-                  </w:r>
-                  <w:proofErr w:type="spellEnd"/>
+                    <w:t>Interactive WebAssembly</w:t>
+                  </w:r>
                 </w:p>
               </w:tc>
               <w:tc>
@@ -8975,17 +8545,8 @@
                       <w:b/>
                       <w:bCs/>
                     </w:rPr>
-                    <w:t xml:space="preserve">Interactive </w:t>
-                  </w:r>
-                  <w:proofErr w:type="spellStart"/>
-                  <w:r>
-                    <w:rPr>
-                      <w:b/>
-                      <w:bCs/>
-                    </w:rPr>
-                    <w:t>WebAssembly</w:t>
-                  </w:r>
-                  <w:proofErr w:type="spellEnd"/>
+                    <w:t>Interactive WebAssembly</w:t>
+                  </w:r>
                 </w:p>
               </w:tc>
               <w:tc>
@@ -9326,17 +8887,8 @@
                       <w:b/>
                       <w:bCs/>
                     </w:rPr>
-                    <w:t xml:space="preserve">Interactive </w:t>
-                  </w:r>
-                  <w:proofErr w:type="spellStart"/>
-                  <w:r>
-                    <w:rPr>
-                      <w:b/>
-                      <w:bCs/>
-                    </w:rPr>
-                    <w:t>WebAssembly</w:t>
-                  </w:r>
-                  <w:proofErr w:type="spellEnd"/>
+                    <w:t>Interactive WebAssembly</w:t>
+                  </w:r>
                 </w:p>
               </w:tc>
               <w:tc>
@@ -9464,15 +9016,7 @@
           </w:tcPr>
           <w:p>
             <w:r>
-              <w:t xml:space="preserve">A page that shows a </w:t>
-            </w:r>
-            <w:proofErr w:type="gramStart"/>
-            <w:r>
-              <w:t>URL it</w:t>
-            </w:r>
-            <w:proofErr w:type="gramEnd"/>
-            <w:r>
-              <w:t xml:space="preserve"> built itself from a relative path.</w:t>
+              <w:t>A page that shows a URL it built itself from a relative path.</w:t>
             </w:r>
           </w:p>
         </w:tc>
@@ -10018,17 +9562,8 @@
                       <w:b/>
                       <w:bCs/>
                     </w:rPr>
-                    <w:t xml:space="preserve">Interactive </w:t>
-                  </w:r>
-                  <w:proofErr w:type="spellStart"/>
-                  <w:r>
-                    <w:rPr>
-                      <w:b/>
-                      <w:bCs/>
-                    </w:rPr>
-                    <w:t>WebAssembly</w:t>
-                  </w:r>
-                  <w:proofErr w:type="spellEnd"/>
+                    <w:t>Interactive WebAssembly</w:t>
+                  </w:r>
                 </w:p>
               </w:tc>
               <w:tc>
@@ -10452,17 +9987,8 @@
                       <w:b/>
                       <w:bCs/>
                     </w:rPr>
-                    <w:t xml:space="preserve">Interactive </w:t>
-                  </w:r>
-                  <w:proofErr w:type="spellStart"/>
-                  <w:r>
-                    <w:rPr>
-                      <w:b/>
-                      <w:bCs/>
-                    </w:rPr>
-                    <w:t>WebAssembly</w:t>
-                  </w:r>
-                  <w:proofErr w:type="spellEnd"/>
+                    <w:t>Interactive WebAssembly</w:t>
+                  </w:r>
                 </w:p>
               </w:tc>
               <w:tc>
@@ -10980,17 +10506,8 @@
                       <w:b/>
                       <w:bCs/>
                     </w:rPr>
-                    <w:t xml:space="preserve">Interactive </w:t>
-                  </w:r>
-                  <w:proofErr w:type="spellStart"/>
-                  <w:r>
-                    <w:rPr>
-                      <w:b/>
-                      <w:bCs/>
-                    </w:rPr>
-                    <w:t>WebAssembly</w:t>
-                  </w:r>
-                  <w:proofErr w:type="spellEnd"/>
+                    <w:t>Interactive WebAssembly</w:t>
+                  </w:r>
                 </w:p>
               </w:tc>
               <w:tc>
@@ -11271,17 +10788,8 @@
                       <w:b/>
                       <w:bCs/>
                     </w:rPr>
-                    <w:t xml:space="preserve">Interactive </w:t>
-                  </w:r>
-                  <w:proofErr w:type="spellStart"/>
-                  <w:r>
-                    <w:rPr>
-                      <w:b/>
-                      <w:bCs/>
-                    </w:rPr>
-                    <w:t>WebAssembly</w:t>
-                  </w:r>
-                  <w:proofErr w:type="spellEnd"/>
+                    <w:t>Interactive WebAssembly</w:t>
+                  </w:r>
                 </w:p>
               </w:tc>
               <w:tc>
@@ -11345,16 +10853,8 @@
                 <w:rPr>
                   <w:rStyle w:val="Hyperlink"/>
                 </w:rPr>
-                <w:t>Evidence/net11-new-app/</w:t>
+                <w:t>Evidence/net11-new-app/WithChangedSubpath</w:t>
               </w:r>
-              <w:proofErr w:type="spellStart"/>
-              <w:r>
-                <w:rPr>
-                  <w:rStyle w:val="Hyperlink"/>
-                </w:rPr>
-                <w:t>WithChangedSubpath</w:t>
-              </w:r>
-              <w:proofErr w:type="spellEnd"/>
             </w:hyperlink>
             <w:r>
               <w:br/>
@@ -11377,31 +10877,15 @@
                   <w:rStyle w:val="Hyperlink"/>
                 </w:rPr>
                 <w:lastRenderedPageBreak/>
-                <w:t>to-net11-upgrade/</w:t>
+                <w:t>to-net11-upgrade/WithChangedSubpath</w:t>
               </w:r>
-              <w:proofErr w:type="spellStart"/>
-              <w:r>
-                <w:rPr>
-                  <w:rStyle w:val="Hyperlink"/>
-                </w:rPr>
-                <w:t>WithChangedSubpath</w:t>
-              </w:r>
-              <w:proofErr w:type="spellEnd"/>
             </w:hyperlink>
             <w:r>
               <w:br/>
             </w:r>
             <w:r>
               <w:br/>
-              <w:t>Note: Extracting the files under the above locations provide the verification logs for the corresponding render mode. It includes a video recording tracking the first 10 testing scenarios alongside a complete network log (.</w:t>
-            </w:r>
-            <w:proofErr w:type="spellStart"/>
-            <w:r>
-              <w:t>har</w:t>
-            </w:r>
-            <w:proofErr w:type="spellEnd"/>
-            <w:r>
-              <w:t xml:space="preserve"> file)</w:t>
+              <w:t>Note: Extracting the files under the above locations provide the verification logs for the corresponding render mode. It includes a video recording tracking the first 10 testing scenarios alongside a complete network log (.har file)</w:t>
             </w:r>
           </w:p>
         </w:tc>
@@ -11450,33 +10934,7 @@
           </w:tcPr>
           <w:p>
             <w:r>
-              <w:t xml:space="preserve">An app upgraded from .NET 10, which still has a literal &lt;base </w:t>
-            </w:r>
-            <w:proofErr w:type="spellStart"/>
-            <w:r>
-              <w:t>href</w:t>
-            </w:r>
-            <w:proofErr w:type="spellEnd"/>
-            <w:r>
-              <w:t>="/" /&gt;, before and after swapping in &lt;</w:t>
-            </w:r>
-            <w:proofErr w:type="spellStart"/>
-            <w:r>
-              <w:t>BasePath</w:t>
-            </w:r>
-            <w:proofErr w:type="spellEnd"/>
-            <w:r>
-              <w:t xml:space="preserve"> /&gt;. The component lives in </w:t>
-            </w:r>
-            <w:proofErr w:type="spellStart"/>
-            <w:proofErr w:type="gramStart"/>
-            <w:r>
-              <w:t>Microsoft.AspNetCore.Components.Endpoints</w:t>
-            </w:r>
-            <w:proofErr w:type="spellEnd"/>
-            <w:proofErr w:type="gramEnd"/>
-            <w:r>
-              <w:t xml:space="preserve">, which the .NET </w:t>
+              <w:t xml:space="preserve">An app upgraded from .NET 10, which still has a literal &lt;base href="/" /&gt;, before and after swapping in &lt;BasePath /&gt;. The component lives in Microsoft.AspNetCore.Components.Endpoints, which the .NET </w:t>
             </w:r>
             <w:r>
               <w:lastRenderedPageBreak/>
@@ -11732,33 +11190,7 @@
                 </w:p>
                 <w:p>
                   <w:r>
-                    <w:t xml:space="preserve">No build errors are encountered </w:t>
-                  </w:r>
-                  <w:proofErr w:type="gramStart"/>
-                  <w:r>
-                    <w:t>when @</w:t>
-                  </w:r>
-                  <w:proofErr w:type="gramEnd"/>
-                  <w:r>
-                    <w:t xml:space="preserve">using </w:t>
-                  </w:r>
-                  <w:proofErr w:type="spellStart"/>
-                  <w:proofErr w:type="gramStart"/>
-                  <w:r>
-                    <w:t>Microsoft.AspNetCore.Components.Endpoints</w:t>
-                  </w:r>
-                  <w:proofErr w:type="spellEnd"/>
-                  <w:proofErr w:type="gramEnd"/>
-                  <w:r>
-                    <w:t xml:space="preserve"> </w:t>
-                  </w:r>
-                  <w:proofErr w:type="gramStart"/>
-                  <w:r>
-                    <w:t>is</w:t>
-                  </w:r>
-                  <w:proofErr w:type="gramEnd"/>
-                  <w:r>
-                    <w:t xml:space="preserve"> not added; the app is launched successfully with elements </w:t>
+                    <w:t xml:space="preserve">No build errors are encountered when @using Microsoft.AspNetCore.Components.Endpoints is not added; the app is launched successfully with elements </w:t>
                   </w:r>
                   <w:r>
                     <w:lastRenderedPageBreak/>
@@ -11866,33 +11298,7 @@
                 </w:p>
                 <w:p>
                   <w:r>
-                    <w:t xml:space="preserve">No build errors are encountered </w:t>
-                  </w:r>
-                  <w:proofErr w:type="gramStart"/>
-                  <w:r>
-                    <w:t>when @</w:t>
-                  </w:r>
-                  <w:proofErr w:type="gramEnd"/>
-                  <w:r>
-                    <w:t xml:space="preserve">using </w:t>
-                  </w:r>
-                  <w:proofErr w:type="spellStart"/>
-                  <w:proofErr w:type="gramStart"/>
-                  <w:r>
-                    <w:t>Microsoft.AspNetCore.Components.Endpoints</w:t>
-                  </w:r>
-                  <w:proofErr w:type="spellEnd"/>
-                  <w:proofErr w:type="gramEnd"/>
-                  <w:r>
-                    <w:t xml:space="preserve"> </w:t>
-                  </w:r>
-                  <w:proofErr w:type="gramStart"/>
-                  <w:r>
-                    <w:t>is</w:t>
-                  </w:r>
-                  <w:proofErr w:type="gramEnd"/>
-                  <w:r>
-                    <w:t xml:space="preserve"> not added; the app is launched successfully with elements missing from the Head element.</w:t>
+                    <w:t>No build errors are encountered when @using Microsoft.AspNetCore.Components.Endpoints is not added; the app is launched successfully with elements missing from the Head element.</w:t>
                   </w:r>
                 </w:p>
               </w:tc>
@@ -11960,17 +11366,8 @@
                       <w:b/>
                       <w:bCs/>
                     </w:rPr>
-                    <w:t xml:space="preserve">Interactive </w:t>
-                  </w:r>
-                  <w:proofErr w:type="spellStart"/>
-                  <w:r>
-                    <w:rPr>
-                      <w:b/>
-                      <w:bCs/>
-                    </w:rPr>
-                    <w:t>WebAssembly</w:t>
-                  </w:r>
-                  <w:proofErr w:type="spellEnd"/>
+                    <w:t>Interactive WebAssembly</w:t>
+                  </w:r>
                 </w:p>
               </w:tc>
               <w:tc>
@@ -12004,33 +11401,7 @@
                 </w:p>
                 <w:p>
                   <w:r>
-                    <w:t xml:space="preserve">No build errors are encountered </w:t>
-                  </w:r>
-                  <w:proofErr w:type="gramStart"/>
-                  <w:r>
-                    <w:t>when @</w:t>
-                  </w:r>
-                  <w:proofErr w:type="gramEnd"/>
-                  <w:r>
-                    <w:t xml:space="preserve">using </w:t>
-                  </w:r>
-                  <w:proofErr w:type="spellStart"/>
-                  <w:proofErr w:type="gramStart"/>
-                  <w:r>
-                    <w:t>Microsoft.AspNetCore.Components.Endpoints</w:t>
-                  </w:r>
-                  <w:proofErr w:type="spellEnd"/>
-                  <w:proofErr w:type="gramEnd"/>
-                  <w:r>
-                    <w:t xml:space="preserve"> </w:t>
-                  </w:r>
-                  <w:proofErr w:type="gramStart"/>
-                  <w:r>
-                    <w:t>is</w:t>
-                  </w:r>
-                  <w:proofErr w:type="gramEnd"/>
-                  <w:r>
-                    <w:t xml:space="preserve"> not added; the app is launched successfully with elements missing from the Head element.</w:t>
+                    <w:t>No build errors are encountered when @using Microsoft.AspNetCore.Components.Endpoints is not added; the app is launched successfully with elements missing from the Head element.</w:t>
                   </w:r>
                 </w:p>
               </w:tc>
@@ -12131,21 +11502,7 @@
                 <w:rPr>
                   <w:rStyle w:val="Hyperlink"/>
                 </w:rPr>
-                <w:t xml:space="preserve">New </w:t>
-              </w:r>
-              <w:proofErr w:type="spellStart"/>
-              <w:r>
-                <w:rPr>
-                  <w:rStyle w:val="Hyperlink"/>
-                </w:rPr>
-                <w:t>BasePath</w:t>
-              </w:r>
-              <w:proofErr w:type="spellEnd"/>
-              <w:r>
-                <w:rPr>
-                  <w:rStyle w:val="Hyperlink"/>
-                </w:rPr>
-                <w:t xml:space="preserve"> compo</w:t>
+                <w:t>New BasePath compo</w:t>
               </w:r>
               <w:r>
                 <w:rPr>
@@ -12185,27 +11542,11 @@
               </w:rPr>
             </w:pPr>
             <w:r>
-              <w:t>The base path page presents &lt;</w:t>
-            </w:r>
-            <w:proofErr w:type="spellStart"/>
-            <w:r>
-              <w:t>BasePath</w:t>
-            </w:r>
-            <w:proofErr w:type="spellEnd"/>
-            <w:r>
-              <w:t xml:space="preserve"> /&gt; as the first option for a Blazor Web App, but it does not mention that the component preserves the </w:t>
+              <w:t xml:space="preserve">The base path page presents &lt;BasePath /&gt; as the first option for a Blazor Web App, but it does not mention that the component preserves the </w:t>
             </w:r>
             <w:r>
               <w:lastRenderedPageBreak/>
-              <w:t xml:space="preserve">casing of the requested path, which is the behavior this scenario is mainly about, and it does not mention the namespace the component lives in. Say so in the report if either gap </w:t>
-            </w:r>
-            <w:proofErr w:type="gramStart"/>
-            <w:r>
-              <w:t>cost</w:t>
-            </w:r>
-            <w:proofErr w:type="gramEnd"/>
-            <w:r>
-              <w:t xml:space="preserve"> you time.</w:t>
+              <w:t>casing of the requested path, which is the behavior this scenario is mainly about, and it does not mention the namespace the component lives in. Say so in the report if either gap cost you time.</w:t>
             </w:r>
           </w:p>
         </w:tc>
@@ -12339,34 +11680,10 @@
           <w:b/>
           <w:bCs/>
         </w:rPr>
-        <w:t xml:space="preserve">IIS </w:t>
-      </w:r>
-      <w:proofErr w:type="gramStart"/>
-      <w:r>
-        <w:rPr>
-          <w:b/>
-          <w:bCs/>
-        </w:rPr>
-        <w:t>Deployment (.</w:t>
-      </w:r>
-      <w:proofErr w:type="gramEnd"/>
-      <w:r>
-        <w:rPr>
-          <w:b/>
-          <w:bCs/>
-        </w:rPr>
-        <w:t xml:space="preserve">zip): </w:t>
-      </w:r>
-      <w:r>
-        <w:t>Extracting this file provides the verification logs for the corresponding render mode. It includes a video recording tracking the first 10 testing scenarios alongside a complete network log (.</w:t>
-      </w:r>
-      <w:proofErr w:type="spellStart"/>
-      <w:r>
-        <w:t>har</w:t>
-      </w:r>
-      <w:proofErr w:type="spellEnd"/>
-      <w:r>
-        <w:t xml:space="preserve"> file).</w:t>
+        <w:t xml:space="preserve">IIS Deployment (.zip): </w:t>
+      </w:r>
+      <w:r>
+        <w:t>Extracting this file provides the verification logs for the corresponding render mode. It includes a video recording tracking the first 10 testing scenarios alongside a complete network log (.har file).</w:t>
       </w:r>
     </w:p>
     <w:p>
@@ -12385,42 +11702,10 @@
           <w:b/>
           <w:bCs/>
         </w:rPr>
-        <w:t xml:space="preserve">Deployed Behind </w:t>
-      </w:r>
-      <w:proofErr w:type="gramStart"/>
-      <w:r>
-        <w:rPr>
-          <w:b/>
-          <w:bCs/>
-        </w:rPr>
-        <w:t>Proxy (.</w:t>
-      </w:r>
-      <w:proofErr w:type="gramEnd"/>
-      <w:r>
-        <w:rPr>
-          <w:b/>
-          <w:bCs/>
-        </w:rPr>
-        <w:t xml:space="preserve">zip): </w:t>
-      </w:r>
-      <w:r>
-        <w:t>Extracting this file provides the proxy validation evidence. It includes a video recording tracking the first 9 testing scenarios, the reverse proxy routing rules (</w:t>
-      </w:r>
-      <w:proofErr w:type="spellStart"/>
-      <w:r>
-        <w:t>web.config</w:t>
-      </w:r>
-      <w:proofErr w:type="spellEnd"/>
-      <w:r>
-        <w:t>), and a complete network log (.</w:t>
-      </w:r>
-      <w:proofErr w:type="spellStart"/>
-      <w:r>
-        <w:t>har</w:t>
-      </w:r>
-      <w:proofErr w:type="spellEnd"/>
-      <w:r>
-        <w:t xml:space="preserve"> file).</w:t>
+        <w:t xml:space="preserve">Deployed Behind Proxy (.zip): </w:t>
+      </w:r>
+      <w:r>
+        <w:t>Extracting this file provides the proxy validation evidence. It includes a video recording tracking the first 9 testing scenarios, the reverse proxy routing rules (web.config), and a complete network log (.har file).</w:t>
       </w:r>
     </w:p>
     <w:p>
@@ -12557,23 +11842,7 @@
                 <w:b/>
                 <w:bCs/>
               </w:rPr>
-              <w:t xml:space="preserve">IIS Deployment (With </w:t>
-            </w:r>
-            <w:proofErr w:type="spellStart"/>
-            <w:r>
-              <w:rPr>
-                <w:b/>
-                <w:bCs/>
-              </w:rPr>
-              <w:t>Subpath</w:t>
-            </w:r>
-            <w:proofErr w:type="spellEnd"/>
-            <w:r>
-              <w:rPr>
-                <w:b/>
-                <w:bCs/>
-              </w:rPr>
-              <w:t>)</w:t>
+              <w:t>IIS Deployment (With Subpath)</w:t>
             </w:r>
           </w:p>
         </w:tc>
@@ -12710,21 +11979,7 @@
                 <w:rPr>
                   <w:rStyle w:val="Hyperlink"/>
                 </w:rPr>
-                <w:t>Evidence/net11-new-app/</w:t>
-              </w:r>
-              <w:proofErr w:type="spellStart"/>
-              <w:r>
-                <w:rPr>
-                  <w:rStyle w:val="Hyperlink"/>
-                </w:rPr>
-                <w:t>WithSubpath</w:t>
-              </w:r>
-              <w:proofErr w:type="spellEnd"/>
-              <w:r>
-                <w:rPr>
-                  <w:rStyle w:val="Hyperlink"/>
-                </w:rPr>
-                <w:t>/StaticSSR.zip</w:t>
+                <w:t>Evidence/net11-new-app/WithSubpath/StaticSSR.zip</w:t>
               </w:r>
             </w:hyperlink>
           </w:p>
@@ -12752,21 +12007,7 @@
                 <w:rPr>
                   <w:rStyle w:val="Hyperlink"/>
                 </w:rPr>
-                <w:t>Evidence/net11-new-app/</w:t>
-              </w:r>
-              <w:proofErr w:type="spellStart"/>
-              <w:r>
-                <w:rPr>
-                  <w:rStyle w:val="Hyperlink"/>
-                </w:rPr>
-                <w:t>ReverseProxy</w:t>
-              </w:r>
-              <w:proofErr w:type="spellEnd"/>
-              <w:r>
-                <w:rPr>
-                  <w:rStyle w:val="Hyperlink"/>
-                </w:rPr>
-                <w:t>/StaticSSR.zip</w:t>
+                <w:t>Evidence/net11-new-app/ReverseProxy/StaticSSR.zip</w:t>
               </w:r>
             </w:hyperlink>
           </w:p>
@@ -12862,21 +12103,7 @@
                 <w:rPr>
                   <w:rStyle w:val="Hyperlink"/>
                 </w:rPr>
-                <w:t>Evidence/net11-new-app/</w:t>
-              </w:r>
-              <w:proofErr w:type="spellStart"/>
-              <w:r>
-                <w:rPr>
-                  <w:rStyle w:val="Hyperlink"/>
-                </w:rPr>
-                <w:t>WithSubpath</w:t>
-              </w:r>
-              <w:proofErr w:type="spellEnd"/>
-              <w:r>
-                <w:rPr>
-                  <w:rStyle w:val="Hyperlink"/>
-                </w:rPr>
-                <w:t>/InteractiveServer.zip</w:t>
+                <w:t>Evidence/net11-new-app/WithSubpath/InteractiveServer.zip</w:t>
               </w:r>
             </w:hyperlink>
             <w:r>
@@ -12907,21 +12134,7 @@
                 <w:rPr>
                   <w:rStyle w:val="Hyperlink"/>
                 </w:rPr>
-                <w:t>Evidence/net11-new-app/</w:t>
-              </w:r>
-              <w:proofErr w:type="spellStart"/>
-              <w:r>
-                <w:rPr>
-                  <w:rStyle w:val="Hyperlink"/>
-                </w:rPr>
-                <w:t>ReverseProxy</w:t>
-              </w:r>
-              <w:proofErr w:type="spellEnd"/>
-              <w:r>
-                <w:rPr>
-                  <w:rStyle w:val="Hyperlink"/>
-                </w:rPr>
-                <w:t>/InteractiveServer.zip</w:t>
+                <w:t>Evidence/net11-new-app/ReverseProxy/InteractiveServer.zip</w:t>
               </w:r>
             </w:hyperlink>
           </w:p>
@@ -12990,17 +12203,8 @@
                 <w:b/>
                 <w:bCs/>
               </w:rPr>
-              <w:t xml:space="preserve">Interactive </w:t>
+              <w:t>Interactive WebAssembly</w:t>
             </w:r>
-            <w:proofErr w:type="spellStart"/>
-            <w:r>
-              <w:rPr>
-                <w:b/>
-                <w:bCs/>
-              </w:rPr>
-              <w:t>WebAssembly</w:t>
-            </w:r>
-            <w:proofErr w:type="spellEnd"/>
           </w:p>
         </w:tc>
         <w:tc>
@@ -13026,21 +12230,7 @@
                 <w:rPr>
                   <w:rStyle w:val="Hyperlink"/>
                 </w:rPr>
-                <w:t>Evidence/net11-new-app/</w:t>
-              </w:r>
-              <w:proofErr w:type="spellStart"/>
-              <w:r>
-                <w:rPr>
-                  <w:rStyle w:val="Hyperlink"/>
-                </w:rPr>
-                <w:t>WithSubpath</w:t>
-              </w:r>
-              <w:proofErr w:type="spellEnd"/>
-              <w:r>
-                <w:rPr>
-                  <w:rStyle w:val="Hyperlink"/>
-                </w:rPr>
-                <w:t>/InteractiveWebAssembly.zip</w:t>
+                <w:t>Evidence/net11-new-app/WithSubpath/InteractiveWebAssembly.zip</w:t>
               </w:r>
             </w:hyperlink>
           </w:p>
@@ -13068,21 +12258,7 @@
                 <w:rPr>
                   <w:rStyle w:val="Hyperlink"/>
                 </w:rPr>
-                <w:t>Evidence/net11-new-app/</w:t>
-              </w:r>
-              <w:proofErr w:type="spellStart"/>
-              <w:r>
-                <w:rPr>
-                  <w:rStyle w:val="Hyperlink"/>
-                </w:rPr>
-                <w:t>ReverseProxy</w:t>
-              </w:r>
-              <w:proofErr w:type="spellEnd"/>
-              <w:r>
-                <w:rPr>
-                  <w:rStyle w:val="Hyperlink"/>
-                </w:rPr>
-                <w:t>/InteractiveWebAssembly.zip</w:t>
+                <w:t>Evidence/net11-new-app/ReverseProxy/InteractiveWebAssembly.zip</w:t>
               </w:r>
             </w:hyperlink>
           </w:p>
@@ -13178,21 +12354,7 @@
                 <w:rPr>
                   <w:rStyle w:val="Hyperlink"/>
                 </w:rPr>
-                <w:t>Evidence/net10-to-net11-upgrade/</w:t>
-              </w:r>
-              <w:proofErr w:type="spellStart"/>
-              <w:r>
-                <w:rPr>
-                  <w:rStyle w:val="Hyperlink"/>
-                </w:rPr>
-                <w:t>WithSubpath</w:t>
-              </w:r>
-              <w:proofErr w:type="spellEnd"/>
-              <w:r>
-                <w:rPr>
-                  <w:rStyle w:val="Hyperlink"/>
-                </w:rPr>
-                <w:t>/StaticSSR.zip</w:t>
+                <w:t>Evidence/net10-to-net11-upgrade/WithSubpath/StaticSSR.zip</w:t>
               </w:r>
             </w:hyperlink>
           </w:p>
@@ -13220,21 +12382,7 @@
                 <w:rPr>
                   <w:rStyle w:val="Hyperlink"/>
                 </w:rPr>
-                <w:t>Evidence/net10-to-net11-upgrade/</w:t>
-              </w:r>
-              <w:proofErr w:type="spellStart"/>
-              <w:r>
-                <w:rPr>
-                  <w:rStyle w:val="Hyperlink"/>
-                </w:rPr>
-                <w:t>ReverseProxy</w:t>
-              </w:r>
-              <w:proofErr w:type="spellEnd"/>
-              <w:r>
-                <w:rPr>
-                  <w:rStyle w:val="Hyperlink"/>
-                </w:rPr>
-                <w:t>/StaticSSR.zip</w:t>
+                <w:t>Evidence/net10-to-net11-upgrade/ReverseProxy/StaticSSR.zip</w:t>
               </w:r>
             </w:hyperlink>
           </w:p>
@@ -13427,17 +12575,8 @@
                 <w:b/>
                 <w:bCs/>
               </w:rPr>
-              <w:t xml:space="preserve">Interactive </w:t>
+              <w:t>Interactive WebAssembly</w:t>
             </w:r>
-            <w:proofErr w:type="spellStart"/>
-            <w:r>
-              <w:rPr>
-                <w:b/>
-                <w:bCs/>
-              </w:rPr>
-              <w:t>WebAssembly</w:t>
-            </w:r>
-            <w:proofErr w:type="spellEnd"/>
           </w:p>
         </w:tc>
         <w:tc>
@@ -13546,21 +12685,12 @@
         </w:rPr>
         <w:t xml:space="preserve"> </w:t>
       </w:r>
-      <w:proofErr w:type="spellStart"/>
       <w:r>
         <w:rPr>
           <w:b/>
           <w:bCs/>
         </w:rPr>
-        <w:t>BasePath</w:t>
-      </w:r>
-      <w:proofErr w:type="spellEnd"/>
-      <w:r>
-        <w:rPr>
-          <w:b/>
-          <w:bCs/>
-        </w:rPr>
-        <w:t xml:space="preserve"> Component Fails to Trigger Build Error or Documentation Lacks Sufficient Guidelines When Required Namespace Is Missing in .NET 10 to .NET 11 Upgraded Apps</w:t>
+        <w:t>BasePath Component Fails to Trigger Build Error or Documentation Lacks Sufficient Guidelines When Required Namespace Is Missing in .NET 10 to .NET 11 Upgraded Apps</w:t>
       </w:r>
     </w:p>
     <w:p>
@@ -13582,23 +12712,7 @@
     </w:p>
     <w:p>
       <w:r>
-        <w:t>A Blazor Web App upgraded from .NET 10 to .NET 11 does not report a build error when the &lt;</w:t>
-      </w:r>
-      <w:proofErr w:type="spellStart"/>
-      <w:r>
-        <w:t>BasePath</w:t>
-      </w:r>
-      <w:proofErr w:type="spellEnd"/>
-      <w:r>
-        <w:t xml:space="preserve"> /&gt; component is used without its required namespace, nor does the documentation provide adequate guidelines regarding this dependency. Although the application builds successfully with only a warning, the browser treats the unrendered &lt;</w:t>
-      </w:r>
-      <w:proofErr w:type="spellStart"/>
-      <w:r>
-        <w:t>BasePath</w:t>
-      </w:r>
-      <w:proofErr w:type="spellEnd"/>
-      <w:r>
-        <w:t xml:space="preserve"> /&gt; tag as an unknown element, causing all subsequent &lt;head&gt; elements to be incorrectly pushed into the &lt;body&gt; tag at runtime.</w:t>
+        <w:t>A Blazor Web App upgraded from .NET 10 to .NET 11 does not report a build error when the &lt;BasePath /&gt; component is used without its required namespace, nor does the documentation provide adequate guidelines regarding this dependency. Although the application builds successfully with only a warning, the browser treats the unrendered &lt;BasePath /&gt; tag as an unknown element, causing all subsequent &lt;head&gt; elements to be incorrectly pushed into the &lt;body&gt; tag at runtime.</w:t>
       </w:r>
       <w:r>
         <w:br/>
@@ -13615,70 +12729,12 @@
     </w:p>
     <w:p>
       <w:r>
-        <w:t xml:space="preserve">After replacing the &lt;base </w:t>
-      </w:r>
-      <w:proofErr w:type="spellStart"/>
-      <w:r>
-        <w:t>href</w:t>
-      </w:r>
-      <w:proofErr w:type="spellEnd"/>
-      <w:r>
-        <w:t>="/" /&gt; element with the &lt;</w:t>
-      </w:r>
-      <w:proofErr w:type="spellStart"/>
-      <w:r>
-        <w:t>BasePath</w:t>
-      </w:r>
-      <w:proofErr w:type="spellEnd"/>
-      <w:r>
-        <w:t xml:space="preserve"> /&gt; component in a Blazor Web App upgraded from .NET 10 to .NET 11, the application builds and launches successfully with only a warning—even when the required @using </w:t>
-      </w:r>
-      <w:proofErr w:type="spellStart"/>
-      <w:proofErr w:type="gramStart"/>
-      <w:r>
-        <w:t>Microsoft.AspNetCore.Components.Endpoints</w:t>
-      </w:r>
-      <w:proofErr w:type="spellEnd"/>
-      <w:proofErr w:type="gramEnd"/>
-      <w:r>
-        <w:t xml:space="preserve"> namespace is missing from _</w:t>
-      </w:r>
-      <w:proofErr w:type="spellStart"/>
-      <w:r>
-        <w:t>Imports.razor</w:t>
-      </w:r>
-      <w:proofErr w:type="spellEnd"/>
-      <w:r>
-        <w:t>.</w:t>
+        <w:t>After replacing the &lt;base href="/" /&gt; element with the &lt;BasePath /&gt; component in a Blazor Web App upgraded from .NET 10 to .NET 11, the application builds and launches successfully with only a warning—even when the required @using Microsoft.AspNetCore.Components.Endpoints namespace is missing from _Imports.razor.</w:t>
       </w:r>
     </w:p>
     <w:p>
       <w:r>
-        <w:t xml:space="preserve">No build errors are reported, and the current documentation lacks explicit instructions regarding this </w:t>
-      </w:r>
-      <w:proofErr w:type="gramStart"/>
-      <w:r>
-        <w:t>setup</w:t>
-      </w:r>
-      <w:proofErr w:type="gramEnd"/>
-      <w:r>
-        <w:t>. Because the component is unrecognized by the compiler, the literal &lt;</w:t>
-      </w:r>
-      <w:proofErr w:type="spellStart"/>
-      <w:r>
-        <w:t>BasePath</w:t>
-      </w:r>
-      <w:proofErr w:type="spellEnd"/>
-      <w:r>
-        <w:t xml:space="preserve"> /&gt; tag is </w:t>
-      </w:r>
-      <w:proofErr w:type="gramStart"/>
-      <w:r>
-        <w:t>outputted</w:t>
-      </w:r>
-      <w:proofErr w:type="gramEnd"/>
-      <w:r>
-        <w:t xml:space="preserve"> directly to the browser. This invalid HTML structure causes the browser to prematurely close the &lt;head&gt; section and force all subsequent expected &lt;head&gt; elements into the &lt;body&gt; tag at runtime.</w:t>
+        <w:t>No build errors are reported, and the current documentation lacks explicit instructions regarding this setup. Because the component is unrecognized by the compiler, the literal &lt;BasePath /&gt; tag is outputted directly to the browser. This invalid HTML structure causes the browser to prematurely close the &lt;head&gt; section and force all subsequent expected &lt;head&gt; elements into the &lt;body&gt; tag at runtime.</w:t>
       </w:r>
       <w:r>
         <w:br/>
@@ -13798,13 +12854,8 @@
         </w:numPr>
       </w:pPr>
       <w:r>
-        <w:t xml:space="preserve">Interactive </w:t>
-      </w:r>
-      <w:proofErr w:type="spellStart"/>
-      <w:r>
-        <w:t>WebAssembly</w:t>
-      </w:r>
-      <w:proofErr w:type="spellEnd"/>
+        <w:t>Interactive WebAssembly</w:t>
+      </w:r>
     </w:p>
     <w:p>
       <w:pPr>
@@ -13814,101 +12865,27 @@
         </w:numPr>
       </w:pPr>
       <w:r>
-        <w:t>Update the project's Target Framework Moniker (TFM) in the .</w:t>
-      </w:r>
-      <w:proofErr w:type="spellStart"/>
-      <w:r>
-        <w:t>csproj</w:t>
-      </w:r>
-      <w:proofErr w:type="spellEnd"/>
-      <w:r>
-        <w:t xml:space="preserve"> file from net10.0 to net11.0:</w:t>
+        <w:t>Update the project's Target Framework Moniker (TFM) in the .csproj file from net10.0 to net11.0:</w:t>
       </w:r>
       <w:r>
         <w:br/>
-        <w:t xml:space="preserve">&lt;Project </w:t>
-      </w:r>
-      <w:proofErr w:type="spellStart"/>
-      <w:r>
-        <w:t>Sdk</w:t>
-      </w:r>
-      <w:proofErr w:type="spellEnd"/>
-      <w:r>
-        <w:t>="</w:t>
-      </w:r>
-      <w:proofErr w:type="spellStart"/>
-      <w:proofErr w:type="gramStart"/>
-      <w:r>
-        <w:t>Microsoft.NET.Sdk.Web</w:t>
-      </w:r>
-      <w:proofErr w:type="spellEnd"/>
-      <w:proofErr w:type="gramEnd"/>
-      <w:r>
-        <w:t>"&gt;</w:t>
+        <w:t>&lt;Project Sdk="Microsoft.NET.Sdk.Web"&gt;</w:t>
       </w:r>
       <w:r>
         <w:br/>
-        <w:t xml:space="preserve">  &lt;</w:t>
-      </w:r>
-      <w:proofErr w:type="spellStart"/>
-      <w:r>
-        <w:t>PropertyGroup</w:t>
-      </w:r>
-      <w:proofErr w:type="spellEnd"/>
-      <w:r>
-        <w:t>&gt;</w:t>
+        <w:t xml:space="preserve">  &lt;PropertyGroup&gt;</w:t>
       </w:r>
       <w:r>
         <w:br/>
-        <w:t>-   &lt;</w:t>
-      </w:r>
-      <w:proofErr w:type="spellStart"/>
-      <w:r>
-        <w:t>TargetFramework</w:t>
-      </w:r>
-      <w:proofErr w:type="spellEnd"/>
-      <w:r>
-        <w:t>&gt;net10.0&lt;/</w:t>
-      </w:r>
-      <w:proofErr w:type="spellStart"/>
-      <w:r>
-        <w:t>TargetFramework</w:t>
-      </w:r>
-      <w:proofErr w:type="spellEnd"/>
-      <w:r>
-        <w:t>&gt;</w:t>
+        <w:t>-   &lt;TargetFramework&gt;net10.0&lt;/TargetFramework&gt;</w:t>
       </w:r>
       <w:r>
         <w:br/>
-        <w:t>+   &lt;</w:t>
-      </w:r>
-      <w:proofErr w:type="spellStart"/>
-      <w:r>
-        <w:t>TargetFramework</w:t>
-      </w:r>
-      <w:proofErr w:type="spellEnd"/>
-      <w:r>
-        <w:t>&gt;net11.0&lt;/</w:t>
-      </w:r>
-      <w:proofErr w:type="spellStart"/>
-      <w:r>
-        <w:t>TargetFramework</w:t>
-      </w:r>
-      <w:proofErr w:type="spellEnd"/>
-      <w:r>
-        <w:t>&gt;</w:t>
+        <w:t>+   &lt;TargetFramework&gt;net11.0&lt;/TargetFramework&gt;</w:t>
       </w:r>
       <w:r>
         <w:br/>
-        <w:t xml:space="preserve">  &lt;/</w:t>
-      </w:r>
-      <w:proofErr w:type="spellStart"/>
-      <w:r>
-        <w:t>PropertyGroup</w:t>
-      </w:r>
-      <w:proofErr w:type="spellEnd"/>
-      <w:r>
-        <w:t>&gt;</w:t>
+        <w:t xml:space="preserve">  &lt;/PropertyGroup&gt;</w:t>
       </w:r>
       <w:r>
         <w:br/>
@@ -13923,27 +12900,11 @@
         </w:numPr>
       </w:pPr>
       <w:r>
-        <w:t xml:space="preserve">In </w:t>
-      </w:r>
-      <w:proofErr w:type="spellStart"/>
-      <w:r>
-        <w:t>App.razor</w:t>
-      </w:r>
-      <w:proofErr w:type="spellEnd"/>
-      <w:r>
-        <w:t>, replace:</w:t>
+        <w:t>In App.razor, replace:</w:t>
       </w:r>
       <w:r>
         <w:br/>
-        <w:t xml:space="preserve">&lt;base </w:t>
-      </w:r>
-      <w:proofErr w:type="spellStart"/>
-      <w:r>
-        <w:t>href</w:t>
-      </w:r>
-      <w:proofErr w:type="spellEnd"/>
-      <w:r>
-        <w:t>="/" /&gt;</w:t>
+        <w:t>&lt;base href="/" /&gt;</w:t>
       </w:r>
       <w:r>
         <w:br/>
@@ -13954,15 +12915,7 @@
       </w:r>
       <w:r>
         <w:br/>
-        <w:t>&lt;</w:t>
-      </w:r>
-      <w:proofErr w:type="spellStart"/>
-      <w:r>
-        <w:t>BasePath</w:t>
-      </w:r>
-      <w:proofErr w:type="spellEnd"/>
-      <w:r>
-        <w:t xml:space="preserve"> /&gt;</w:t>
+        <w:t>&lt;BasePath /&gt;</w:t>
       </w:r>
     </w:p>
     <w:p>
@@ -13983,35 +12936,12 @@
         <w:t>without</w:t>
       </w:r>
       <w:r>
-        <w:t xml:space="preserve"> adding the following namespace to _</w:t>
-      </w:r>
-      <w:proofErr w:type="spellStart"/>
-      <w:r>
-        <w:t>Imports.razor</w:t>
-      </w:r>
-      <w:proofErr w:type="spellEnd"/>
-      <w:r>
-        <w:t xml:space="preserve"> or </w:t>
-      </w:r>
-      <w:proofErr w:type="spellStart"/>
-      <w:r>
-        <w:t>App.razor</w:t>
-      </w:r>
-      <w:proofErr w:type="spellEnd"/>
-      <w:r>
-        <w:t>:</w:t>
+        <w:t xml:space="preserve"> adding the following namespace to _Imports.razor or App.razor:</w:t>
       </w:r>
       <w:r>
         <w:br/>
-        <w:t xml:space="preserve">@using </w:t>
-      </w:r>
-      <w:proofErr w:type="spellStart"/>
-      <w:proofErr w:type="gramStart"/>
-      <w:r>
-        <w:t>Microsoft.AspNetCore.Components.Endpoints</w:t>
-      </w:r>
-      <w:proofErr w:type="spellEnd"/>
-      <w:proofErr w:type="gramEnd"/>
+        <w:t>@using Microsoft.AspNetCore.Components.Endpoints</w:t>
+      </w:r>
     </w:p>
     <w:p/>
     <w:p>
@@ -14025,15 +12955,7 @@
     </w:p>
     <w:p>
       <w:r>
-        <w:t>The application builds and launches successfully without any build errors, and the official documentation lacks clear guidelines regarding the necessary namespace setup. At runtime, the compiler outputs the literal &lt;</w:t>
-      </w:r>
-      <w:proofErr w:type="spellStart"/>
-      <w:r>
-        <w:t>BasePath</w:t>
-      </w:r>
-      <w:proofErr w:type="spellEnd"/>
-      <w:r>
-        <w:t xml:space="preserve"> /&gt; string as text, which breaks the HTML parsing structure and forces subsequent &lt;head&gt; elements into the &lt;body&gt; tag.</w:t>
+        <w:t>The application builds and launches successfully without any build errors, and the official documentation lacks clear guidelines regarding the necessary namespace setup. At runtime, the compiler outputs the literal &lt;BasePath /&gt; string as text, which breaks the HTML parsing structure and forces subsequent &lt;head&gt; elements into the &lt;body&gt; tag.</w:t>
       </w:r>
     </w:p>
     <w:p/>
@@ -14048,25 +12970,7 @@
     </w:p>
     <w:p>
       <w:r>
-        <w:t xml:space="preserve">The build should fail with a clear compiler error indicating that the </w:t>
-      </w:r>
-      <w:proofErr w:type="spellStart"/>
-      <w:proofErr w:type="gramStart"/>
-      <w:r>
-        <w:t>Microsoft.AspNetCore.Components.Endpoints</w:t>
-      </w:r>
-      <w:proofErr w:type="spellEnd"/>
-      <w:proofErr w:type="gramEnd"/>
-      <w:r>
-        <w:t xml:space="preserve"> namespace is required to use the &lt;</w:t>
-      </w:r>
-      <w:proofErr w:type="spellStart"/>
-      <w:r>
-        <w:t>BasePath</w:t>
-      </w:r>
-      <w:proofErr w:type="spellEnd"/>
-      <w:r>
-        <w:t xml:space="preserve"> /&gt; component. Alternatively, if a build failure is not possible by design, the </w:t>
+        <w:t xml:space="preserve">The build should fail with a clear compiler error indicating that the Microsoft.AspNetCore.Components.Endpoints namespace is required to use the &lt;BasePath /&gt; component. Alternatively, if a build failure is not possible by design, the </w:t>
       </w:r>
       <w:r>
         <w:lastRenderedPageBreak/>
@@ -14087,38 +12991,1072 @@
           <w:rPr>
             <w:rStyle w:val="Hyperlink"/>
           </w:rPr>
-          <w:t>BlazorWebApp-BasePath-Validation/Evidence/net10-to-net11-upgrade/Issue_BasePath_MissingNamespace.zip at main · BharatRamsf3693/</w:t>
+          <w:t>BlazorWebApp-BasePath-Validation/Evidence/net10-to-net11-upgrade/Issue_BasePath_MissingNamespace.zip at main · BharatRamsf3693/BlazorWebApp-BasePath-Validation</w:t>
         </w:r>
-        <w:proofErr w:type="spellStart"/>
+      </w:hyperlink>
+    </w:p>
+    <w:p/>
+    <w:p>
+      <w:r>
+        <w:rPr>
+          <w:b/>
+          <w:bCs/>
+        </w:rPr>
+        <w:t xml:space="preserve">2. </w:t>
+      </w:r>
+      <w:r>
+        <w:rPr>
+          <w:b/>
+          <w:bCs/>
+        </w:rPr>
+        <w:t>BasePath Component Fails to Preserve Sub-path Casing Behind a Reverse Proxy</w:t>
+      </w:r>
+    </w:p>
+    <w:p>
+      <w:r>
+        <w:t> </w:t>
+      </w:r>
+    </w:p>
+    <w:p>
+      <w:r>
+        <w:rPr>
+          <w:b/>
+          <w:bCs/>
+        </w:rPr>
+        <w:t>Short Summary</w:t>
+      </w:r>
+    </w:p>
+    <w:p>
+      <w:r>
+        <w:t> </w:t>
+      </w:r>
+    </w:p>
+    <w:p>
+      <w:r>
+        <w:t>The &lt;BasePath /&gt; component fails to adapt to case-sensitivity changes introduced by a reverse proxy. When the public proxy URL uses a specific casing (for example, /StaticSsr/) while the backend application uses a different casing (for example, /staticssr/), the &lt;BasePath /&gt; component incorrectly falls back to the backend application's casing instead of preserving the casing of the public request path.</w:t>
+      </w:r>
+    </w:p>
+    <w:p>
+      <w:r>
+        <w:t> </w:t>
+      </w:r>
+    </w:p>
+    <w:p>
+      <w:r>
+        <w:t>This mismatch causes console errors in Interactive Server and Interactive WebAssembly samples. In the Static SSR sample, no console errors occur, but changes to the sub-path casing in the browser URL are not reflected in the rendered &lt;base&gt; element.</w:t>
+      </w:r>
+    </w:p>
+    <w:p>
+      <w:r>
+        <w:t> </w:t>
+      </w:r>
+    </w:p>
+    <w:p>
+      <w:r>
+        <w:rPr>
+          <w:b/>
+          <w:bCs/>
+        </w:rPr>
+        <w:t>What Happened</w:t>
+      </w:r>
+    </w:p>
+    <w:p>
+      <w:r>
+        <w:t> </w:t>
+      </w:r>
+    </w:p>
+    <w:p>
+      <w:r>
+        <w:t>When an IIS reverse proxy is configured to forward traffic from a public URL with a specific casing to a backend application path, casing variations in the incoming request are ignored. For example, requests arriving through the reverse proxy at:</w:t>
+      </w:r>
+    </w:p>
+    <w:p>
+      <w:r>
+        <w:t> </w:t>
+      </w:r>
+    </w:p>
+    <w:p>
+      <w:hyperlink r:id="rId38" w:history="1">
         <w:r>
           <w:rPr>
             <w:rStyle w:val="Hyperlink"/>
           </w:rPr>
-          <w:t>BlazorWebApp</w:t>
+          <w:t>https://reverse.proxy.com/InteractiveWebAssembly</w:t>
         </w:r>
-        <w:proofErr w:type="spellEnd"/>
+      </w:hyperlink>
+    </w:p>
+    <w:p>
+      <w:r>
+        <w:t> </w:t>
+      </w:r>
+    </w:p>
+    <w:p>
+      <w:r>
+        <w:lastRenderedPageBreak/>
+        <w:t>are rewritten to the backend application path.</w:t>
+      </w:r>
+    </w:p>
+    <w:p>
+      <w:r>
+        <w:t> </w:t>
+      </w:r>
+    </w:p>
+    <w:p>
+      <w:r>
+        <w:t>However, instead of dynamically preserving the exact casing of the incoming public request path (/InteractiveWebAssembly/), the &lt;BasePath /&gt; component renders the &lt;base&gt; element using the backend application's configured path casing:</w:t>
+      </w:r>
+    </w:p>
+    <w:p>
+      <w:r>
+        <w:t>/interactivewebassembly/</w:t>
+      </w:r>
+    </w:p>
+    <w:p>
+      <w:r>
+        <w:t> </w:t>
+      </w:r>
+    </w:p>
+    <w:p>
+      <w:r>
+        <w:rPr>
+          <w:b/>
+          <w:bCs/>
+        </w:rPr>
+        <w:t>What You Expected Instead</w:t>
+      </w:r>
+    </w:p>
+    <w:p>
+      <w:r>
+        <w:t> </w:t>
+      </w:r>
+    </w:p>
+    <w:p>
+      <w:r>
+        <w:t>The &lt;BasePath /&gt; component should dynamically inspect the request path and preserve the exact casing of the requested public URL path, producing:</w:t>
+      </w:r>
+    </w:p>
+    <w:p>
+      <w:r>
+        <w:t> </w:t>
+      </w:r>
+    </w:p>
+    <w:p>
+      <w:r>
+        <w:t>/InteractiveWebAssembly/</w:t>
+      </w:r>
+    </w:p>
+    <w:p>
+      <w:r>
+        <w:t> </w:t>
+      </w:r>
+    </w:p>
+    <w:p>
+      <w:r>
+        <w:t>Alternatively, if the design requires strict casing uniformity, the documentation should explicitly state that the component does not support casing changes introduced by reverse proxies.</w:t>
+      </w:r>
+    </w:p>
+    <w:p>
+      <w:r>
+        <w:t> </w:t>
+      </w:r>
+    </w:p>
+    <w:p>
+      <w:r>
+        <w:rPr>
+          <w:b/>
+          <w:bCs/>
+        </w:rPr>
+        <w:t>Steps to Reproduce</w:t>
+      </w:r>
+    </w:p>
+    <w:p>
+      <w:r>
+        <w:t> </w:t>
+      </w:r>
+    </w:p>
+    <w:p>
+      <w:r>
+        <w:rPr>
+          <w:b/>
+          <w:bCs/>
+        </w:rPr>
+        <w:t>Phase 1: Deploy the Backend Application in IIS</w:t>
+      </w:r>
+    </w:p>
+    <w:p>
+      <w:r>
+        <w:t> </w:t>
+      </w:r>
+    </w:p>
+    <w:p>
+      <w:pPr>
+        <w:numPr>
+          <w:ilvl w:val="0"/>
+          <w:numId w:val="11"/>
+        </w:numPr>
+      </w:pPr>
+      <w:r>
+        <w:t>Open Internet Information Services (IIS) Manager.</w:t>
+      </w:r>
+    </w:p>
+    <w:p>
+      <w:pPr>
+        <w:numPr>
+          <w:ilvl w:val="0"/>
+          <w:numId w:val="11"/>
+        </w:numPr>
+      </w:pPr>
+      <w:r>
+        <w:t>In the Connections panel, right-click Sites and select Add Website.</w:t>
+      </w:r>
+    </w:p>
+    <w:p>
+      <w:pPr>
+        <w:numPr>
+          <w:ilvl w:val="0"/>
+          <w:numId w:val="11"/>
+        </w:numPr>
+      </w:pPr>
+      <w:r>
+        <w:t>Configure the new website:</w:t>
+      </w:r>
+    </w:p>
+    <w:p>
+      <w:pPr>
+        <w:numPr>
+          <w:ilvl w:val="1"/>
+          <w:numId w:val="11"/>
+        </w:numPr>
+      </w:pPr>
+      <w:r>
+        <w:t>Site name: Enter a recognizable name.</w:t>
+      </w:r>
+    </w:p>
+    <w:p>
+      <w:pPr>
+        <w:numPr>
+          <w:ilvl w:val="1"/>
+          <w:numId w:val="11"/>
+        </w:numPr>
+      </w:pPr>
+      <w:r>
+        <w:t>Physical path: Map it to a new empty folder, since the actual application will run inside a sub-path application node.</w:t>
+      </w:r>
+    </w:p>
+    <w:p>
+      <w:pPr>
+        <w:numPr>
+          <w:ilvl w:val="0"/>
+          <w:numId w:val="11"/>
+        </w:numPr>
+      </w:pPr>
+      <w:r>
+        <w:lastRenderedPageBreak/>
+        <w:t>Configure the Binding section:</w:t>
+      </w:r>
+    </w:p>
+    <w:p>
+      <w:pPr>
+        <w:numPr>
+          <w:ilvl w:val="1"/>
+          <w:numId w:val="11"/>
+        </w:numPr>
+      </w:pPr>
+      <w:r>
+        <w:t>Set Type to https.</w:t>
+      </w:r>
+    </w:p>
+    <w:p>
+      <w:pPr>
+        <w:numPr>
+          <w:ilvl w:val="1"/>
+          <w:numId w:val="11"/>
+        </w:numPr>
+      </w:pPr>
+      <w:r>
+        <w:t>Assign an available port (for example, 443).</w:t>
+      </w:r>
+    </w:p>
+    <w:p>
+      <w:pPr>
+        <w:numPr>
+          <w:ilvl w:val="1"/>
+          <w:numId w:val="11"/>
+        </w:numPr>
+      </w:pPr>
+      <w:r>
+        <w:t>Leave IP Address as All Unassigned.</w:t>
+      </w:r>
+    </w:p>
+    <w:p>
+      <w:pPr>
+        <w:numPr>
+          <w:ilvl w:val="1"/>
+          <w:numId w:val="11"/>
+        </w:numPr>
+      </w:pPr>
+      <w:r>
+        <w:t>Enter a custom local test domain as the Host name (for example, blazorwebapp.basepathvalidation.com).</w:t>
+      </w:r>
+    </w:p>
+    <w:p>
+      <w:pPr>
+        <w:numPr>
+          <w:ilvl w:val="1"/>
+          <w:numId w:val="11"/>
+        </w:numPr>
+      </w:pPr>
+      <w:r>
+        <w:t>Select an SSL certificate:</w:t>
+      </w:r>
+    </w:p>
+    <w:p>
+      <w:pPr>
+        <w:numPr>
+          <w:ilvl w:val="2"/>
+          <w:numId w:val="11"/>
+        </w:numPr>
+      </w:pPr>
+      <w:r>
+        <w:t>A self-signed certificate can be used for local validation.</w:t>
+      </w:r>
+    </w:p>
+    <w:p>
+      <w:pPr>
+        <w:numPr>
+          <w:ilvl w:val="2"/>
+          <w:numId w:val="11"/>
+        </w:numPr>
+      </w:pPr>
+      <w:r>
+        <w:t>If a certificate is not available, create one and bind it to the website.</w:t>
+      </w:r>
+    </w:p>
+    <w:p>
+      <w:pPr>
+        <w:numPr>
+          <w:ilvl w:val="0"/>
+          <w:numId w:val="11"/>
+        </w:numPr>
+      </w:pPr>
+      <w:r>
+        <w:t>Click OK to create the parent website.</w:t>
+      </w:r>
+    </w:p>
+    <w:p>
+      <w:pPr>
+        <w:numPr>
+          <w:ilvl w:val="0"/>
+          <w:numId w:val="11"/>
+        </w:numPr>
+      </w:pPr>
+      <w:r>
+        <w:t>Right-click the newly created website and select Add Application to create the sub-path environment.</w:t>
+      </w:r>
+    </w:p>
+    <w:p>
+      <w:pPr>
+        <w:numPr>
+          <w:ilvl w:val="0"/>
+          <w:numId w:val="11"/>
+        </w:numPr>
+      </w:pPr>
+      <w:r>
+        <w:t>Configure the sub-path application:</w:t>
+      </w:r>
+    </w:p>
+    <w:p>
+      <w:pPr>
+        <w:numPr>
+          <w:ilvl w:val="1"/>
+          <w:numId w:val="11"/>
+        </w:numPr>
+      </w:pPr>
+      <w:r>
+        <w:t>Alias: Enter a lowercase application path alias (for example, staticssr, interactiveserver, or interactivewebassembly).</w:t>
+      </w:r>
+    </w:p>
+    <w:p>
+      <w:pPr>
+        <w:numPr>
+          <w:ilvl w:val="1"/>
+          <w:numId w:val="11"/>
+        </w:numPr>
+      </w:pPr>
+      <w:r>
+        <w:t>Physical path: Map it to the published output folder containing the .NET 11 application binaries.</w:t>
+      </w:r>
+    </w:p>
+    <w:p>
+      <w:pPr>
+        <w:numPr>
+          <w:ilvl w:val="1"/>
+          <w:numId w:val="11"/>
+        </w:numPr>
+      </w:pPr>
+      <w:r>
+        <w:t>Application pool: Select the required application pool.</w:t>
+      </w:r>
+    </w:p>
+    <w:p>
+      <w:pPr>
+        <w:numPr>
+          <w:ilvl w:val="0"/>
+          <w:numId w:val="11"/>
+        </w:numPr>
+      </w:pPr>
+      <w:r>
+        <w:t>Verify that the backend application works independently by navigating to:</w:t>
+      </w:r>
+    </w:p>
+    <w:p>
+      <w:hyperlink r:id="rId39" w:history="1">
         <w:r>
           <w:rPr>
             <w:rStyle w:val="Hyperlink"/>
           </w:rPr>
-          <w:t>-</w:t>
+          <w:t>https://blazorwebapp.basepathvalidation.com/interactivewebassembly</w:t>
         </w:r>
-        <w:proofErr w:type="spellStart"/>
+      </w:hyperlink>
+    </w:p>
+    <w:p>
+      <w:r>
+        <w:t> </w:t>
+      </w:r>
+    </w:p>
+    <w:p>
+      <w:r>
+        <w:rPr>
+          <w:b/>
+          <w:bCs/>
+        </w:rPr>
+        <w:t>Phase 2: Set Up the Reverse Proxy</w:t>
+      </w:r>
+    </w:p>
+    <w:p>
+      <w:pPr>
+        <w:numPr>
+          <w:ilvl w:val="0"/>
+          <w:numId w:val="12"/>
+        </w:numPr>
+      </w:pPr>
+      <w:r>
+        <w:t>Ensure that the URL Rewrite and Application Request Routing (ARR) modules are installed and enabled on the IIS server.</w:t>
+      </w:r>
+    </w:p>
+    <w:p>
+      <w:pPr>
+        <w:numPr>
+          <w:ilvl w:val="0"/>
+          <w:numId w:val="12"/>
+        </w:numPr>
+      </w:pPr>
+      <w:r>
+        <w:t>Create a separate website to act as the public-facing reverse proxy (for example, reverse.proxy.com).</w:t>
+      </w:r>
+    </w:p>
+    <w:p>
+      <w:pPr>
+        <w:numPr>
+          <w:ilvl w:val="0"/>
+          <w:numId w:val="12"/>
+        </w:numPr>
+      </w:pPr>
+      <w:r>
+        <w:t>Configure the new website:</w:t>
+      </w:r>
+    </w:p>
+    <w:p>
+      <w:pPr>
+        <w:numPr>
+          <w:ilvl w:val="1"/>
+          <w:numId w:val="12"/>
+        </w:numPr>
+      </w:pPr>
+      <w:r>
+        <w:t>Site name: Enter a recognizable name.</w:t>
+      </w:r>
+    </w:p>
+    <w:p>
+      <w:pPr>
+        <w:numPr>
+          <w:ilvl w:val="1"/>
+          <w:numId w:val="12"/>
+        </w:numPr>
+      </w:pPr>
+      <w:r>
+        <w:lastRenderedPageBreak/>
+        <w:t>Physical path: Map it to a new empty folder.</w:t>
+      </w:r>
+    </w:p>
+    <w:p>
+      <w:pPr>
+        <w:numPr>
+          <w:ilvl w:val="1"/>
+          <w:numId w:val="12"/>
+        </w:numPr>
+      </w:pPr>
+      <w:r>
+        <w:t>Configure the Binding section:</w:t>
+      </w:r>
+    </w:p>
+    <w:p>
+      <w:pPr>
+        <w:numPr>
+          <w:ilvl w:val="2"/>
+          <w:numId w:val="12"/>
+        </w:numPr>
+      </w:pPr>
+      <w:r>
+        <w:t>Set Type to https.</w:t>
+      </w:r>
+    </w:p>
+    <w:p>
+      <w:pPr>
+        <w:numPr>
+          <w:ilvl w:val="2"/>
+          <w:numId w:val="12"/>
+        </w:numPr>
+      </w:pPr>
+      <w:r>
+        <w:t>Assign an available port (for example, 443).</w:t>
+      </w:r>
+    </w:p>
+    <w:p>
+      <w:pPr>
+        <w:numPr>
+          <w:ilvl w:val="2"/>
+          <w:numId w:val="12"/>
+        </w:numPr>
+      </w:pPr>
+      <w:r>
+        <w:t>Leave IP Address as All Unassigned.</w:t>
+      </w:r>
+    </w:p>
+    <w:p>
+      <w:pPr>
+        <w:numPr>
+          <w:ilvl w:val="2"/>
+          <w:numId w:val="12"/>
+        </w:numPr>
+      </w:pPr>
+      <w:r>
+        <w:t>Enter a custom local test domain as the Host name (for example, reverse.proxy.com).</w:t>
+      </w:r>
+    </w:p>
+    <w:p>
+      <w:pPr>
+        <w:numPr>
+          <w:ilvl w:val="2"/>
+          <w:numId w:val="12"/>
+        </w:numPr>
+      </w:pPr>
+      <w:r>
+        <w:t>Select an SSL certificate:</w:t>
+      </w:r>
+    </w:p>
+    <w:p>
+      <w:pPr>
+        <w:numPr>
+          <w:ilvl w:val="3"/>
+          <w:numId w:val="12"/>
+        </w:numPr>
+      </w:pPr>
+      <w:r>
+        <w:t>A self-signed certificate can be used for local validation.</w:t>
+      </w:r>
+    </w:p>
+    <w:p>
+      <w:pPr>
+        <w:numPr>
+          <w:ilvl w:val="3"/>
+          <w:numId w:val="12"/>
+        </w:numPr>
+      </w:pPr>
+      <w:r>
+        <w:t>If a certificate is not available, create one and bind it to the website.</w:t>
+      </w:r>
+    </w:p>
+    <w:p>
+      <w:pPr>
+        <w:numPr>
+          <w:ilvl w:val="1"/>
+          <w:numId w:val="12"/>
+        </w:numPr>
+      </w:pPr>
+      <w:r>
+        <w:t>Click OK to create the parent website.</w:t>
+      </w:r>
+    </w:p>
+    <w:p>
+      <w:pPr>
+        <w:numPr>
+          <w:ilvl w:val="0"/>
+          <w:numId w:val="12"/>
+        </w:numPr>
+      </w:pPr>
+      <w:r>
+        <w:t>Right-click the newly created website and select Add Application.</w:t>
+      </w:r>
+    </w:p>
+    <w:p>
+      <w:pPr>
+        <w:numPr>
+          <w:ilvl w:val="0"/>
+          <w:numId w:val="12"/>
+        </w:numPr>
+      </w:pPr>
+      <w:r>
+        <w:t>Configure the sub-path application:</w:t>
+      </w:r>
+    </w:p>
+    <w:p>
+      <w:pPr>
+        <w:numPr>
+          <w:ilvl w:val="1"/>
+          <w:numId w:val="12"/>
+        </w:numPr>
+      </w:pPr>
+      <w:r>
+        <w:rPr>
+          <w:b/>
+          <w:bCs/>
+        </w:rPr>
+        <w:t>Alias:</w:t>
+      </w:r>
+      <w:r>
+        <w:t xml:space="preserve"> Enter a lowercase application path alias (for example, staticssr, interactiveserver, or interactivewebassembly).</w:t>
+      </w:r>
+    </w:p>
+    <w:p>
+      <w:pPr>
+        <w:numPr>
+          <w:ilvl w:val="1"/>
+          <w:numId w:val="12"/>
+        </w:numPr>
+      </w:pPr>
+      <w:r>
+        <w:rPr>
+          <w:b/>
+          <w:bCs/>
+        </w:rPr>
+        <w:t>Physical path:</w:t>
+      </w:r>
+      <w:r>
+        <w:t xml:space="preserve"> Map it to a new empty folder.</w:t>
+      </w:r>
+    </w:p>
+    <w:p>
+      <w:pPr>
+        <w:numPr>
+          <w:ilvl w:val="1"/>
+          <w:numId w:val="12"/>
+        </w:numPr>
+      </w:pPr>
+      <w:r>
+        <w:rPr>
+          <w:b/>
+          <w:bCs/>
+        </w:rPr>
+        <w:t>Application pool:</w:t>
+      </w:r>
+      <w:r>
+        <w:t xml:space="preserve"> Select the required application pool.</w:t>
+      </w:r>
+    </w:p>
+    <w:p>
+      <w:pPr>
+        <w:numPr>
+          <w:ilvl w:val="0"/>
+          <w:numId w:val="12"/>
+        </w:numPr>
+      </w:pPr>
+      <w:r>
+        <w:t xml:space="preserve">Click OK to create the </w:t>
+      </w:r>
+      <w:r>
+        <w:t>application</w:t>
+      </w:r>
+      <w:r>
+        <w:t>.</w:t>
+      </w:r>
+    </w:p>
+    <w:p>
+      <w:pPr>
+        <w:numPr>
+          <w:ilvl w:val="0"/>
+          <w:numId w:val="12"/>
+        </w:numPr>
+      </w:pPr>
+      <w:r>
+        <w:t>Select the newly created application. In the center pane, click URL Rewrite.</w:t>
+      </w:r>
+    </w:p>
+    <w:p>
+      <w:pPr>
+        <w:numPr>
+          <w:ilvl w:val="0"/>
+          <w:numId w:val="12"/>
+        </w:numPr>
+      </w:pPr>
+      <w:r>
+        <w:t>Click Add Rule(s) and use the Reverse Proxy rule template.</w:t>
+      </w:r>
+    </w:p>
+    <w:p>
+      <w:pPr>
+        <w:numPr>
+          <w:ilvl w:val="0"/>
+          <w:numId w:val="12"/>
+        </w:numPr>
+      </w:pPr>
+      <w:r>
+        <w:t>After adding the rule, the following web.config file is created in the mapped</w:t>
+      </w:r>
+      <w:r>
+        <w:rPr>
+          <w:b/>
+          <w:bCs/>
+        </w:rPr>
+        <w:t xml:space="preserve"> </w:t>
+      </w:r>
+      <w:r>
+        <w:t>Physical path</w:t>
+      </w:r>
+      <w:r>
+        <w:t xml:space="preserve"> folder.</w:t>
+      </w:r>
+    </w:p>
+    <w:p>
+      <w:r>
+        <w:t>Example Rule Structure</w:t>
+      </w:r>
+    </w:p>
+    <w:p>
+      <w:r>
+        <w:t>&lt;?xml version="1.0" encoding="UTF-8"?&gt;</w:t>
+      </w:r>
+    </w:p>
+    <w:p>
+      <w:r>
+        <w:t>&lt;configuration&gt;</w:t>
+      </w:r>
+    </w:p>
+    <w:p>
+      <w:r>
+        <w:t xml:space="preserve">    &lt;system.webServer&gt;</w:t>
+      </w:r>
+    </w:p>
+    <w:p>
+      <w:r>
+        <w:lastRenderedPageBreak/>
+        <w:t xml:space="preserve">        &lt;rewrite&gt;</w:t>
+      </w:r>
+    </w:p>
+    <w:p>
+      <w:r>
+        <w:t xml:space="preserve">            &lt;rules&gt;</w:t>
+      </w:r>
+    </w:p>
+    <w:p>
+      <w:r>
+        <w:t xml:space="preserve">                &lt;rule name="ReverseProxyInboundRule1" stopProcessing="true"&gt;</w:t>
+      </w:r>
+    </w:p>
+    <w:p>
+      <w:r>
+        <w:t xml:space="preserve">                    &lt;match url="(.*)" /&gt;</w:t>
+      </w:r>
+    </w:p>
+    <w:p>
+      <w:r>
+        <w:t xml:space="preserve">                    &lt;action type="Rewrite" url="https://blazorwebapp.basepathvalidation.com/interactivewebassembly/{R:1}" /&gt;</w:t>
+      </w:r>
+    </w:p>
+    <w:p>
+      <w:r>
+        <w:t xml:space="preserve">                &lt;/rule&gt;</w:t>
+      </w:r>
+    </w:p>
+    <w:p>
+      <w:r>
+        <w:t xml:space="preserve">            &lt;/rules&gt;</w:t>
+      </w:r>
+    </w:p>
+    <w:p>
+      <w:r>
+        <w:t xml:space="preserve">        &lt;/rewrite&gt;</w:t>
+      </w:r>
+    </w:p>
+    <w:p>
+      <w:r>
+        <w:t xml:space="preserve">    &lt;/system.webServer&gt;</w:t>
+      </w:r>
+    </w:p>
+    <w:p>
+      <w:r>
+        <w:t>&lt;/configuration&gt;</w:t>
+      </w:r>
+    </w:p>
+    <w:p>
+      <w:r>
+        <w:t> </w:t>
+      </w:r>
+    </w:p>
+    <w:p>
+      <w:r>
+        <w:rPr>
+          <w:b/>
+          <w:bCs/>
+        </w:rPr>
+        <w:t>Phase 3: Execute the Validation Scenarios</w:t>
+      </w:r>
+    </w:p>
+    <w:p>
+      <w:pPr>
+        <w:numPr>
+          <w:ilvl w:val="0"/>
+          <w:numId w:val="13"/>
+        </w:numPr>
+      </w:pPr>
+      <w:r>
+        <w:t>Open a browser and navigate to the reverse proxy URL using the exact lowercase sub-path alias configured for the backend application:</w:t>
+      </w:r>
+      <w:r>
+        <w:t xml:space="preserve"> </w:t>
+      </w:r>
+      <w:hyperlink r:id="rId40" w:history="1">
         <w:r>
           <w:rPr>
             <w:rStyle w:val="Hyperlink"/>
           </w:rPr>
-          <w:t>BasePath</w:t>
+          <w:t>https://reverse.proxy.com/interactivewebassembly</w:t>
         </w:r>
-        <w:proofErr w:type="spellEnd"/>
+      </w:hyperlink>
+    </w:p>
+    <w:p>
+      <w:pPr>
+        <w:ind w:firstLine="720"/>
+      </w:pPr>
+      <w:r>
+        <w:t>Result: The page loads successfully.</w:t>
+      </w:r>
+    </w:p>
+    <w:p>
+      <w:pPr>
+        <w:numPr>
+          <w:ilvl w:val="0"/>
+          <w:numId w:val="14"/>
+        </w:numPr>
+      </w:pPr>
+      <w:r>
+        <w:t>Navigate to the same application using a mixed-case path:</w:t>
+      </w:r>
+      <w:r>
+        <w:t xml:space="preserve"> </w:t>
+      </w:r>
+      <w:hyperlink r:id="rId41" w:history="1">
         <w:r>
           <w:rPr>
             <w:rStyle w:val="Hyperlink"/>
           </w:rPr>
-          <w:t>-Validation</w:t>
+          <w:t>https://reverse.proxy.com/InteractiveWebAssembly</w:t>
         </w:r>
       </w:hyperlink>
     </w:p>
+    <w:p>
+      <w:pPr>
+        <w:numPr>
+          <w:ilvl w:val="0"/>
+          <w:numId w:val="15"/>
+        </w:numPr>
+      </w:pPr>
+      <w:r>
+        <w:t>Open the browser developer tools and inspect the rendered HTML within the &lt;head&gt; element.</w:t>
+      </w:r>
+      <w:r>
+        <w:br/>
+      </w:r>
+    </w:p>
+    <w:p>
+      <w:r>
+        <w:rPr>
+          <w:b/>
+          <w:bCs/>
+        </w:rPr>
+        <w:t>Observation:</w:t>
+      </w:r>
+      <w:r>
+        <w:t xml:space="preserve"> The &lt;base&gt; element does not reflect the mixed-case sub-path used in the request URL.</w:t>
+      </w:r>
+    </w:p>
+    <w:p>
+      <w:r>
+        <w:t> </w:t>
+      </w:r>
+    </w:p>
+    <w:p>
+      <w:r>
+        <w:rPr>
+          <w:b/>
+          <w:bCs/>
+        </w:rPr>
+        <w:t>Actual Result</w:t>
+      </w:r>
+    </w:p>
+    <w:p>
+      <w:r>
+        <w:t> </w:t>
+      </w:r>
+    </w:p>
+    <w:p>
+      <w:r>
+        <w:lastRenderedPageBreak/>
+        <w:t>This mismatch causes console errors in the browser for the Interactive Server and Interactive WebAssembly samples. For the Static SSR sample, no console errors occur; however, the casing change in the browser URL is not reflected in the rendered &lt;base&gt; element.</w:t>
+      </w:r>
+    </w:p>
+    <w:p>
+      <w:r>
+        <w:t> </w:t>
+      </w:r>
+    </w:p>
+    <w:p>
+      <w:r>
+        <w:t>The &lt;BasePath /&gt; component renders:</w:t>
+      </w:r>
+    </w:p>
+    <w:p>
+      <w:r>
+        <w:t> </w:t>
+      </w:r>
+    </w:p>
+    <w:p>
+      <w:r>
+        <w:t>/interactivewebassembly/</w:t>
+      </w:r>
+    </w:p>
+    <w:p>
+      <w:r>
+        <w:t> </w:t>
+      </w:r>
+    </w:p>
+    <w:p>
+      <w:r>
+        <w:t>instead of preserving the casing used by the client request:</w:t>
+      </w:r>
+    </w:p>
+    <w:p>
+      <w:r>
+        <w:t> </w:t>
+      </w:r>
+    </w:p>
+    <w:p>
+      <w:r>
+        <w:t>/InteractiveWebAssembly/</w:t>
+      </w:r>
+    </w:p>
+    <w:p>
+      <w:r>
+        <w:t> </w:t>
+      </w:r>
+    </w:p>
+    <w:p>
+      <w:r>
+        <w:rPr>
+          <w:b/>
+          <w:bCs/>
+        </w:rPr>
+        <w:t>Expected Result</w:t>
+      </w:r>
+    </w:p>
+    <w:p>
+      <w:r>
+        <w:t> </w:t>
+      </w:r>
+    </w:p>
+    <w:p>
+      <w:r>
+        <w:t xml:space="preserve">The application should load successfully regardless of the subpath casing used in the incoming request URL. The </w:t>
+      </w:r>
+      <w:r>
+        <w:rPr>
+          <w:b/>
+          <w:bCs/>
+        </w:rPr>
+        <w:t>&lt;BasePath /&gt;</w:t>
+      </w:r>
+      <w:r>
+        <w:t xml:space="preserve"> component should preserve the exact casing of the requested path, ensuring that all static asset URLs resolve correctly using that same casing from the reverse proxy URL.</w:t>
+      </w:r>
+    </w:p>
+    <w:p>
+      <w:r>
+        <w:t> </w:t>
+      </w:r>
+    </w:p>
+    <w:p>
+      <w:r>
+        <w:rPr>
+          <w:b/>
+          <w:bCs/>
+        </w:rPr>
+        <w:t xml:space="preserve">Evidence: </w:t>
+      </w:r>
+    </w:p>
+    <w:p>
+      <w:r>
+        <w:rPr>
+          <w:b/>
+          <w:bCs/>
+        </w:rPr>
+        <w:t>New .NET 11 App (Created &amp; Published)</w:t>
+      </w:r>
+      <w:r>
+        <w:rPr>
+          <w:b/>
+          <w:bCs/>
+        </w:rPr>
+        <w:t xml:space="preserve"> scenario</w:t>
+      </w:r>
+      <w:r>
+        <w:rPr>
+          <w:b/>
+          <w:bCs/>
+        </w:rPr>
+        <w:t xml:space="preserve">: </w:t>
+      </w:r>
+      <w:hyperlink r:id="rId42" w:history="1">
+        <w:r>
+          <w:rPr>
+            <w:rStyle w:val="Hyperlink"/>
+          </w:rPr>
+          <w:t>BlazorWebApp-BasePath-Validation/Evidence/net11-new-app/ReverseProxy at main · BharatRamsf3693/BlazorWebApp-BasePath-Validation</w:t>
+        </w:r>
+      </w:hyperlink>
+    </w:p>
+    <w:p>
+      <w:r>
+        <w:t> </w:t>
+      </w:r>
+    </w:p>
+    <w:p>
+      <w:r>
+        <w:rPr>
+          <w:b/>
+          <w:bCs/>
+        </w:rPr>
+        <w:t xml:space="preserve">Upgraded App (from .NET 10 to .NET 11) and then published scenario: </w:t>
+      </w:r>
+      <w:hyperlink r:id="rId43" w:history="1">
+        <w:r>
+          <w:rPr>
+            <w:rStyle w:val="Hyperlink"/>
+          </w:rPr>
+          <w:t>BlazorWebApp-BasePath-Validation/Evidence/net10-to-net11-upgrade/ReverseProxy at main · BharatRamsf3693/BlazorWebApp-BasePath-Validation</w:t>
+        </w:r>
+      </w:hyperlink>
+    </w:p>
+    <w:p/>
     <w:sectPr>
       <w:pgSz w:w="12240" w:h="15840"/>
       <w:pgMar w:top="1440" w:right="1440" w:bottom="1440" w:left="1440" w:header="720" w:footer="720" w:gutter="0"/>
@@ -14656,6 +14594,119 @@
     </w:lvl>
   </w:abstractNum>
   <w:abstractNum w:abstractNumId="4" w15:restartNumberingAfterBreak="0">
+    <w:nsid w:val="29AE43D9"/>
+    <w:multiLevelType w:val="multilevel"/>
+    <w:tmpl w:val="5428D5C2"/>
+    <w:lvl w:ilvl="0">
+      <w:start w:val="1"/>
+      <w:numFmt w:val="decimal"/>
+      <w:lvlText w:val="%1."/>
+      <w:lvlJc w:val="left"/>
+      <w:pPr>
+        <w:tabs>
+          <w:tab w:val="num" w:pos="720"/>
+        </w:tabs>
+        <w:ind w:left="720" w:hanging="360"/>
+      </w:pPr>
+    </w:lvl>
+    <w:lvl w:ilvl="1" w:tentative="1">
+      <w:start w:val="1"/>
+      <w:numFmt w:val="decimal"/>
+      <w:lvlText w:val="%2."/>
+      <w:lvlJc w:val="left"/>
+      <w:pPr>
+        <w:tabs>
+          <w:tab w:val="num" w:pos="1440"/>
+        </w:tabs>
+        <w:ind w:left="1440" w:hanging="360"/>
+      </w:pPr>
+    </w:lvl>
+    <w:lvl w:ilvl="2" w:tentative="1">
+      <w:start w:val="1"/>
+      <w:numFmt w:val="decimal"/>
+      <w:lvlText w:val="%3."/>
+      <w:lvlJc w:val="left"/>
+      <w:pPr>
+        <w:tabs>
+          <w:tab w:val="num" w:pos="2160"/>
+        </w:tabs>
+        <w:ind w:left="2160" w:hanging="360"/>
+      </w:pPr>
+    </w:lvl>
+    <w:lvl w:ilvl="3" w:tentative="1">
+      <w:start w:val="1"/>
+      <w:numFmt w:val="decimal"/>
+      <w:lvlText w:val="%4."/>
+      <w:lvlJc w:val="left"/>
+      <w:pPr>
+        <w:tabs>
+          <w:tab w:val="num" w:pos="2880"/>
+        </w:tabs>
+        <w:ind w:left="2880" w:hanging="360"/>
+      </w:pPr>
+    </w:lvl>
+    <w:lvl w:ilvl="4" w:tentative="1">
+      <w:start w:val="1"/>
+      <w:numFmt w:val="decimal"/>
+      <w:lvlText w:val="%5."/>
+      <w:lvlJc w:val="left"/>
+      <w:pPr>
+        <w:tabs>
+          <w:tab w:val="num" w:pos="3600"/>
+        </w:tabs>
+        <w:ind w:left="3600" w:hanging="360"/>
+      </w:pPr>
+    </w:lvl>
+    <w:lvl w:ilvl="5" w:tentative="1">
+      <w:start w:val="1"/>
+      <w:numFmt w:val="decimal"/>
+      <w:lvlText w:val="%6."/>
+      <w:lvlJc w:val="left"/>
+      <w:pPr>
+        <w:tabs>
+          <w:tab w:val="num" w:pos="4320"/>
+        </w:tabs>
+        <w:ind w:left="4320" w:hanging="360"/>
+      </w:pPr>
+    </w:lvl>
+    <w:lvl w:ilvl="6" w:tentative="1">
+      <w:start w:val="1"/>
+      <w:numFmt w:val="decimal"/>
+      <w:lvlText w:val="%7."/>
+      <w:lvlJc w:val="left"/>
+      <w:pPr>
+        <w:tabs>
+          <w:tab w:val="num" w:pos="5040"/>
+        </w:tabs>
+        <w:ind w:left="5040" w:hanging="360"/>
+      </w:pPr>
+    </w:lvl>
+    <w:lvl w:ilvl="7" w:tentative="1">
+      <w:start w:val="1"/>
+      <w:numFmt w:val="decimal"/>
+      <w:lvlText w:val="%8."/>
+      <w:lvlJc w:val="left"/>
+      <w:pPr>
+        <w:tabs>
+          <w:tab w:val="num" w:pos="5760"/>
+        </w:tabs>
+        <w:ind w:left="5760" w:hanging="360"/>
+      </w:pPr>
+    </w:lvl>
+    <w:lvl w:ilvl="8" w:tentative="1">
+      <w:start w:val="1"/>
+      <w:numFmt w:val="decimal"/>
+      <w:lvlText w:val="%9."/>
+      <w:lvlJc w:val="left"/>
+      <w:pPr>
+        <w:tabs>
+          <w:tab w:val="num" w:pos="6480"/>
+        </w:tabs>
+        <w:ind w:left="6480" w:hanging="360"/>
+      </w:pPr>
+    </w:lvl>
+  </w:abstractNum>
+  <w:abstractNum w:abstractNumId="5" w15:restartNumberingAfterBreak="0">
     <w:nsid w:val="2EDC5EF3"/>
     <w:multiLevelType w:val="multilevel"/>
     <w:tmpl w:val="CC5219CC"/>
@@ -14804,7 +14855,7 @@
       </w:rPr>
     </w:lvl>
   </w:abstractNum>
-  <w:abstractNum w:abstractNumId="5" w15:restartNumberingAfterBreak="0">
+  <w:abstractNum w:abstractNumId="6" w15:restartNumberingAfterBreak="0">
     <w:nsid w:val="2F4B1DF6"/>
     <w:multiLevelType w:val="multilevel"/>
     <w:tmpl w:val="4080E33A"/>
@@ -14953,7 +15004,120 @@
       </w:rPr>
     </w:lvl>
   </w:abstractNum>
-  <w:abstractNum w:abstractNumId="6" w15:restartNumberingAfterBreak="0">
+  <w:abstractNum w:abstractNumId="7" w15:restartNumberingAfterBreak="0">
+    <w:nsid w:val="337C4873"/>
+    <w:multiLevelType w:val="multilevel"/>
+    <w:tmpl w:val="41388B94"/>
+    <w:lvl w:ilvl="0">
+      <w:start w:val="1"/>
+      <w:numFmt w:val="decimal"/>
+      <w:lvlText w:val="%1."/>
+      <w:lvlJc w:val="left"/>
+      <w:pPr>
+        <w:tabs>
+          <w:tab w:val="num" w:pos="720"/>
+        </w:tabs>
+        <w:ind w:left="720" w:hanging="360"/>
+      </w:pPr>
+    </w:lvl>
+    <w:lvl w:ilvl="1" w:tentative="1">
+      <w:start w:val="1"/>
+      <w:numFmt w:val="decimal"/>
+      <w:lvlText w:val="%2."/>
+      <w:lvlJc w:val="left"/>
+      <w:pPr>
+        <w:tabs>
+          <w:tab w:val="num" w:pos="1440"/>
+        </w:tabs>
+        <w:ind w:left="1440" w:hanging="360"/>
+      </w:pPr>
+    </w:lvl>
+    <w:lvl w:ilvl="2" w:tentative="1">
+      <w:start w:val="1"/>
+      <w:numFmt w:val="decimal"/>
+      <w:lvlText w:val="%3."/>
+      <w:lvlJc w:val="left"/>
+      <w:pPr>
+        <w:tabs>
+          <w:tab w:val="num" w:pos="2160"/>
+        </w:tabs>
+        <w:ind w:left="2160" w:hanging="360"/>
+      </w:pPr>
+    </w:lvl>
+    <w:lvl w:ilvl="3" w:tentative="1">
+      <w:start w:val="1"/>
+      <w:numFmt w:val="decimal"/>
+      <w:lvlText w:val="%4."/>
+      <w:lvlJc w:val="left"/>
+      <w:pPr>
+        <w:tabs>
+          <w:tab w:val="num" w:pos="2880"/>
+        </w:tabs>
+        <w:ind w:left="2880" w:hanging="360"/>
+      </w:pPr>
+    </w:lvl>
+    <w:lvl w:ilvl="4" w:tentative="1">
+      <w:start w:val="1"/>
+      <w:numFmt w:val="decimal"/>
+      <w:lvlText w:val="%5."/>
+      <w:lvlJc w:val="left"/>
+      <w:pPr>
+        <w:tabs>
+          <w:tab w:val="num" w:pos="3600"/>
+        </w:tabs>
+        <w:ind w:left="3600" w:hanging="360"/>
+      </w:pPr>
+    </w:lvl>
+    <w:lvl w:ilvl="5" w:tentative="1">
+      <w:start w:val="1"/>
+      <w:numFmt w:val="decimal"/>
+      <w:lvlText w:val="%6."/>
+      <w:lvlJc w:val="left"/>
+      <w:pPr>
+        <w:tabs>
+          <w:tab w:val="num" w:pos="4320"/>
+        </w:tabs>
+        <w:ind w:left="4320" w:hanging="360"/>
+      </w:pPr>
+    </w:lvl>
+    <w:lvl w:ilvl="6" w:tentative="1">
+      <w:start w:val="1"/>
+      <w:numFmt w:val="decimal"/>
+      <w:lvlText w:val="%7."/>
+      <w:lvlJc w:val="left"/>
+      <w:pPr>
+        <w:tabs>
+          <w:tab w:val="num" w:pos="5040"/>
+        </w:tabs>
+        <w:ind w:left="5040" w:hanging="360"/>
+      </w:pPr>
+    </w:lvl>
+    <w:lvl w:ilvl="7" w:tentative="1">
+      <w:start w:val="1"/>
+      <w:numFmt w:val="decimal"/>
+      <w:lvlText w:val="%8."/>
+      <w:lvlJc w:val="left"/>
+      <w:pPr>
+        <w:tabs>
+          <w:tab w:val="num" w:pos="5760"/>
+        </w:tabs>
+        <w:ind w:left="5760" w:hanging="360"/>
+      </w:pPr>
+    </w:lvl>
+    <w:lvl w:ilvl="8" w:tentative="1">
+      <w:start w:val="1"/>
+      <w:numFmt w:val="decimal"/>
+      <w:lvlText w:val="%9."/>
+      <w:lvlJc w:val="left"/>
+      <w:pPr>
+        <w:tabs>
+          <w:tab w:val="num" w:pos="6480"/>
+        </w:tabs>
+        <w:ind w:left="6480" w:hanging="360"/>
+      </w:pPr>
+    </w:lvl>
+  </w:abstractNum>
+  <w:abstractNum w:abstractNumId="8" w15:restartNumberingAfterBreak="0">
     <w:nsid w:val="42C11B26"/>
     <w:multiLevelType w:val="multilevel"/>
     <w:tmpl w:val="7AE64520"/>
@@ -15070,7 +15234,366 @@
       </w:pPr>
     </w:lvl>
   </w:abstractNum>
-  <w:abstractNum w:abstractNumId="7" w15:restartNumberingAfterBreak="0">
+  <w:abstractNum w:abstractNumId="9" w15:restartNumberingAfterBreak="0">
+    <w:nsid w:val="4F8D0DB7"/>
+    <w:multiLevelType w:val="multilevel"/>
+    <w:tmpl w:val="B4E4FFA4"/>
+    <w:lvl w:ilvl="0">
+      <w:start w:val="1"/>
+      <w:numFmt w:val="decimal"/>
+      <w:lvlText w:val="%1."/>
+      <w:lvlJc w:val="left"/>
+      <w:pPr>
+        <w:tabs>
+          <w:tab w:val="num" w:pos="720"/>
+        </w:tabs>
+        <w:ind w:left="720" w:hanging="360"/>
+      </w:pPr>
+    </w:lvl>
+    <w:lvl w:ilvl="1" w:tentative="1">
+      <w:start w:val="1"/>
+      <w:numFmt w:val="decimal"/>
+      <w:lvlText w:val="%2."/>
+      <w:lvlJc w:val="left"/>
+      <w:pPr>
+        <w:tabs>
+          <w:tab w:val="num" w:pos="1440"/>
+        </w:tabs>
+        <w:ind w:left="1440" w:hanging="360"/>
+      </w:pPr>
+    </w:lvl>
+    <w:lvl w:ilvl="2" w:tentative="1">
+      <w:start w:val="1"/>
+      <w:numFmt w:val="decimal"/>
+      <w:lvlText w:val="%3."/>
+      <w:lvlJc w:val="left"/>
+      <w:pPr>
+        <w:tabs>
+          <w:tab w:val="num" w:pos="2160"/>
+        </w:tabs>
+        <w:ind w:left="2160" w:hanging="360"/>
+      </w:pPr>
+    </w:lvl>
+    <w:lvl w:ilvl="3" w:tentative="1">
+      <w:start w:val="1"/>
+      <w:numFmt w:val="decimal"/>
+      <w:lvlText w:val="%4."/>
+      <w:lvlJc w:val="left"/>
+      <w:pPr>
+        <w:tabs>
+          <w:tab w:val="num" w:pos="2880"/>
+        </w:tabs>
+        <w:ind w:left="2880" w:hanging="360"/>
+      </w:pPr>
+    </w:lvl>
+    <w:lvl w:ilvl="4" w:tentative="1">
+      <w:start w:val="1"/>
+      <w:numFmt w:val="decimal"/>
+      <w:lvlText w:val="%5."/>
+      <w:lvlJc w:val="left"/>
+      <w:pPr>
+        <w:tabs>
+          <w:tab w:val="num" w:pos="3600"/>
+        </w:tabs>
+        <w:ind w:left="3600" w:hanging="360"/>
+      </w:pPr>
+    </w:lvl>
+    <w:lvl w:ilvl="5" w:tentative="1">
+      <w:start w:val="1"/>
+      <w:numFmt w:val="decimal"/>
+      <w:lvlText w:val="%6."/>
+      <w:lvlJc w:val="left"/>
+      <w:pPr>
+        <w:tabs>
+          <w:tab w:val="num" w:pos="4320"/>
+        </w:tabs>
+        <w:ind w:left="4320" w:hanging="360"/>
+      </w:pPr>
+    </w:lvl>
+    <w:lvl w:ilvl="6" w:tentative="1">
+      <w:start w:val="1"/>
+      <w:numFmt w:val="decimal"/>
+      <w:lvlText w:val="%7."/>
+      <w:lvlJc w:val="left"/>
+      <w:pPr>
+        <w:tabs>
+          <w:tab w:val="num" w:pos="5040"/>
+        </w:tabs>
+        <w:ind w:left="5040" w:hanging="360"/>
+      </w:pPr>
+    </w:lvl>
+    <w:lvl w:ilvl="7" w:tentative="1">
+      <w:start w:val="1"/>
+      <w:numFmt w:val="decimal"/>
+      <w:lvlText w:val="%8."/>
+      <w:lvlJc w:val="left"/>
+      <w:pPr>
+        <w:tabs>
+          <w:tab w:val="num" w:pos="5760"/>
+        </w:tabs>
+        <w:ind w:left="5760" w:hanging="360"/>
+      </w:pPr>
+    </w:lvl>
+    <w:lvl w:ilvl="8" w:tentative="1">
+      <w:start w:val="1"/>
+      <w:numFmt w:val="decimal"/>
+      <w:lvlText w:val="%9."/>
+      <w:lvlJc w:val="left"/>
+      <w:pPr>
+        <w:tabs>
+          <w:tab w:val="num" w:pos="6480"/>
+        </w:tabs>
+        <w:ind w:left="6480" w:hanging="360"/>
+      </w:pPr>
+    </w:lvl>
+  </w:abstractNum>
+  <w:abstractNum w:abstractNumId="10" w15:restartNumberingAfterBreak="0">
+    <w:nsid w:val="53DE3B48"/>
+    <w:multiLevelType w:val="multilevel"/>
+    <w:tmpl w:val="FC8E9762"/>
+    <w:lvl w:ilvl="0">
+      <w:start w:val="1"/>
+      <w:numFmt w:val="decimal"/>
+      <w:lvlText w:val="%1."/>
+      <w:lvlJc w:val="left"/>
+      <w:pPr>
+        <w:tabs>
+          <w:tab w:val="num" w:pos="720"/>
+        </w:tabs>
+        <w:ind w:left="720" w:hanging="360"/>
+      </w:pPr>
+    </w:lvl>
+    <w:lvl w:ilvl="1">
+      <w:start w:val="1"/>
+      <w:numFmt w:val="bullet"/>
+      <w:lvlText w:val="o"/>
+      <w:lvlJc w:val="left"/>
+      <w:pPr>
+        <w:tabs>
+          <w:tab w:val="num" w:pos="1440"/>
+        </w:tabs>
+        <w:ind w:left="1440" w:hanging="360"/>
+      </w:pPr>
+      <w:rPr>
+        <w:rFonts w:ascii="Courier New" w:hAnsi="Courier New" w:hint="default"/>
+        <w:sz w:val="20"/>
+      </w:rPr>
+    </w:lvl>
+    <w:lvl w:ilvl="2">
+      <w:start w:val="1"/>
+      <w:numFmt w:val="bullet"/>
+      <w:lvlText w:val=""/>
+      <w:lvlJc w:val="left"/>
+      <w:pPr>
+        <w:tabs>
+          <w:tab w:val="num" w:pos="2160"/>
+        </w:tabs>
+        <w:ind w:left="2160" w:hanging="360"/>
+      </w:pPr>
+      <w:rPr>
+        <w:rFonts w:ascii="Symbol" w:hAnsi="Symbol" w:hint="default"/>
+        <w:sz w:val="20"/>
+      </w:rPr>
+    </w:lvl>
+    <w:lvl w:ilvl="3">
+      <w:start w:val="1"/>
+      <w:numFmt w:val="bullet"/>
+      <w:lvlText w:val=""/>
+      <w:lvlJc w:val="left"/>
+      <w:pPr>
+        <w:tabs>
+          <w:tab w:val="num" w:pos="2880"/>
+        </w:tabs>
+        <w:ind w:left="2880" w:hanging="360"/>
+      </w:pPr>
+      <w:rPr>
+        <w:rFonts w:ascii="Wingdings" w:hAnsi="Wingdings" w:hint="default"/>
+        <w:sz w:val="20"/>
+      </w:rPr>
+    </w:lvl>
+    <w:lvl w:ilvl="4" w:tentative="1">
+      <w:start w:val="1"/>
+      <w:numFmt w:val="decimal"/>
+      <w:lvlText w:val="%5."/>
+      <w:lvlJc w:val="left"/>
+      <w:pPr>
+        <w:tabs>
+          <w:tab w:val="num" w:pos="3600"/>
+        </w:tabs>
+        <w:ind w:left="3600" w:hanging="360"/>
+      </w:pPr>
+    </w:lvl>
+    <w:lvl w:ilvl="5" w:tentative="1">
+      <w:start w:val="1"/>
+      <w:numFmt w:val="decimal"/>
+      <w:lvlText w:val="%6."/>
+      <w:lvlJc w:val="left"/>
+      <w:pPr>
+        <w:tabs>
+          <w:tab w:val="num" w:pos="4320"/>
+        </w:tabs>
+        <w:ind w:left="4320" w:hanging="360"/>
+      </w:pPr>
+    </w:lvl>
+    <w:lvl w:ilvl="6" w:tentative="1">
+      <w:start w:val="1"/>
+      <w:numFmt w:val="decimal"/>
+      <w:lvlText w:val="%7."/>
+      <w:lvlJc w:val="left"/>
+      <w:pPr>
+        <w:tabs>
+          <w:tab w:val="num" w:pos="5040"/>
+        </w:tabs>
+        <w:ind w:left="5040" w:hanging="360"/>
+      </w:pPr>
+    </w:lvl>
+    <w:lvl w:ilvl="7" w:tentative="1">
+      <w:start w:val="1"/>
+      <w:numFmt w:val="decimal"/>
+      <w:lvlText w:val="%8."/>
+      <w:lvlJc w:val="left"/>
+      <w:pPr>
+        <w:tabs>
+          <w:tab w:val="num" w:pos="5760"/>
+        </w:tabs>
+        <w:ind w:left="5760" w:hanging="360"/>
+      </w:pPr>
+    </w:lvl>
+    <w:lvl w:ilvl="8" w:tentative="1">
+      <w:start w:val="1"/>
+      <w:numFmt w:val="decimal"/>
+      <w:lvlText w:val="%9."/>
+      <w:lvlJc w:val="left"/>
+      <w:pPr>
+        <w:tabs>
+          <w:tab w:val="num" w:pos="6480"/>
+        </w:tabs>
+        <w:ind w:left="6480" w:hanging="360"/>
+      </w:pPr>
+    </w:lvl>
+  </w:abstractNum>
+  <w:abstractNum w:abstractNumId="11" w15:restartNumberingAfterBreak="0">
+    <w:nsid w:val="586270B3"/>
+    <w:multiLevelType w:val="multilevel"/>
+    <w:tmpl w:val="8C8A0E9E"/>
+    <w:lvl w:ilvl="0">
+      <w:start w:val="1"/>
+      <w:numFmt w:val="decimal"/>
+      <w:lvlText w:val="%1."/>
+      <w:lvlJc w:val="left"/>
+      <w:pPr>
+        <w:tabs>
+          <w:tab w:val="num" w:pos="720"/>
+        </w:tabs>
+        <w:ind w:left="720" w:hanging="360"/>
+      </w:pPr>
+    </w:lvl>
+    <w:lvl w:ilvl="1">
+      <w:start w:val="1"/>
+      <w:numFmt w:val="bullet"/>
+      <w:lvlText w:val="o"/>
+      <w:lvlJc w:val="left"/>
+      <w:pPr>
+        <w:tabs>
+          <w:tab w:val="num" w:pos="1440"/>
+        </w:tabs>
+        <w:ind w:left="1440" w:hanging="360"/>
+      </w:pPr>
+      <w:rPr>
+        <w:rFonts w:ascii="Courier New" w:hAnsi="Courier New" w:hint="default"/>
+        <w:sz w:val="20"/>
+      </w:rPr>
+    </w:lvl>
+    <w:lvl w:ilvl="2">
+      <w:start w:val="1"/>
+      <w:numFmt w:val="bullet"/>
+      <w:lvlText w:val=""/>
+      <w:lvlJc w:val="left"/>
+      <w:pPr>
+        <w:tabs>
+          <w:tab w:val="num" w:pos="2160"/>
+        </w:tabs>
+        <w:ind w:left="2160" w:hanging="360"/>
+      </w:pPr>
+      <w:rPr>
+        <w:rFonts w:ascii="Symbol" w:hAnsi="Symbol" w:hint="default"/>
+        <w:sz w:val="20"/>
+      </w:rPr>
+    </w:lvl>
+    <w:lvl w:ilvl="3" w:tentative="1">
+      <w:start w:val="1"/>
+      <w:numFmt w:val="decimal"/>
+      <w:lvlText w:val="%4."/>
+      <w:lvlJc w:val="left"/>
+      <w:pPr>
+        <w:tabs>
+          <w:tab w:val="num" w:pos="2880"/>
+        </w:tabs>
+        <w:ind w:left="2880" w:hanging="360"/>
+      </w:pPr>
+    </w:lvl>
+    <w:lvl w:ilvl="4" w:tentative="1">
+      <w:start w:val="1"/>
+      <w:numFmt w:val="decimal"/>
+      <w:lvlText w:val="%5."/>
+      <w:lvlJc w:val="left"/>
+      <w:pPr>
+        <w:tabs>
+          <w:tab w:val="num" w:pos="3600"/>
+        </w:tabs>
+        <w:ind w:left="3600" w:hanging="360"/>
+      </w:pPr>
+    </w:lvl>
+    <w:lvl w:ilvl="5" w:tentative="1">
+      <w:start w:val="1"/>
+      <w:numFmt w:val="decimal"/>
+      <w:lvlText w:val="%6."/>
+      <w:lvlJc w:val="left"/>
+      <w:pPr>
+        <w:tabs>
+          <w:tab w:val="num" w:pos="4320"/>
+        </w:tabs>
+        <w:ind w:left="4320" w:hanging="360"/>
+      </w:pPr>
+    </w:lvl>
+    <w:lvl w:ilvl="6" w:tentative="1">
+      <w:start w:val="1"/>
+      <w:numFmt w:val="decimal"/>
+      <w:lvlText w:val="%7."/>
+      <w:lvlJc w:val="left"/>
+      <w:pPr>
+        <w:tabs>
+          <w:tab w:val="num" w:pos="5040"/>
+        </w:tabs>
+        <w:ind w:left="5040" w:hanging="360"/>
+      </w:pPr>
+    </w:lvl>
+    <w:lvl w:ilvl="7" w:tentative="1">
+      <w:start w:val="1"/>
+      <w:numFmt w:val="decimal"/>
+      <w:lvlText w:val="%8."/>
+      <w:lvlJc w:val="left"/>
+      <w:pPr>
+        <w:tabs>
+          <w:tab w:val="num" w:pos="5760"/>
+        </w:tabs>
+        <w:ind w:left="5760" w:hanging="360"/>
+      </w:pPr>
+    </w:lvl>
+    <w:lvl w:ilvl="8" w:tentative="1">
+      <w:start w:val="1"/>
+      <w:numFmt w:val="decimal"/>
+      <w:lvlText w:val="%9."/>
+      <w:lvlJc w:val="left"/>
+      <w:pPr>
+        <w:tabs>
+          <w:tab w:val="num" w:pos="6480"/>
+        </w:tabs>
+        <w:ind w:left="6480" w:hanging="360"/>
+      </w:pPr>
+    </w:lvl>
+  </w:abstractNum>
+  <w:abstractNum w:abstractNumId="12" w15:restartNumberingAfterBreak="0">
     <w:nsid w:val="6544398A"/>
     <w:multiLevelType w:val="multilevel"/>
     <w:tmpl w:val="33D860BE"/>
@@ -15219,7 +15742,7 @@
       </w:rPr>
     </w:lvl>
   </w:abstractNum>
-  <w:abstractNum w:abstractNumId="8" w15:restartNumberingAfterBreak="0">
+  <w:abstractNum w:abstractNumId="13" w15:restartNumberingAfterBreak="0">
     <w:nsid w:val="6E4A6323"/>
     <w:multiLevelType w:val="multilevel"/>
     <w:tmpl w:val="FC2CE164"/>
@@ -15368,7 +15891,7 @@
       </w:rPr>
     </w:lvl>
   </w:abstractNum>
-  <w:abstractNum w:abstractNumId="9" w15:restartNumberingAfterBreak="0">
+  <w:abstractNum w:abstractNumId="14" w15:restartNumberingAfterBreak="0">
     <w:nsid w:val="7D283401"/>
     <w:multiLevelType w:val="multilevel"/>
     <w:tmpl w:val="7B2CC87A"/>
@@ -15518,13 +16041,13 @@
     </w:lvl>
   </w:abstractNum>
   <w:num w:numId="1" w16cid:durableId="1625233335">
-    <w:abstractNumId w:val="5"/>
+    <w:abstractNumId w:val="6"/>
   </w:num>
   <w:num w:numId="2" w16cid:durableId="1421364274">
-    <w:abstractNumId w:val="9"/>
+    <w:abstractNumId w:val="14"/>
   </w:num>
   <w:num w:numId="3" w16cid:durableId="550532365">
-    <w:abstractNumId w:val="8"/>
+    <w:abstractNumId w:val="13"/>
   </w:num>
   <w:num w:numId="4" w16cid:durableId="963272197">
     <w:abstractNumId w:val="0"/>
@@ -15533,13 +16056,13 @@
     </w:lvlOverride>
   </w:num>
   <w:num w:numId="5" w16cid:durableId="1933584062">
-    <w:abstractNumId w:val="7"/>
+    <w:abstractNumId w:val="12"/>
   </w:num>
   <w:num w:numId="6" w16cid:durableId="724834537">
     <w:abstractNumId w:val="1"/>
   </w:num>
   <w:num w:numId="7" w16cid:durableId="232668361">
-    <w:abstractNumId w:val="4"/>
+    <w:abstractNumId w:val="5"/>
   </w:num>
   <w:num w:numId="8" w16cid:durableId="2045520129">
     <w:abstractNumId w:val="3"/>
@@ -15551,9 +16074,39 @@
     </w:lvlOverride>
   </w:num>
   <w:num w:numId="10" w16cid:durableId="1406948550">
-    <w:abstractNumId w:val="6"/>
+    <w:abstractNumId w:val="8"/>
     <w:lvlOverride w:ilvl="0">
       <w:startOverride w:val="1"/>
+    </w:lvlOverride>
+  </w:num>
+  <w:num w:numId="11" w16cid:durableId="460808568">
+    <w:abstractNumId w:val="11"/>
+    <w:lvlOverride w:ilvl="0">
+      <w:startOverride w:val="1"/>
+    </w:lvlOverride>
+  </w:num>
+  <w:num w:numId="12" w16cid:durableId="233244041">
+    <w:abstractNumId w:val="10"/>
+    <w:lvlOverride w:ilvl="0">
+      <w:startOverride w:val="1"/>
+    </w:lvlOverride>
+  </w:num>
+  <w:num w:numId="13" w16cid:durableId="1987314348">
+    <w:abstractNumId w:val="4"/>
+    <w:lvlOverride w:ilvl="0">
+      <w:startOverride w:val="1"/>
+    </w:lvlOverride>
+  </w:num>
+  <w:num w:numId="14" w16cid:durableId="1746797326">
+    <w:abstractNumId w:val="9"/>
+    <w:lvlOverride w:ilvl="0">
+      <w:startOverride w:val="2"/>
+    </w:lvlOverride>
+  </w:num>
+  <w:num w:numId="15" w16cid:durableId="507017755">
+    <w:abstractNumId w:val="7"/>
+    <w:lvlOverride w:ilvl="0">
+      <w:startOverride w:val="3"/>
     </w:lvlOverride>
   </w:num>
 </w:numbering>
@@ -15959,6 +16512,7 @@
   <w:style w:type="paragraph" w:default="1" w:styleId="Normal">
     <w:name w:val="Normal"/>
     <w:qFormat/>
+    <w:rsid w:val="005F6B66"/>
   </w:style>
   <w:style w:type="paragraph" w:styleId="Heading1">
     <w:name w:val="heading 1"/>

</xml_diff>

<commit_message>
Add "Static SSR fails to use proxy domain when constructing absolute URIs" issue details
</commit_message>
<xml_diff>
--- a/Evidence/BlazorWebApp-BasePath-Validation.docx
+++ b/Evidence/BlazorWebApp-BasePath-Validation.docx
@@ -96,8 +96,13 @@
         </w:tabs>
       </w:pPr>
       <w:r>
-        <w:t>Interactive WebAssembly</w:t>
-      </w:r>
+        <w:t xml:space="preserve">Interactive </w:t>
+      </w:r>
+      <w:proofErr w:type="spellStart"/>
+      <w:r>
+        <w:t>WebAssembly</w:t>
+      </w:r>
+      <w:proofErr w:type="spellEnd"/>
     </w:p>
     <w:p>
       <w:pPr>
@@ -184,7 +189,63 @@
           <w:rPr>
             <w:rStyle w:val="Hyperlink"/>
           </w:rPr>
-          <w:t>BharatRamsf3693/BlazorWebApp-BasePath-Validation: BlazorWebApp-BasePath-Validation</w:t>
+          <w:t>BharatRamsf3693/</w:t>
+        </w:r>
+        <w:proofErr w:type="spellStart"/>
+        <w:r>
+          <w:rPr>
+            <w:rStyle w:val="Hyperlink"/>
+          </w:rPr>
+          <w:t>BlazorWebApp</w:t>
+        </w:r>
+        <w:proofErr w:type="spellEnd"/>
+        <w:r>
+          <w:rPr>
+            <w:rStyle w:val="Hyperlink"/>
+          </w:rPr>
+          <w:t>-</w:t>
+        </w:r>
+        <w:proofErr w:type="spellStart"/>
+        <w:r>
+          <w:rPr>
+            <w:rStyle w:val="Hyperlink"/>
+          </w:rPr>
+          <w:t>BasePath</w:t>
+        </w:r>
+        <w:proofErr w:type="spellEnd"/>
+        <w:r>
+          <w:rPr>
+            <w:rStyle w:val="Hyperlink"/>
+          </w:rPr>
+          <w:t xml:space="preserve">-Validation: </w:t>
+        </w:r>
+        <w:proofErr w:type="spellStart"/>
+        <w:r>
+          <w:rPr>
+            <w:rStyle w:val="Hyperlink"/>
+          </w:rPr>
+          <w:t>BlazorWebApp</w:t>
+        </w:r>
+        <w:proofErr w:type="spellEnd"/>
+        <w:r>
+          <w:rPr>
+            <w:rStyle w:val="Hyperlink"/>
+          </w:rPr>
+          <w:t>-</w:t>
+        </w:r>
+        <w:proofErr w:type="spellStart"/>
+        <w:r>
+          <w:rPr>
+            <w:rStyle w:val="Hyperlink"/>
+          </w:rPr>
+          <w:t>BasePath</w:t>
+        </w:r>
+        <w:proofErr w:type="spellEnd"/>
+        <w:r>
+          <w:rPr>
+            <w:rStyle w:val="Hyperlink"/>
+          </w:rPr>
+          <w:t>-Validation</w:t>
         </w:r>
       </w:hyperlink>
     </w:p>
@@ -442,7 +503,15 @@
             </w:r>
             <w:r>
               <w:lastRenderedPageBreak/>
-              <w:t>scripts, stylesheets and images.</w:t>
+              <w:t xml:space="preserve">scripts, </w:t>
+            </w:r>
+            <w:proofErr w:type="gramStart"/>
+            <w:r>
+              <w:t>stylesheets</w:t>
+            </w:r>
+            <w:proofErr w:type="gramEnd"/>
+            <w:r>
+              <w:t xml:space="preserve"> and images.</w:t>
             </w:r>
           </w:p>
         </w:tc>
@@ -921,8 +990,17 @@
                       <w:b/>
                       <w:bCs/>
                     </w:rPr>
-                    <w:t>Interactive WebAssembly</w:t>
-                  </w:r>
+                    <w:t xml:space="preserve">Interactive </w:t>
+                  </w:r>
+                  <w:proofErr w:type="spellStart"/>
+                  <w:r>
+                    <w:rPr>
+                      <w:b/>
+                      <w:bCs/>
+                    </w:rPr>
+                    <w:t>WebAssembly</w:t>
+                  </w:r>
+                  <w:proofErr w:type="spellEnd"/>
                 </w:p>
               </w:tc>
               <w:tc>
@@ -1263,8 +1341,17 @@
                       <w:b/>
                       <w:bCs/>
                     </w:rPr>
-                    <w:t>Interactive WebAssembly</w:t>
-                  </w:r>
+                    <w:t xml:space="preserve">Interactive </w:t>
+                  </w:r>
+                  <w:proofErr w:type="spellStart"/>
+                  <w:r>
+                    <w:rPr>
+                      <w:b/>
+                      <w:bCs/>
+                    </w:rPr>
+                    <w:t>WebAssembly</w:t>
+                  </w:r>
+                  <w:proofErr w:type="spellEnd"/>
                 </w:p>
               </w:tc>
               <w:tc>
@@ -1400,7 +1487,15 @@
           </w:tcPr>
           <w:p>
             <w:r>
-              <w:t>The rendered &lt;base href&gt; matches the prefix the app is served under, including its casing, rather than the casing the app was mounted with.</w:t>
+              <w:t xml:space="preserve">The rendered &lt;base </w:t>
+            </w:r>
+            <w:proofErr w:type="spellStart"/>
+            <w:r>
+              <w:t>href</w:t>
+            </w:r>
+            <w:proofErr w:type="spellEnd"/>
+            <w:r>
+              <w:t>&gt; matches the prefix the app is served under, including its casing, rather than the casing the app was mounted with.</w:t>
             </w:r>
           </w:p>
           <w:p>
@@ -2024,8 +2119,17 @@
                       <w:b/>
                       <w:bCs/>
                     </w:rPr>
-                    <w:t>Interactive WebAssembly</w:t>
-                  </w:r>
+                    <w:t xml:space="preserve">Interactive </w:t>
+                  </w:r>
+                  <w:proofErr w:type="spellStart"/>
+                  <w:r>
+                    <w:rPr>
+                      <w:b/>
+                      <w:bCs/>
+                    </w:rPr>
+                    <w:t>WebAssembly</w:t>
+                  </w:r>
+                  <w:proofErr w:type="spellEnd"/>
                 </w:p>
               </w:tc>
               <w:tc>
@@ -2598,6 +2702,7 @@
                     </w:rPr>
                     <w:t xml:space="preserve">Interactive </w:t>
                   </w:r>
+                  <w:proofErr w:type="spellStart"/>
                   <w:r>
                     <w:rPr>
                       <w:b/>
@@ -2606,6 +2711,7 @@
                     <w:lastRenderedPageBreak/>
                     <w:t>WebAssembly</w:t>
                   </w:r>
+                  <w:proofErr w:type="spellEnd"/>
                 </w:p>
               </w:tc>
               <w:tc>
@@ -3115,8 +3221,13 @@
                   </w:r>
                   <w:r>
                     <w:br/>
-                    <w:t>Failure reason:.</w:t>
-                  </w:r>
+                    <w:t xml:space="preserve">Failure </w:t>
+                  </w:r>
+                  <w:proofErr w:type="gramStart"/>
+                  <w:r>
+                    <w:t>reason:.</w:t>
+                  </w:r>
+                  <w:proofErr w:type="gramEnd"/>
                   <w:r>
                     <w:br/>
                     <w:t> </w:t>
@@ -3124,7 +3235,15 @@
                 </w:p>
                 <w:p>
                   <w:r>
-                    <w:t>Case Sensitivity in Proxies: Casing changes in the reverse proxy do not affect the &lt;BasePath /&gt; component of the application.</w:t>
+                    <w:t>Case Sensitivity in Proxies: Casing changes in the reverse proxy do not affect the &lt;</w:t>
+                  </w:r>
+                  <w:proofErr w:type="spellStart"/>
+                  <w:r>
+                    <w:t>BasePath</w:t>
+                  </w:r>
+                  <w:proofErr w:type="spellEnd"/>
+                  <w:r>
+                    <w:t xml:space="preserve"> /&gt; component of the application.</w:t>
                   </w:r>
                 </w:p>
                 <w:p>
@@ -3136,7 +3255,23 @@
                   </w:pPr>
                   <w:r>
                     <w:lastRenderedPageBreak/>
-                    <w:t>Proxy subpath: /StaticSsr/</w:t>
+                    <w:t xml:space="preserve">Proxy </w:t>
+                  </w:r>
+                  <w:proofErr w:type="spellStart"/>
+                  <w:r>
+                    <w:t>subpath</w:t>
+                  </w:r>
+                  <w:proofErr w:type="spellEnd"/>
+                  <w:r>
+                    <w:t>: /</w:t>
+                  </w:r>
+                  <w:proofErr w:type="spellStart"/>
+                  <w:r>
+                    <w:t>StaticSsr</w:t>
+                  </w:r>
+                  <w:proofErr w:type="spellEnd"/>
+                  <w:r>
+                    <w:t>/</w:t>
                   </w:r>
                 </w:p>
                 <w:p>
@@ -3147,7 +3282,23 @@
                     </w:numPr>
                   </w:pPr>
                   <w:r>
-                    <w:t>App subpath: /staticssr/</w:t>
+                    <w:t xml:space="preserve">App </w:t>
+                  </w:r>
+                  <w:proofErr w:type="spellStart"/>
+                  <w:r>
+                    <w:t>subpath</w:t>
+                  </w:r>
+                  <w:proofErr w:type="spellEnd"/>
+                  <w:r>
+                    <w:t>: /</w:t>
+                  </w:r>
+                  <w:proofErr w:type="spellStart"/>
+                  <w:r>
+                    <w:t>staticssr</w:t>
+                  </w:r>
+                  <w:proofErr w:type="spellEnd"/>
+                  <w:r>
+                    <w:t>/</w:t>
                   </w:r>
                 </w:p>
                 <w:p>
@@ -3158,7 +3309,47 @@
                     </w:numPr>
                   </w:pPr>
                   <w:r>
-                    <w:t>Result: The &lt;BasePath /&gt; component renders &lt;base href="/staticssr/"&gt; instead of &lt;base href="/StaticSsr/"&gt;.</w:t>
+                    <w:t>Result: The &lt;</w:t>
+                  </w:r>
+                  <w:proofErr w:type="spellStart"/>
+                  <w:r>
+                    <w:t>BasePath</w:t>
+                  </w:r>
+                  <w:proofErr w:type="spellEnd"/>
+                  <w:r>
+                    <w:t xml:space="preserve"> /&gt; component renders &lt;base </w:t>
+                  </w:r>
+                  <w:proofErr w:type="spellStart"/>
+                  <w:r>
+                    <w:t>href</w:t>
+                  </w:r>
+                  <w:proofErr w:type="spellEnd"/>
+                  <w:r>
+                    <w:t>="/</w:t>
+                  </w:r>
+                  <w:proofErr w:type="spellStart"/>
+                  <w:r>
+                    <w:t>staticssr</w:t>
+                  </w:r>
+                  <w:proofErr w:type="spellEnd"/>
+                  <w:r>
+                    <w:t xml:space="preserve">/"&gt; instead of &lt;base </w:t>
+                  </w:r>
+                  <w:proofErr w:type="spellStart"/>
+                  <w:r>
+                    <w:t>href</w:t>
+                  </w:r>
+                  <w:proofErr w:type="spellEnd"/>
+                  <w:r>
+                    <w:t>="/</w:t>
+                  </w:r>
+                  <w:proofErr w:type="spellStart"/>
+                  <w:r>
+                    <w:t>StaticSsr</w:t>
+                  </w:r>
+                  <w:proofErr w:type="spellEnd"/>
+                  <w:r>
+                    <w:t>/"&gt;.</w:t>
                   </w:r>
                 </w:p>
               </w:tc>
@@ -3423,7 +3614,15 @@
                       <w:b/>
                       <w:bCs/>
                     </w:rPr>
-                    <w:t>Interactive Web</w:t>
+                    <w:t xml:space="preserve">Interactive </w:t>
+                  </w:r>
+                  <w:proofErr w:type="spellStart"/>
+                  <w:r>
+                    <w:rPr>
+                      <w:b/>
+                      <w:bCs/>
+                    </w:rPr>
+                    <w:t>Web</w:t>
                   </w:r>
                   <w:r>
                     <w:rPr>
@@ -3433,6 +3632,7 @@
                     <w:lastRenderedPageBreak/>
                     <w:t>Assembly</w:t>
                   </w:r>
+                  <w:proofErr w:type="spellEnd"/>
                 </w:p>
               </w:tc>
               <w:tc>
@@ -3687,8 +3887,13 @@
                   </w:r>
                   <w:r>
                     <w:br/>
-                    <w:t>Failure reason:.</w:t>
-                  </w:r>
+                    <w:t xml:space="preserve">Failure </w:t>
+                  </w:r>
+                  <w:proofErr w:type="gramStart"/>
+                  <w:r>
+                    <w:t>reason:.</w:t>
+                  </w:r>
+                  <w:proofErr w:type="gramEnd"/>
                   <w:r>
                     <w:br/>
                     <w:t> </w:t>
@@ -3696,7 +3901,15 @@
                 </w:p>
                 <w:p>
                   <w:r>
-                    <w:t>Case Sensitivity in Proxies: Casing changes in the reverse proxy do not affect the &lt;BasePath /&gt; component of the application.</w:t>
+                    <w:t>Case Sensitivity in Proxies: Casing changes in the reverse proxy do not affect the &lt;</w:t>
+                  </w:r>
+                  <w:proofErr w:type="spellStart"/>
+                  <w:r>
+                    <w:t>BasePath</w:t>
+                  </w:r>
+                  <w:proofErr w:type="spellEnd"/>
+                  <w:r>
+                    <w:t xml:space="preserve"> /&gt; component of the application.</w:t>
                   </w:r>
                 </w:p>
                 <w:p>
@@ -3707,7 +3920,23 @@
                     </w:numPr>
                   </w:pPr>
                   <w:r>
-                    <w:t>Proxy subpath: /StaticSsr/</w:t>
+                    <w:t xml:space="preserve">Proxy </w:t>
+                  </w:r>
+                  <w:proofErr w:type="spellStart"/>
+                  <w:r>
+                    <w:t>subpath</w:t>
+                  </w:r>
+                  <w:proofErr w:type="spellEnd"/>
+                  <w:r>
+                    <w:t>: /</w:t>
+                  </w:r>
+                  <w:proofErr w:type="spellStart"/>
+                  <w:r>
+                    <w:t>StaticSsr</w:t>
+                  </w:r>
+                  <w:proofErr w:type="spellEnd"/>
+                  <w:r>
+                    <w:t>/</w:t>
                   </w:r>
                 </w:p>
                 <w:p>
@@ -3718,7 +3947,23 @@
                     </w:numPr>
                   </w:pPr>
                   <w:r>
-                    <w:t>App subpath: /staticssr/</w:t>
+                    <w:t xml:space="preserve">App </w:t>
+                  </w:r>
+                  <w:proofErr w:type="spellStart"/>
+                  <w:r>
+                    <w:t>subpath</w:t>
+                  </w:r>
+                  <w:proofErr w:type="spellEnd"/>
+                  <w:r>
+                    <w:t>: /</w:t>
+                  </w:r>
+                  <w:proofErr w:type="spellStart"/>
+                  <w:r>
+                    <w:t>staticssr</w:t>
+                  </w:r>
+                  <w:proofErr w:type="spellEnd"/>
+                  <w:r>
+                    <w:t>/</w:t>
                   </w:r>
                 </w:p>
                 <w:p>
@@ -3729,11 +3974,51 @@
                     </w:numPr>
                   </w:pPr>
                   <w:r>
-                    <w:t xml:space="preserve">Result: The &lt;BasePath /&gt; component renders &lt;base href="/staticssr/"&gt; </w:t>
+                    <w:t>Result: The &lt;</w:t>
+                  </w:r>
+                  <w:proofErr w:type="spellStart"/>
+                  <w:r>
+                    <w:t>BasePath</w:t>
+                  </w:r>
+                  <w:proofErr w:type="spellEnd"/>
+                  <w:r>
+                    <w:t xml:space="preserve"> /&gt; component renders &lt;base </w:t>
+                  </w:r>
+                  <w:proofErr w:type="spellStart"/>
+                  <w:r>
+                    <w:t>href</w:t>
+                  </w:r>
+                  <w:proofErr w:type="spellEnd"/>
+                  <w:r>
+                    <w:t>="/</w:t>
+                  </w:r>
+                  <w:proofErr w:type="spellStart"/>
+                  <w:r>
+                    <w:t>staticssr</w:t>
+                  </w:r>
+                  <w:proofErr w:type="spellEnd"/>
+                  <w:r>
+                    <w:t xml:space="preserve">/"&gt; </w:t>
                   </w:r>
                   <w:r>
                     <w:lastRenderedPageBreak/>
-                    <w:t>instead of &lt;base href="/StaticSsr/"&gt;.</w:t>
+                    <w:t xml:space="preserve">instead of &lt;base </w:t>
+                  </w:r>
+                  <w:proofErr w:type="spellStart"/>
+                  <w:r>
+                    <w:t>href</w:t>
+                  </w:r>
+                  <w:proofErr w:type="spellEnd"/>
+                  <w:r>
+                    <w:t>="/</w:t>
+                  </w:r>
+                  <w:proofErr w:type="spellStart"/>
+                  <w:r>
+                    <w:t>StaticSsr</w:t>
+                  </w:r>
+                  <w:proofErr w:type="spellEnd"/>
+                  <w:r>
+                    <w:t>/"&gt;.</w:t>
                   </w:r>
                 </w:p>
               </w:tc>
@@ -4002,8 +4287,17 @@
                       <w:b/>
                       <w:bCs/>
                     </w:rPr>
-                    <w:t>Interactive WebAssembly</w:t>
-                  </w:r>
+                    <w:t xml:space="preserve">Interactive </w:t>
+                  </w:r>
+                  <w:proofErr w:type="spellStart"/>
+                  <w:r>
+                    <w:rPr>
+                      <w:b/>
+                      <w:bCs/>
+                    </w:rPr>
+                    <w:t>WebAssembly</w:t>
+                  </w:r>
+                  <w:proofErr w:type="spellEnd"/>
                 </w:p>
               </w:tc>
               <w:tc>
@@ -4189,14 +4483,42 @@
                 <w:rPr>
                   <w:rStyle w:val="Hyperlink"/>
                 </w:rPr>
-                <w:t>BlazorWebApp-BasePath-Validation/Evidence/net11-new-app/ServerLog.log at main · BharatRamsf3693/BlazorWebAp</w:t>
+                <w:t>BlazorWebApp-BasePath-Validation/Evidence/net11-new-app/ServerLog.log at main · BharatRamsf3693/</w:t>
+              </w:r>
+              <w:proofErr w:type="spellStart"/>
+              <w:r>
+                <w:rPr>
+                  <w:rStyle w:val="Hyperlink"/>
+                </w:rPr>
+                <w:t>BlazorWebAp</w:t>
               </w:r>
               <w:r>
                 <w:rPr>
                   <w:rStyle w:val="Hyperlink"/>
                 </w:rPr>
                 <w:lastRenderedPageBreak/>
-                <w:t>p-BasePath-Validation</w:t>
+                <w:t>p</w:t>
+              </w:r>
+              <w:proofErr w:type="spellEnd"/>
+              <w:r>
+                <w:rPr>
+                  <w:rStyle w:val="Hyperlink"/>
+                </w:rPr>
+                <w:t>-</w:t>
+              </w:r>
+              <w:proofErr w:type="spellStart"/>
+              <w:r>
+                <w:rPr>
+                  <w:rStyle w:val="Hyperlink"/>
+                </w:rPr>
+                <w:t>BasePath</w:t>
+              </w:r>
+              <w:proofErr w:type="spellEnd"/>
+              <w:r>
+                <w:rPr>
+                  <w:rStyle w:val="Hyperlink"/>
+                </w:rPr>
+                <w:t>-Validation</w:t>
               </w:r>
             </w:hyperlink>
           </w:p>
@@ -4224,7 +4546,35 @@
                 <w:rPr>
                   <w:rStyle w:val="Hyperlink"/>
                 </w:rPr>
-                <w:t>BlazorWebApp-BasePath-Validation/Evidence/net11-new-app/ReverseProxy/ServerLog.log at main · BharatRamsf3693/BlazorWebApp-BasePath-Validation</w:t>
+                <w:t>BlazorWebApp-BasePath-Validation/Evidence/net11-new-app/ReverseProxy/ServerLog.log at main · BharatRamsf3693/</w:t>
+              </w:r>
+              <w:proofErr w:type="spellStart"/>
+              <w:r>
+                <w:rPr>
+                  <w:rStyle w:val="Hyperlink"/>
+                </w:rPr>
+                <w:t>BlazorWebApp</w:t>
+              </w:r>
+              <w:proofErr w:type="spellEnd"/>
+              <w:r>
+                <w:rPr>
+                  <w:rStyle w:val="Hyperlink"/>
+                </w:rPr>
+                <w:t>-</w:t>
+              </w:r>
+              <w:proofErr w:type="spellStart"/>
+              <w:r>
+                <w:rPr>
+                  <w:rStyle w:val="Hyperlink"/>
+                </w:rPr>
+                <w:t>BasePath</w:t>
+              </w:r>
+              <w:proofErr w:type="spellEnd"/>
+              <w:r>
+                <w:rPr>
+                  <w:rStyle w:val="Hyperlink"/>
+                </w:rPr>
+                <w:t>-Validation</w:t>
               </w:r>
             </w:hyperlink>
           </w:p>
@@ -4236,7 +4586,15 @@
               </w:rPr>
             </w:pPr>
             <w:r>
-              <w:t>Logs of Static SSR, Interactive Server, and Interactive WebAssembly samples are contained within each server log file.</w:t>
+              <w:t xml:space="preserve">Logs of Static SSR, Interactive Server, and Interactive </w:t>
+            </w:r>
+            <w:proofErr w:type="spellStart"/>
+            <w:r>
+              <w:t>WebAssembly</w:t>
+            </w:r>
+            <w:proofErr w:type="spellEnd"/>
+            <w:r>
+              <w:t xml:space="preserve"> samples are contained within each server log file.</w:t>
             </w:r>
           </w:p>
         </w:tc>
@@ -4754,8 +5112,17 @@
                       <w:b/>
                       <w:bCs/>
                     </w:rPr>
-                    <w:t>Interactive WebAssembly</w:t>
-                  </w:r>
+                    <w:t xml:space="preserve">Interactive </w:t>
+                  </w:r>
+                  <w:proofErr w:type="spellStart"/>
+                  <w:r>
+                    <w:rPr>
+                      <w:b/>
+                      <w:bCs/>
+                    </w:rPr>
+                    <w:t>WebAssembly</w:t>
+                  </w:r>
+                  <w:proofErr w:type="spellEnd"/>
                 </w:p>
               </w:tc>
               <w:tc>
@@ -5097,8 +5464,17 @@
                       <w:b/>
                       <w:bCs/>
                     </w:rPr>
-                    <w:t>Interactive WebAssembly</w:t>
-                  </w:r>
+                    <w:t xml:space="preserve">Interactive </w:t>
+                  </w:r>
+                  <w:proofErr w:type="spellStart"/>
+                  <w:r>
+                    <w:rPr>
+                      <w:b/>
+                      <w:bCs/>
+                    </w:rPr>
+                    <w:t>WebAssembly</w:t>
+                  </w:r>
+                  <w:proofErr w:type="spellEnd"/>
                 </w:p>
               </w:tc>
               <w:tc>
@@ -5696,8 +6072,17 @@
                       <w:b/>
                       <w:bCs/>
                     </w:rPr>
-                    <w:t>Interactive WebAssembly</w:t>
-                  </w:r>
+                    <w:t xml:space="preserve">Interactive </w:t>
+                  </w:r>
+                  <w:proofErr w:type="spellStart"/>
+                  <w:r>
+                    <w:rPr>
+                      <w:b/>
+                      <w:bCs/>
+                    </w:rPr>
+                    <w:t>WebAssembly</w:t>
+                  </w:r>
+                  <w:proofErr w:type="spellEnd"/>
                 </w:p>
               </w:tc>
               <w:tc>
@@ -6038,8 +6423,17 @@
                       <w:b/>
                       <w:bCs/>
                     </w:rPr>
-                    <w:t>Interactive WebAssembly</w:t>
-                  </w:r>
+                    <w:t xml:space="preserve">Interactive </w:t>
+                  </w:r>
+                  <w:proofErr w:type="spellStart"/>
+                  <w:r>
+                    <w:rPr>
+                      <w:b/>
+                      <w:bCs/>
+                    </w:rPr>
+                    <w:t>WebAssembly</w:t>
+                  </w:r>
+                  <w:proofErr w:type="spellEnd"/>
                 </w:p>
               </w:tc>
               <w:tc>
@@ -6637,8 +7031,17 @@
                       <w:b/>
                       <w:bCs/>
                     </w:rPr>
-                    <w:t>Interactive WebAssembly</w:t>
-                  </w:r>
+                    <w:t xml:space="preserve">Interactive </w:t>
+                  </w:r>
+                  <w:proofErr w:type="spellStart"/>
+                  <w:r>
+                    <w:rPr>
+                      <w:b/>
+                      <w:bCs/>
+                    </w:rPr>
+                    <w:t>WebAssembly</w:t>
+                  </w:r>
+                  <w:proofErr w:type="spellEnd"/>
                 </w:p>
               </w:tc>
               <w:tc>
@@ -6979,8 +7382,17 @@
                       <w:b/>
                       <w:bCs/>
                     </w:rPr>
-                    <w:t>Interactive WebAssembly</w:t>
-                  </w:r>
+                    <w:t xml:space="preserve">Interactive </w:t>
+                  </w:r>
+                  <w:proofErr w:type="spellStart"/>
+                  <w:r>
+                    <w:rPr>
+                      <w:b/>
+                      <w:bCs/>
+                    </w:rPr>
+                    <w:t>WebAssembly</w:t>
+                  </w:r>
+                  <w:proofErr w:type="spellEnd"/>
                 </w:p>
               </w:tc>
               <w:tc>
@@ -7586,8 +7998,17 @@
                       <w:b/>
                       <w:bCs/>
                     </w:rPr>
-                    <w:t>Interactive WebAssembly</w:t>
-                  </w:r>
+                    <w:t xml:space="preserve">Interactive </w:t>
+                  </w:r>
+                  <w:proofErr w:type="spellStart"/>
+                  <w:r>
+                    <w:rPr>
+                      <w:b/>
+                      <w:bCs/>
+                    </w:rPr>
+                    <w:t>WebAssembly</w:t>
+                  </w:r>
+                  <w:proofErr w:type="spellEnd"/>
                 </w:p>
               </w:tc>
               <w:tc>
@@ -7928,8 +8349,17 @@
                       <w:b/>
                       <w:bCs/>
                     </w:rPr>
-                    <w:t>Interactive WebAssembly</w:t>
-                  </w:r>
+                    <w:t xml:space="preserve">Interactive </w:t>
+                  </w:r>
+                  <w:proofErr w:type="spellStart"/>
+                  <w:r>
+                    <w:rPr>
+                      <w:b/>
+                      <w:bCs/>
+                    </w:rPr>
+                    <w:t>WebAssembly</w:t>
+                  </w:r>
+                  <w:proofErr w:type="spellEnd"/>
                 </w:p>
               </w:tc>
               <w:tc>
@@ -8545,8 +8975,17 @@
                       <w:b/>
                       <w:bCs/>
                     </w:rPr>
-                    <w:t>Interactive WebAssembly</w:t>
-                  </w:r>
+                    <w:t xml:space="preserve">Interactive </w:t>
+                  </w:r>
+                  <w:proofErr w:type="spellStart"/>
+                  <w:r>
+                    <w:rPr>
+                      <w:b/>
+                      <w:bCs/>
+                    </w:rPr>
+                    <w:t>WebAssembly</w:t>
+                  </w:r>
+                  <w:proofErr w:type="spellEnd"/>
                 </w:p>
               </w:tc>
               <w:tc>
@@ -8887,8 +9326,17 @@
                       <w:b/>
                       <w:bCs/>
                     </w:rPr>
-                    <w:t>Interactive WebAssembly</w:t>
-                  </w:r>
+                    <w:t xml:space="preserve">Interactive </w:t>
+                  </w:r>
+                  <w:proofErr w:type="spellStart"/>
+                  <w:r>
+                    <w:rPr>
+                      <w:b/>
+                      <w:bCs/>
+                    </w:rPr>
+                    <w:t>WebAssembly</w:t>
+                  </w:r>
+                  <w:proofErr w:type="spellEnd"/>
                 </w:p>
               </w:tc>
               <w:tc>
@@ -9016,7 +9464,15 @@
           </w:tcPr>
           <w:p>
             <w:r>
-              <w:t>A page that shows a URL it built itself from a relative path.</w:t>
+              <w:t xml:space="preserve">A page that shows a </w:t>
+            </w:r>
+            <w:proofErr w:type="gramStart"/>
+            <w:r>
+              <w:t>URL it</w:t>
+            </w:r>
+            <w:proofErr w:type="gramEnd"/>
+            <w:r>
+              <w:t xml:space="preserve"> built itself from a relative path.</w:t>
             </w:r>
           </w:p>
         </w:tc>
@@ -9562,8 +10018,17 @@
                       <w:b/>
                       <w:bCs/>
                     </w:rPr>
-                    <w:t>Interactive WebAssembly</w:t>
-                  </w:r>
+                    <w:t xml:space="preserve">Interactive </w:t>
+                  </w:r>
+                  <w:proofErr w:type="spellStart"/>
+                  <w:r>
+                    <w:rPr>
+                      <w:b/>
+                      <w:bCs/>
+                    </w:rPr>
+                    <w:t>WebAssembly</w:t>
+                  </w:r>
+                  <w:proofErr w:type="spellEnd"/>
                 </w:p>
               </w:tc>
               <w:tc>
@@ -9987,8 +10452,17 @@
                       <w:b/>
                       <w:bCs/>
                     </w:rPr>
-                    <w:t>Interactive WebAssembly</w:t>
-                  </w:r>
+                    <w:t xml:space="preserve">Interactive </w:t>
+                  </w:r>
+                  <w:proofErr w:type="spellStart"/>
+                  <w:r>
+                    <w:rPr>
+                      <w:b/>
+                      <w:bCs/>
+                    </w:rPr>
+                    <w:t>WebAssembly</w:t>
+                  </w:r>
+                  <w:proofErr w:type="spellEnd"/>
                 </w:p>
               </w:tc>
               <w:tc>
@@ -10506,8 +10980,17 @@
                       <w:b/>
                       <w:bCs/>
                     </w:rPr>
-                    <w:t>Interactive WebAssembly</w:t>
-                  </w:r>
+                    <w:t xml:space="preserve">Interactive </w:t>
+                  </w:r>
+                  <w:proofErr w:type="spellStart"/>
+                  <w:r>
+                    <w:rPr>
+                      <w:b/>
+                      <w:bCs/>
+                    </w:rPr>
+                    <w:t>WebAssembly</w:t>
+                  </w:r>
+                  <w:proofErr w:type="spellEnd"/>
                 </w:p>
               </w:tc>
               <w:tc>
@@ -10788,8 +11271,17 @@
                       <w:b/>
                       <w:bCs/>
                     </w:rPr>
-                    <w:t>Interactive WebAssembly</w:t>
-                  </w:r>
+                    <w:t xml:space="preserve">Interactive </w:t>
+                  </w:r>
+                  <w:proofErr w:type="spellStart"/>
+                  <w:r>
+                    <w:rPr>
+                      <w:b/>
+                      <w:bCs/>
+                    </w:rPr>
+                    <w:t>WebAssembly</w:t>
+                  </w:r>
+                  <w:proofErr w:type="spellEnd"/>
                 </w:p>
               </w:tc>
               <w:tc>
@@ -10853,8 +11345,16 @@
                 <w:rPr>
                   <w:rStyle w:val="Hyperlink"/>
                 </w:rPr>
-                <w:t>Evidence/net11-new-app/WithChangedSubpath</w:t>
+                <w:t>Evidence/net11-new-app/</w:t>
               </w:r>
+              <w:proofErr w:type="spellStart"/>
+              <w:r>
+                <w:rPr>
+                  <w:rStyle w:val="Hyperlink"/>
+                </w:rPr>
+                <w:t>WithChangedSubpath</w:t>
+              </w:r>
+              <w:proofErr w:type="spellEnd"/>
             </w:hyperlink>
             <w:r>
               <w:br/>
@@ -10877,15 +11377,31 @@
                   <w:rStyle w:val="Hyperlink"/>
                 </w:rPr>
                 <w:lastRenderedPageBreak/>
-                <w:t>to-net11-upgrade/WithChangedSubpath</w:t>
+                <w:t>to-net11-upgrade/</w:t>
               </w:r>
+              <w:proofErr w:type="spellStart"/>
+              <w:r>
+                <w:rPr>
+                  <w:rStyle w:val="Hyperlink"/>
+                </w:rPr>
+                <w:t>WithChangedSubpath</w:t>
+              </w:r>
+              <w:proofErr w:type="spellEnd"/>
             </w:hyperlink>
             <w:r>
               <w:br/>
             </w:r>
             <w:r>
               <w:br/>
-              <w:t>Note: Extracting the files under the above locations provide the verification logs for the corresponding render mode. It includes a video recording tracking the first 10 testing scenarios alongside a complete network log (.har file)</w:t>
+              <w:t>Note: Extracting the files under the above locations provide the verification logs for the corresponding render mode. It includes a video recording tracking the first 10 testing scenarios alongside a complete network log (.</w:t>
+            </w:r>
+            <w:proofErr w:type="spellStart"/>
+            <w:r>
+              <w:t>har</w:t>
+            </w:r>
+            <w:proofErr w:type="spellEnd"/>
+            <w:r>
+              <w:t xml:space="preserve"> file)</w:t>
             </w:r>
           </w:p>
         </w:tc>
@@ -10934,7 +11450,33 @@
           </w:tcPr>
           <w:p>
             <w:r>
-              <w:t xml:space="preserve">An app upgraded from .NET 10, which still has a literal &lt;base href="/" /&gt;, before and after swapping in &lt;BasePath /&gt;. The component lives in Microsoft.AspNetCore.Components.Endpoints, which the .NET </w:t>
+              <w:t xml:space="preserve">An app upgraded from .NET 10, which still has a literal &lt;base </w:t>
+            </w:r>
+            <w:proofErr w:type="spellStart"/>
+            <w:r>
+              <w:t>href</w:t>
+            </w:r>
+            <w:proofErr w:type="spellEnd"/>
+            <w:r>
+              <w:t>="/" /&gt;, before and after swapping in &lt;</w:t>
+            </w:r>
+            <w:proofErr w:type="spellStart"/>
+            <w:r>
+              <w:t>BasePath</w:t>
+            </w:r>
+            <w:proofErr w:type="spellEnd"/>
+            <w:r>
+              <w:t xml:space="preserve"> /&gt;. The component lives in </w:t>
+            </w:r>
+            <w:proofErr w:type="spellStart"/>
+            <w:proofErr w:type="gramStart"/>
+            <w:r>
+              <w:t>Microsoft.AspNetCore.Components.Endpoints</w:t>
+            </w:r>
+            <w:proofErr w:type="spellEnd"/>
+            <w:proofErr w:type="gramEnd"/>
+            <w:r>
+              <w:t xml:space="preserve">, which the .NET </w:t>
             </w:r>
             <w:r>
               <w:lastRenderedPageBreak/>
@@ -11190,7 +11732,33 @@
                 </w:p>
                 <w:p>
                   <w:r>
-                    <w:t xml:space="preserve">No build errors are encountered when @using Microsoft.AspNetCore.Components.Endpoints is not added; the app is launched successfully with elements </w:t>
+                    <w:t xml:space="preserve">No build errors are encountered </w:t>
+                  </w:r>
+                  <w:proofErr w:type="gramStart"/>
+                  <w:r>
+                    <w:t>when @</w:t>
+                  </w:r>
+                  <w:proofErr w:type="gramEnd"/>
+                  <w:r>
+                    <w:t xml:space="preserve">using </w:t>
+                  </w:r>
+                  <w:proofErr w:type="spellStart"/>
+                  <w:proofErr w:type="gramStart"/>
+                  <w:r>
+                    <w:t>Microsoft.AspNetCore.Components.Endpoints</w:t>
+                  </w:r>
+                  <w:proofErr w:type="spellEnd"/>
+                  <w:proofErr w:type="gramEnd"/>
+                  <w:r>
+                    <w:t xml:space="preserve"> </w:t>
+                  </w:r>
+                  <w:proofErr w:type="gramStart"/>
+                  <w:r>
+                    <w:t>is</w:t>
+                  </w:r>
+                  <w:proofErr w:type="gramEnd"/>
+                  <w:r>
+                    <w:t xml:space="preserve"> not added; the app is launched successfully with elements </w:t>
                   </w:r>
                   <w:r>
                     <w:lastRenderedPageBreak/>
@@ -11298,7 +11866,33 @@
                 </w:p>
                 <w:p>
                   <w:r>
-                    <w:t>No build errors are encountered when @using Microsoft.AspNetCore.Components.Endpoints is not added; the app is launched successfully with elements missing from the Head element.</w:t>
+                    <w:t xml:space="preserve">No build errors are encountered </w:t>
+                  </w:r>
+                  <w:proofErr w:type="gramStart"/>
+                  <w:r>
+                    <w:t>when @</w:t>
+                  </w:r>
+                  <w:proofErr w:type="gramEnd"/>
+                  <w:r>
+                    <w:t xml:space="preserve">using </w:t>
+                  </w:r>
+                  <w:proofErr w:type="spellStart"/>
+                  <w:proofErr w:type="gramStart"/>
+                  <w:r>
+                    <w:t>Microsoft.AspNetCore.Components.Endpoints</w:t>
+                  </w:r>
+                  <w:proofErr w:type="spellEnd"/>
+                  <w:proofErr w:type="gramEnd"/>
+                  <w:r>
+                    <w:t xml:space="preserve"> </w:t>
+                  </w:r>
+                  <w:proofErr w:type="gramStart"/>
+                  <w:r>
+                    <w:t>is</w:t>
+                  </w:r>
+                  <w:proofErr w:type="gramEnd"/>
+                  <w:r>
+                    <w:t xml:space="preserve"> not added; the app is launched successfully with elements missing from the Head element.</w:t>
                   </w:r>
                 </w:p>
               </w:tc>
@@ -11366,8 +11960,17 @@
                       <w:b/>
                       <w:bCs/>
                     </w:rPr>
-                    <w:t>Interactive WebAssembly</w:t>
-                  </w:r>
+                    <w:t xml:space="preserve">Interactive </w:t>
+                  </w:r>
+                  <w:proofErr w:type="spellStart"/>
+                  <w:r>
+                    <w:rPr>
+                      <w:b/>
+                      <w:bCs/>
+                    </w:rPr>
+                    <w:t>WebAssembly</w:t>
+                  </w:r>
+                  <w:proofErr w:type="spellEnd"/>
                 </w:p>
               </w:tc>
               <w:tc>
@@ -11401,7 +12004,33 @@
                 </w:p>
                 <w:p>
                   <w:r>
-                    <w:t>No build errors are encountered when @using Microsoft.AspNetCore.Components.Endpoints is not added; the app is launched successfully with elements missing from the Head element.</w:t>
+                    <w:t xml:space="preserve">No build errors are encountered </w:t>
+                  </w:r>
+                  <w:proofErr w:type="gramStart"/>
+                  <w:r>
+                    <w:t>when @</w:t>
+                  </w:r>
+                  <w:proofErr w:type="gramEnd"/>
+                  <w:r>
+                    <w:t xml:space="preserve">using </w:t>
+                  </w:r>
+                  <w:proofErr w:type="spellStart"/>
+                  <w:proofErr w:type="gramStart"/>
+                  <w:r>
+                    <w:t>Microsoft.AspNetCore.Components.Endpoints</w:t>
+                  </w:r>
+                  <w:proofErr w:type="spellEnd"/>
+                  <w:proofErr w:type="gramEnd"/>
+                  <w:r>
+                    <w:t xml:space="preserve"> </w:t>
+                  </w:r>
+                  <w:proofErr w:type="gramStart"/>
+                  <w:r>
+                    <w:t>is</w:t>
+                  </w:r>
+                  <w:proofErr w:type="gramEnd"/>
+                  <w:r>
+                    <w:t xml:space="preserve"> not added; the app is launched successfully with elements missing from the Head element.</w:t>
                   </w:r>
                 </w:p>
               </w:tc>
@@ -11502,7 +12131,21 @@
                 <w:rPr>
                   <w:rStyle w:val="Hyperlink"/>
                 </w:rPr>
-                <w:t>New BasePath compo</w:t>
+                <w:t xml:space="preserve">New </w:t>
+              </w:r>
+              <w:proofErr w:type="spellStart"/>
+              <w:r>
+                <w:rPr>
+                  <w:rStyle w:val="Hyperlink"/>
+                </w:rPr>
+                <w:t>BasePath</w:t>
+              </w:r>
+              <w:proofErr w:type="spellEnd"/>
+              <w:r>
+                <w:rPr>
+                  <w:rStyle w:val="Hyperlink"/>
+                </w:rPr>
+                <w:t xml:space="preserve"> compo</w:t>
               </w:r>
               <w:r>
                 <w:rPr>
@@ -11542,11 +12185,27 @@
               </w:rPr>
             </w:pPr>
             <w:r>
-              <w:t xml:space="preserve">The base path page presents &lt;BasePath /&gt; as the first option for a Blazor Web App, but it does not mention that the component preserves the </w:t>
+              <w:t>The base path page presents &lt;</w:t>
+            </w:r>
+            <w:proofErr w:type="spellStart"/>
+            <w:r>
+              <w:t>BasePath</w:t>
+            </w:r>
+            <w:proofErr w:type="spellEnd"/>
+            <w:r>
+              <w:t xml:space="preserve"> /&gt; as the first option for a Blazor Web App, but it does not mention that the component preserves the </w:t>
             </w:r>
             <w:r>
               <w:lastRenderedPageBreak/>
-              <w:t>casing of the requested path, which is the behavior this scenario is mainly about, and it does not mention the namespace the component lives in. Say so in the report if either gap cost you time.</w:t>
+              <w:t xml:space="preserve">casing of the requested path, which is the behavior this scenario is mainly about, and it does not mention the namespace the component lives in. Say so in the report if either gap </w:t>
+            </w:r>
+            <w:proofErr w:type="gramStart"/>
+            <w:r>
+              <w:t>cost</w:t>
+            </w:r>
+            <w:proofErr w:type="gramEnd"/>
+            <w:r>
+              <w:t xml:space="preserve"> you time.</w:t>
             </w:r>
           </w:p>
         </w:tc>
@@ -11680,10 +12339,34 @@
           <w:b/>
           <w:bCs/>
         </w:rPr>
-        <w:t xml:space="preserve">IIS Deployment (.zip): </w:t>
-      </w:r>
-      <w:r>
-        <w:t>Extracting this file provides the verification logs for the corresponding render mode. It includes a video recording tracking the first 10 testing scenarios alongside a complete network log (.har file).</w:t>
+        <w:t xml:space="preserve">IIS </w:t>
+      </w:r>
+      <w:proofErr w:type="gramStart"/>
+      <w:r>
+        <w:rPr>
+          <w:b/>
+          <w:bCs/>
+        </w:rPr>
+        <w:t>Deployment (.</w:t>
+      </w:r>
+      <w:proofErr w:type="gramEnd"/>
+      <w:r>
+        <w:rPr>
+          <w:b/>
+          <w:bCs/>
+        </w:rPr>
+        <w:t xml:space="preserve">zip): </w:t>
+      </w:r>
+      <w:r>
+        <w:t>Extracting this file provides the verification logs for the corresponding render mode. It includes a video recording tracking the first 10 testing scenarios alongside a complete network log (.</w:t>
+      </w:r>
+      <w:proofErr w:type="spellStart"/>
+      <w:r>
+        <w:t>har</w:t>
+      </w:r>
+      <w:proofErr w:type="spellEnd"/>
+      <w:r>
+        <w:t xml:space="preserve"> file).</w:t>
       </w:r>
     </w:p>
     <w:p>
@@ -11702,10 +12385,42 @@
           <w:b/>
           <w:bCs/>
         </w:rPr>
-        <w:t xml:space="preserve">Deployed Behind Proxy (.zip): </w:t>
-      </w:r>
-      <w:r>
-        <w:t>Extracting this file provides the proxy validation evidence. It includes a video recording tracking the first 9 testing scenarios, the reverse proxy routing rules (web.config), and a complete network log (.har file).</w:t>
+        <w:t xml:space="preserve">Deployed Behind </w:t>
+      </w:r>
+      <w:proofErr w:type="gramStart"/>
+      <w:r>
+        <w:rPr>
+          <w:b/>
+          <w:bCs/>
+        </w:rPr>
+        <w:t>Proxy (.</w:t>
+      </w:r>
+      <w:proofErr w:type="gramEnd"/>
+      <w:r>
+        <w:rPr>
+          <w:b/>
+          <w:bCs/>
+        </w:rPr>
+        <w:t xml:space="preserve">zip): </w:t>
+      </w:r>
+      <w:r>
+        <w:t>Extracting this file provides the proxy validation evidence. It includes a video recording tracking the first 9 testing scenarios, the reverse proxy routing rules (</w:t>
+      </w:r>
+      <w:proofErr w:type="spellStart"/>
+      <w:r>
+        <w:t>web.config</w:t>
+      </w:r>
+      <w:proofErr w:type="spellEnd"/>
+      <w:r>
+        <w:t>), and a complete network log (.</w:t>
+      </w:r>
+      <w:proofErr w:type="spellStart"/>
+      <w:r>
+        <w:t>har</w:t>
+      </w:r>
+      <w:proofErr w:type="spellEnd"/>
+      <w:r>
+        <w:t xml:space="preserve"> file).</w:t>
       </w:r>
     </w:p>
     <w:p>
@@ -11842,7 +12557,23 @@
                 <w:b/>
                 <w:bCs/>
               </w:rPr>
-              <w:t>IIS Deployment (With Subpath)</w:t>
+              <w:t xml:space="preserve">IIS Deployment (With </w:t>
+            </w:r>
+            <w:proofErr w:type="spellStart"/>
+            <w:r>
+              <w:rPr>
+                <w:b/>
+                <w:bCs/>
+              </w:rPr>
+              <w:t>Subpath</w:t>
+            </w:r>
+            <w:proofErr w:type="spellEnd"/>
+            <w:r>
+              <w:rPr>
+                <w:b/>
+                <w:bCs/>
+              </w:rPr>
+              <w:t>)</w:t>
             </w:r>
           </w:p>
         </w:tc>
@@ -11979,7 +12710,21 @@
                 <w:rPr>
                   <w:rStyle w:val="Hyperlink"/>
                 </w:rPr>
-                <w:t>Evidence/net11-new-app/WithSubpath/StaticSSR.zip</w:t>
+                <w:t>Evidence/net11-new-app/</w:t>
+              </w:r>
+              <w:proofErr w:type="spellStart"/>
+              <w:r>
+                <w:rPr>
+                  <w:rStyle w:val="Hyperlink"/>
+                </w:rPr>
+                <w:t>WithSubpath</w:t>
+              </w:r>
+              <w:proofErr w:type="spellEnd"/>
+              <w:r>
+                <w:rPr>
+                  <w:rStyle w:val="Hyperlink"/>
+                </w:rPr>
+                <w:t>/StaticSSR.zip</w:t>
               </w:r>
             </w:hyperlink>
           </w:p>
@@ -12007,7 +12752,21 @@
                 <w:rPr>
                   <w:rStyle w:val="Hyperlink"/>
                 </w:rPr>
-                <w:t>Evidence/net11-new-app/ReverseProxy/StaticSSR.zip</w:t>
+                <w:t>Evidence/net11-new-app/</w:t>
+              </w:r>
+              <w:proofErr w:type="spellStart"/>
+              <w:r>
+                <w:rPr>
+                  <w:rStyle w:val="Hyperlink"/>
+                </w:rPr>
+                <w:t>ReverseProxy</w:t>
+              </w:r>
+              <w:proofErr w:type="spellEnd"/>
+              <w:r>
+                <w:rPr>
+                  <w:rStyle w:val="Hyperlink"/>
+                </w:rPr>
+                <w:t>/StaticSSR.zip</w:t>
               </w:r>
             </w:hyperlink>
           </w:p>
@@ -12103,7 +12862,21 @@
                 <w:rPr>
                   <w:rStyle w:val="Hyperlink"/>
                 </w:rPr>
-                <w:t>Evidence/net11-new-app/WithSubpath/InteractiveServer.zip</w:t>
+                <w:t>Evidence/net11-new-app/</w:t>
+              </w:r>
+              <w:proofErr w:type="spellStart"/>
+              <w:r>
+                <w:rPr>
+                  <w:rStyle w:val="Hyperlink"/>
+                </w:rPr>
+                <w:t>WithSubpath</w:t>
+              </w:r>
+              <w:proofErr w:type="spellEnd"/>
+              <w:r>
+                <w:rPr>
+                  <w:rStyle w:val="Hyperlink"/>
+                </w:rPr>
+                <w:t>/InteractiveServer.zip</w:t>
               </w:r>
             </w:hyperlink>
             <w:r>
@@ -12134,7 +12907,21 @@
                 <w:rPr>
                   <w:rStyle w:val="Hyperlink"/>
                 </w:rPr>
-                <w:t>Evidence/net11-new-app/ReverseProxy/InteractiveServer.zip</w:t>
+                <w:t>Evidence/net11-new-app/</w:t>
+              </w:r>
+              <w:proofErr w:type="spellStart"/>
+              <w:r>
+                <w:rPr>
+                  <w:rStyle w:val="Hyperlink"/>
+                </w:rPr>
+                <w:t>ReverseProxy</w:t>
+              </w:r>
+              <w:proofErr w:type="spellEnd"/>
+              <w:r>
+                <w:rPr>
+                  <w:rStyle w:val="Hyperlink"/>
+                </w:rPr>
+                <w:t>/InteractiveServer.zip</w:t>
               </w:r>
             </w:hyperlink>
           </w:p>
@@ -12203,8 +12990,17 @@
                 <w:b/>
                 <w:bCs/>
               </w:rPr>
-              <w:t>Interactive WebAssembly</w:t>
+              <w:t xml:space="preserve">Interactive </w:t>
             </w:r>
+            <w:proofErr w:type="spellStart"/>
+            <w:r>
+              <w:rPr>
+                <w:b/>
+                <w:bCs/>
+              </w:rPr>
+              <w:t>WebAssembly</w:t>
+            </w:r>
+            <w:proofErr w:type="spellEnd"/>
           </w:p>
         </w:tc>
         <w:tc>
@@ -12230,7 +13026,21 @@
                 <w:rPr>
                   <w:rStyle w:val="Hyperlink"/>
                 </w:rPr>
-                <w:t>Evidence/net11-new-app/WithSubpath/InteractiveWebAssembly.zip</w:t>
+                <w:t>Evidence/net11-new-app/</w:t>
+              </w:r>
+              <w:proofErr w:type="spellStart"/>
+              <w:r>
+                <w:rPr>
+                  <w:rStyle w:val="Hyperlink"/>
+                </w:rPr>
+                <w:t>WithSubpath</w:t>
+              </w:r>
+              <w:proofErr w:type="spellEnd"/>
+              <w:r>
+                <w:rPr>
+                  <w:rStyle w:val="Hyperlink"/>
+                </w:rPr>
+                <w:t>/InteractiveWebAssembly.zip</w:t>
               </w:r>
             </w:hyperlink>
           </w:p>
@@ -12258,7 +13068,21 @@
                 <w:rPr>
                   <w:rStyle w:val="Hyperlink"/>
                 </w:rPr>
-                <w:t>Evidence/net11-new-app/ReverseProxy/InteractiveWebAssembly.zip</w:t>
+                <w:t>Evidence/net11-new-app/</w:t>
+              </w:r>
+              <w:proofErr w:type="spellStart"/>
+              <w:r>
+                <w:rPr>
+                  <w:rStyle w:val="Hyperlink"/>
+                </w:rPr>
+                <w:t>ReverseProxy</w:t>
+              </w:r>
+              <w:proofErr w:type="spellEnd"/>
+              <w:r>
+                <w:rPr>
+                  <w:rStyle w:val="Hyperlink"/>
+                </w:rPr>
+                <w:t>/InteractiveWebAssembly.zip</w:t>
               </w:r>
             </w:hyperlink>
           </w:p>
@@ -12354,7 +13178,21 @@
                 <w:rPr>
                   <w:rStyle w:val="Hyperlink"/>
                 </w:rPr>
-                <w:t>Evidence/net10-to-net11-upgrade/WithSubpath/StaticSSR.zip</w:t>
+                <w:t>Evidence/net10-to-net11-upgrade/</w:t>
+              </w:r>
+              <w:proofErr w:type="spellStart"/>
+              <w:r>
+                <w:rPr>
+                  <w:rStyle w:val="Hyperlink"/>
+                </w:rPr>
+                <w:t>WithSubpath</w:t>
+              </w:r>
+              <w:proofErr w:type="spellEnd"/>
+              <w:r>
+                <w:rPr>
+                  <w:rStyle w:val="Hyperlink"/>
+                </w:rPr>
+                <w:t>/StaticSSR.zip</w:t>
               </w:r>
             </w:hyperlink>
           </w:p>
@@ -12382,7 +13220,21 @@
                 <w:rPr>
                   <w:rStyle w:val="Hyperlink"/>
                 </w:rPr>
-                <w:t>Evidence/net10-to-net11-upgrade/ReverseProxy/StaticSSR.zip</w:t>
+                <w:t>Evidence/net10-to-net11-upgrade/</w:t>
+              </w:r>
+              <w:proofErr w:type="spellStart"/>
+              <w:r>
+                <w:rPr>
+                  <w:rStyle w:val="Hyperlink"/>
+                </w:rPr>
+                <w:t>ReverseProxy</w:t>
+              </w:r>
+              <w:proofErr w:type="spellEnd"/>
+              <w:r>
+                <w:rPr>
+                  <w:rStyle w:val="Hyperlink"/>
+                </w:rPr>
+                <w:t>/StaticSSR.zip</w:t>
               </w:r>
             </w:hyperlink>
           </w:p>
@@ -12575,8 +13427,17 @@
                 <w:b/>
                 <w:bCs/>
               </w:rPr>
-              <w:t>Interactive WebAssembly</w:t>
+              <w:t xml:space="preserve">Interactive </w:t>
             </w:r>
+            <w:proofErr w:type="spellStart"/>
+            <w:r>
+              <w:rPr>
+                <w:b/>
+                <w:bCs/>
+              </w:rPr>
+              <w:t>WebAssembly</w:t>
+            </w:r>
+            <w:proofErr w:type="spellEnd"/>
           </w:p>
         </w:tc>
         <w:tc>
@@ -12685,12 +13546,21 @@
         </w:rPr>
         <w:t xml:space="preserve"> </w:t>
       </w:r>
+      <w:proofErr w:type="spellStart"/>
       <w:r>
         <w:rPr>
           <w:b/>
           <w:bCs/>
         </w:rPr>
-        <w:t>BasePath Component Fails to Trigger Build Error or Documentation Lacks Sufficient Guidelines When Required Namespace Is Missing in .NET 10 to .NET 11 Upgraded Apps</w:t>
+        <w:t>BasePath</w:t>
+      </w:r>
+      <w:proofErr w:type="spellEnd"/>
+      <w:r>
+        <w:rPr>
+          <w:b/>
+          <w:bCs/>
+        </w:rPr>
+        <w:t xml:space="preserve"> Component Fails to Trigger Build Error or Documentation Lacks Sufficient Guidelines When Required Namespace Is Missing in .NET 10 to .NET 11 Upgraded Apps</w:t>
       </w:r>
     </w:p>
     <w:p>
@@ -12712,7 +13582,23 @@
     </w:p>
     <w:p>
       <w:r>
-        <w:t>A Blazor Web App upgraded from .NET 10 to .NET 11 does not report a build error when the &lt;BasePath /&gt; component is used without its required namespace, nor does the documentation provide adequate guidelines regarding this dependency. Although the application builds successfully with only a warning, the browser treats the unrendered &lt;BasePath /&gt; tag as an unknown element, causing all subsequent &lt;head&gt; elements to be incorrectly pushed into the &lt;body&gt; tag at runtime.</w:t>
+        <w:t>A Blazor Web App upgraded from .NET 10 to .NET 11 does not report a build error when the &lt;</w:t>
+      </w:r>
+      <w:proofErr w:type="spellStart"/>
+      <w:r>
+        <w:t>BasePath</w:t>
+      </w:r>
+      <w:proofErr w:type="spellEnd"/>
+      <w:r>
+        <w:t xml:space="preserve"> /&gt; component is used without its required namespace, nor does the documentation provide adequate guidelines regarding this dependency. Although the application builds successfully with only a warning, the browser treats the unrendered &lt;</w:t>
+      </w:r>
+      <w:proofErr w:type="spellStart"/>
+      <w:r>
+        <w:t>BasePath</w:t>
+      </w:r>
+      <w:proofErr w:type="spellEnd"/>
+      <w:r>
+        <w:t xml:space="preserve"> /&gt; tag as an unknown element, causing all subsequent &lt;head&gt; elements to be incorrectly pushed into the &lt;body&gt; tag at runtime.</w:t>
       </w:r>
       <w:r>
         <w:br/>
@@ -12729,12 +13615,70 @@
     </w:p>
     <w:p>
       <w:r>
-        <w:t>After replacing the &lt;base href="/" /&gt; element with the &lt;BasePath /&gt; component in a Blazor Web App upgraded from .NET 10 to .NET 11, the application builds and launches successfully with only a warning—even when the required @using Microsoft.AspNetCore.Components.Endpoints namespace is missing from _Imports.razor.</w:t>
+        <w:t xml:space="preserve">After replacing the &lt;base </w:t>
+      </w:r>
+      <w:proofErr w:type="spellStart"/>
+      <w:r>
+        <w:t>href</w:t>
+      </w:r>
+      <w:proofErr w:type="spellEnd"/>
+      <w:r>
+        <w:t>="/" /&gt; element with the &lt;</w:t>
+      </w:r>
+      <w:proofErr w:type="spellStart"/>
+      <w:r>
+        <w:t>BasePath</w:t>
+      </w:r>
+      <w:proofErr w:type="spellEnd"/>
+      <w:r>
+        <w:t xml:space="preserve"> /&gt; component in a Blazor Web App upgraded from .NET 10 to .NET 11, the application builds and launches successfully with only a warning—even when the required @using </w:t>
+      </w:r>
+      <w:proofErr w:type="spellStart"/>
+      <w:proofErr w:type="gramStart"/>
+      <w:r>
+        <w:t>Microsoft.AspNetCore.Components.Endpoints</w:t>
+      </w:r>
+      <w:proofErr w:type="spellEnd"/>
+      <w:proofErr w:type="gramEnd"/>
+      <w:r>
+        <w:t xml:space="preserve"> namespace is missing from _</w:t>
+      </w:r>
+      <w:proofErr w:type="spellStart"/>
+      <w:r>
+        <w:t>Imports.razor</w:t>
+      </w:r>
+      <w:proofErr w:type="spellEnd"/>
+      <w:r>
+        <w:t>.</w:t>
       </w:r>
     </w:p>
     <w:p>
       <w:r>
-        <w:t>No build errors are reported, and the current documentation lacks explicit instructions regarding this setup. Because the component is unrecognized by the compiler, the literal &lt;BasePath /&gt; tag is outputted directly to the browser. This invalid HTML structure causes the browser to prematurely close the &lt;head&gt; section and force all subsequent expected &lt;head&gt; elements into the &lt;body&gt; tag at runtime.</w:t>
+        <w:t xml:space="preserve">No build errors are reported, and the current documentation lacks explicit instructions regarding this </w:t>
+      </w:r>
+      <w:proofErr w:type="gramStart"/>
+      <w:r>
+        <w:t>setup</w:t>
+      </w:r>
+      <w:proofErr w:type="gramEnd"/>
+      <w:r>
+        <w:t>. Because the component is unrecognized by the compiler, the literal &lt;</w:t>
+      </w:r>
+      <w:proofErr w:type="spellStart"/>
+      <w:r>
+        <w:t>BasePath</w:t>
+      </w:r>
+      <w:proofErr w:type="spellEnd"/>
+      <w:r>
+        <w:t xml:space="preserve"> /&gt; tag is </w:t>
+      </w:r>
+      <w:proofErr w:type="gramStart"/>
+      <w:r>
+        <w:t>outputted</w:t>
+      </w:r>
+      <w:proofErr w:type="gramEnd"/>
+      <w:r>
+        <w:t xml:space="preserve"> directly to the browser. This invalid HTML structure causes the browser to prematurely close the &lt;head&gt; section and force all subsequent expected &lt;head&gt; elements into the &lt;body&gt; tag at runtime.</w:t>
       </w:r>
       <w:r>
         <w:br/>
@@ -12854,8 +13798,13 @@
         </w:numPr>
       </w:pPr>
       <w:r>
-        <w:t>Interactive WebAssembly</w:t>
-      </w:r>
+        <w:t xml:space="preserve">Interactive </w:t>
+      </w:r>
+      <w:proofErr w:type="spellStart"/>
+      <w:r>
+        <w:t>WebAssembly</w:t>
+      </w:r>
+      <w:proofErr w:type="spellEnd"/>
     </w:p>
     <w:p>
       <w:pPr>
@@ -12865,27 +13814,101 @@
         </w:numPr>
       </w:pPr>
       <w:r>
-        <w:t>Update the project's Target Framework Moniker (TFM) in the .csproj file from net10.0 to net11.0:</w:t>
+        <w:t>Update the project's Target Framework Moniker (TFM) in the .</w:t>
+      </w:r>
+      <w:proofErr w:type="spellStart"/>
+      <w:r>
+        <w:t>csproj</w:t>
+      </w:r>
+      <w:proofErr w:type="spellEnd"/>
+      <w:r>
+        <w:t xml:space="preserve"> file from net10.0 to net11.0:</w:t>
       </w:r>
       <w:r>
         <w:br/>
-        <w:t>&lt;Project Sdk="Microsoft.NET.Sdk.Web"&gt;</w:t>
+        <w:t xml:space="preserve">&lt;Project </w:t>
+      </w:r>
+      <w:proofErr w:type="spellStart"/>
+      <w:r>
+        <w:t>Sdk</w:t>
+      </w:r>
+      <w:proofErr w:type="spellEnd"/>
+      <w:r>
+        <w:t>="</w:t>
+      </w:r>
+      <w:proofErr w:type="spellStart"/>
+      <w:proofErr w:type="gramStart"/>
+      <w:r>
+        <w:t>Microsoft.NET.Sdk.Web</w:t>
+      </w:r>
+      <w:proofErr w:type="spellEnd"/>
+      <w:proofErr w:type="gramEnd"/>
+      <w:r>
+        <w:t>"&gt;</w:t>
       </w:r>
       <w:r>
         <w:br/>
-        <w:t xml:space="preserve">  &lt;PropertyGroup&gt;</w:t>
+        <w:t xml:space="preserve">  &lt;</w:t>
+      </w:r>
+      <w:proofErr w:type="spellStart"/>
+      <w:r>
+        <w:t>PropertyGroup</w:t>
+      </w:r>
+      <w:proofErr w:type="spellEnd"/>
+      <w:r>
+        <w:t>&gt;</w:t>
       </w:r>
       <w:r>
         <w:br/>
-        <w:t>-   &lt;TargetFramework&gt;net10.0&lt;/TargetFramework&gt;</w:t>
+        <w:t>-   &lt;</w:t>
+      </w:r>
+      <w:proofErr w:type="spellStart"/>
+      <w:r>
+        <w:t>TargetFramework</w:t>
+      </w:r>
+      <w:proofErr w:type="spellEnd"/>
+      <w:r>
+        <w:t>&gt;net10.0&lt;/</w:t>
+      </w:r>
+      <w:proofErr w:type="spellStart"/>
+      <w:r>
+        <w:t>TargetFramework</w:t>
+      </w:r>
+      <w:proofErr w:type="spellEnd"/>
+      <w:r>
+        <w:t>&gt;</w:t>
       </w:r>
       <w:r>
         <w:br/>
-        <w:t>+   &lt;TargetFramework&gt;net11.0&lt;/TargetFramework&gt;</w:t>
+        <w:t>+   &lt;</w:t>
+      </w:r>
+      <w:proofErr w:type="spellStart"/>
+      <w:r>
+        <w:t>TargetFramework</w:t>
+      </w:r>
+      <w:proofErr w:type="spellEnd"/>
+      <w:r>
+        <w:t>&gt;net11.0&lt;/</w:t>
+      </w:r>
+      <w:proofErr w:type="spellStart"/>
+      <w:r>
+        <w:t>TargetFramework</w:t>
+      </w:r>
+      <w:proofErr w:type="spellEnd"/>
+      <w:r>
+        <w:t>&gt;</w:t>
       </w:r>
       <w:r>
         <w:br/>
-        <w:t xml:space="preserve">  &lt;/PropertyGroup&gt;</w:t>
+        <w:t xml:space="preserve">  &lt;/</w:t>
+      </w:r>
+      <w:proofErr w:type="spellStart"/>
+      <w:r>
+        <w:t>PropertyGroup</w:t>
+      </w:r>
+      <w:proofErr w:type="spellEnd"/>
+      <w:r>
+        <w:t>&gt;</w:t>
       </w:r>
       <w:r>
         <w:br/>
@@ -12900,11 +13923,27 @@
         </w:numPr>
       </w:pPr>
       <w:r>
-        <w:t>In App.razor, replace:</w:t>
+        <w:t xml:space="preserve">In </w:t>
+      </w:r>
+      <w:proofErr w:type="spellStart"/>
+      <w:r>
+        <w:t>App.razor</w:t>
+      </w:r>
+      <w:proofErr w:type="spellEnd"/>
+      <w:r>
+        <w:t>, replace:</w:t>
       </w:r>
       <w:r>
         <w:br/>
-        <w:t>&lt;base href="/" /&gt;</w:t>
+        <w:t xml:space="preserve">&lt;base </w:t>
+      </w:r>
+      <w:proofErr w:type="spellStart"/>
+      <w:r>
+        <w:t>href</w:t>
+      </w:r>
+      <w:proofErr w:type="spellEnd"/>
+      <w:r>
+        <w:t>="/" /&gt;</w:t>
       </w:r>
       <w:r>
         <w:br/>
@@ -12915,7 +13954,15 @@
       </w:r>
       <w:r>
         <w:br/>
-        <w:t>&lt;BasePath /&gt;</w:t>
+        <w:t>&lt;</w:t>
+      </w:r>
+      <w:proofErr w:type="spellStart"/>
+      <w:r>
+        <w:t>BasePath</w:t>
+      </w:r>
+      <w:proofErr w:type="spellEnd"/>
+      <w:r>
+        <w:t xml:space="preserve"> /&gt;</w:t>
       </w:r>
     </w:p>
     <w:p>
@@ -12936,12 +13983,35 @@
         <w:t>without</w:t>
       </w:r>
       <w:r>
-        <w:t xml:space="preserve"> adding the following namespace to _Imports.razor or App.razor:</w:t>
+        <w:t xml:space="preserve"> adding the following namespace to _</w:t>
+      </w:r>
+      <w:proofErr w:type="spellStart"/>
+      <w:r>
+        <w:t>Imports.razor</w:t>
+      </w:r>
+      <w:proofErr w:type="spellEnd"/>
+      <w:r>
+        <w:t xml:space="preserve"> or </w:t>
+      </w:r>
+      <w:proofErr w:type="spellStart"/>
+      <w:r>
+        <w:t>App.razor</w:t>
+      </w:r>
+      <w:proofErr w:type="spellEnd"/>
+      <w:r>
+        <w:t>:</w:t>
       </w:r>
       <w:r>
         <w:br/>
-        <w:t>@using Microsoft.AspNetCore.Components.Endpoints</w:t>
-      </w:r>
+        <w:t xml:space="preserve">@using </w:t>
+      </w:r>
+      <w:proofErr w:type="spellStart"/>
+      <w:proofErr w:type="gramStart"/>
+      <w:r>
+        <w:t>Microsoft.AspNetCore.Components.Endpoints</w:t>
+      </w:r>
+      <w:proofErr w:type="spellEnd"/>
+      <w:proofErr w:type="gramEnd"/>
     </w:p>
     <w:p/>
     <w:p>
@@ -12955,7 +14025,15 @@
     </w:p>
     <w:p>
       <w:r>
-        <w:t>The application builds and launches successfully without any build errors, and the official documentation lacks clear guidelines regarding the necessary namespace setup. At runtime, the compiler outputs the literal &lt;BasePath /&gt; string as text, which breaks the HTML parsing structure and forces subsequent &lt;head&gt; elements into the &lt;body&gt; tag.</w:t>
+        <w:t>The application builds and launches successfully without any build errors, and the official documentation lacks clear guidelines regarding the necessary namespace setup. At runtime, the compiler outputs the literal &lt;</w:t>
+      </w:r>
+      <w:proofErr w:type="spellStart"/>
+      <w:r>
+        <w:t>BasePath</w:t>
+      </w:r>
+      <w:proofErr w:type="spellEnd"/>
+      <w:r>
+        <w:t xml:space="preserve"> /&gt; string as text, which breaks the HTML parsing structure and forces subsequent &lt;head&gt; elements into the &lt;body&gt; tag.</w:t>
       </w:r>
     </w:p>
     <w:p/>
@@ -12970,7 +14048,25 @@
     </w:p>
     <w:p>
       <w:r>
-        <w:t xml:space="preserve">The build should fail with a clear compiler error indicating that the Microsoft.AspNetCore.Components.Endpoints namespace is required to use the &lt;BasePath /&gt; component. Alternatively, if a build failure is not possible by design, the </w:t>
+        <w:t xml:space="preserve">The build should fail with a clear compiler error indicating that the </w:t>
+      </w:r>
+      <w:proofErr w:type="spellStart"/>
+      <w:proofErr w:type="gramStart"/>
+      <w:r>
+        <w:t>Microsoft.AspNetCore.Components.Endpoints</w:t>
+      </w:r>
+      <w:proofErr w:type="spellEnd"/>
+      <w:proofErr w:type="gramEnd"/>
+      <w:r>
+        <w:t xml:space="preserve"> namespace is required to use the &lt;</w:t>
+      </w:r>
+      <w:proofErr w:type="spellStart"/>
+      <w:r>
+        <w:t>BasePath</w:t>
+      </w:r>
+      <w:proofErr w:type="spellEnd"/>
+      <w:r>
+        <w:t xml:space="preserve"> /&gt; component. Alternatively, if a build failure is not possible by design, the </w:t>
       </w:r>
       <w:r>
         <w:lastRenderedPageBreak/>
@@ -12991,7 +14087,35 @@
           <w:rPr>
             <w:rStyle w:val="Hyperlink"/>
           </w:rPr>
-          <w:t>BlazorWebApp-BasePath-Validation/Evidence/net10-to-net11-upgrade/Issue_BasePath_MissingNamespace.zip at main · BharatRamsf3693/BlazorWebApp-BasePath-Validation</w:t>
+          <w:t>BlazorWebApp-BasePath-Validation/Evidence/net10-to-net11-upgrade/Issue_BasePath_MissingNamespace.zip at main · BharatRamsf3693/</w:t>
+        </w:r>
+        <w:proofErr w:type="spellStart"/>
+        <w:r>
+          <w:rPr>
+            <w:rStyle w:val="Hyperlink"/>
+          </w:rPr>
+          <w:t>BlazorWebApp</w:t>
+        </w:r>
+        <w:proofErr w:type="spellEnd"/>
+        <w:r>
+          <w:rPr>
+            <w:rStyle w:val="Hyperlink"/>
+          </w:rPr>
+          <w:t>-</w:t>
+        </w:r>
+        <w:proofErr w:type="spellStart"/>
+        <w:r>
+          <w:rPr>
+            <w:rStyle w:val="Hyperlink"/>
+          </w:rPr>
+          <w:t>BasePath</w:t>
+        </w:r>
+        <w:proofErr w:type="spellEnd"/>
+        <w:r>
+          <w:rPr>
+            <w:rStyle w:val="Hyperlink"/>
+          </w:rPr>
+          <w:t>-Validation</w:t>
         </w:r>
       </w:hyperlink>
     </w:p>
@@ -13004,12 +14128,21 @@
         </w:rPr>
         <w:t xml:space="preserve">2. </w:t>
       </w:r>
+      <w:proofErr w:type="spellStart"/>
       <w:r>
         <w:rPr>
           <w:b/>
           <w:bCs/>
         </w:rPr>
-        <w:t>BasePath Component Fails to Preserve Sub-path Casing Behind a Reverse Proxy</w:t>
+        <w:t>BasePath</w:t>
+      </w:r>
+      <w:proofErr w:type="spellEnd"/>
+      <w:r>
+        <w:rPr>
+          <w:b/>
+          <w:bCs/>
+        </w:rPr>
+        <w:t xml:space="preserve"> Component Fails to Preserve Sub-path Casing Behind a Reverse Proxy</w:t>
       </w:r>
     </w:p>
     <w:p>
@@ -13033,7 +14166,47 @@
     </w:p>
     <w:p>
       <w:r>
-        <w:t>The &lt;BasePath /&gt; component fails to adapt to case-sensitivity changes introduced by a reverse proxy. When the public proxy URL uses a specific casing (for example, /StaticSsr/) while the backend application uses a different casing (for example, /staticssr/), the &lt;BasePath /&gt; component incorrectly falls back to the backend application's casing instead of preserving the casing of the public request path.</w:t>
+        <w:t>The &lt;</w:t>
+      </w:r>
+      <w:proofErr w:type="spellStart"/>
+      <w:r>
+        <w:t>BasePath</w:t>
+      </w:r>
+      <w:proofErr w:type="spellEnd"/>
+      <w:r>
+        <w:t xml:space="preserve"> /&gt; component fails to adapt to case-sensitivity changes introduced by a reverse proxy. When the public proxy URL uses a specific casing (for example, /</w:t>
+      </w:r>
+      <w:proofErr w:type="spellStart"/>
+      <w:r>
+        <w:t>StaticSsr</w:t>
+      </w:r>
+      <w:proofErr w:type="spellEnd"/>
+      <w:r>
+        <w:t>/) while the backend application uses a different casing (for example, /</w:t>
+      </w:r>
+      <w:proofErr w:type="spellStart"/>
+      <w:r>
+        <w:t>staticssr</w:t>
+      </w:r>
+      <w:proofErr w:type="spellEnd"/>
+      <w:r>
+        <w:t>/), the &lt;</w:t>
+      </w:r>
+      <w:proofErr w:type="spellStart"/>
+      <w:r>
+        <w:t>BasePath</w:t>
+      </w:r>
+      <w:proofErr w:type="spellEnd"/>
+      <w:r>
+        <w:t xml:space="preserve"> /</w:t>
+      </w:r>
+      <w:proofErr w:type="gramStart"/>
+      <w:r>
+        <w:t>&gt; component</w:t>
+      </w:r>
+      <w:proofErr w:type="gramEnd"/>
+      <w:r>
+        <w:t xml:space="preserve"> incorrectly falls back to the backend application's casing instead of preserving the casing of the public request path.</w:t>
       </w:r>
     </w:p>
     <w:p>
@@ -13043,7 +14216,15 @@
     </w:p>
     <w:p>
       <w:r>
-        <w:t>This mismatch causes console errors in Interactive Server and Interactive WebAssembly samples. In the Static SSR sample, no console errors occur, but changes to the sub-path casing in the browser URL are not reflected in the rendered &lt;base&gt; element.</w:t>
+        <w:t xml:space="preserve">This mismatch causes console errors in Interactive Server and Interactive </w:t>
+      </w:r>
+      <w:proofErr w:type="spellStart"/>
+      <w:r>
+        <w:t>WebAssembly</w:t>
+      </w:r>
+      <w:proofErr w:type="spellEnd"/>
+      <w:r>
+        <w:t xml:space="preserve"> samples. In the Static SSR sample, no console errors occur, but changes to the sub-path casing in the browser URL are not reflected in the rendered &lt;base&gt; element.</w:t>
       </w:r>
     </w:p>
     <w:p>
@@ -13067,7 +14248,15 @@
     </w:p>
     <w:p>
       <w:r>
-        <w:t>When an IIS reverse proxy is configured to forward traffic from a public URL with a specific casing to a backend application path, casing variations in the incoming request are ignored. For example, requests arriving through the reverse proxy at:</w:t>
+        <w:t xml:space="preserve">When an IIS reverse proxy is configured to forward traffic from a public URL with a specific casing to a backend application path, </w:t>
+      </w:r>
+      <w:proofErr w:type="gramStart"/>
+      <w:r>
+        <w:t>casing</w:t>
+      </w:r>
+      <w:proofErr w:type="gramEnd"/>
+      <w:r>
+        <w:t xml:space="preserve"> variations in the incoming request are ignored. For example, requests arriving through the reverse proxy at:</w:t>
       </w:r>
     </w:p>
     <w:p>
@@ -13103,12 +14292,36 @@
     </w:p>
     <w:p>
       <w:r>
-        <w:t>However, instead of dynamically preserving the exact casing of the incoming public request path (/InteractiveWebAssembly/), the &lt;BasePath /&gt; component renders the &lt;base&gt; element using the backend application's configured path casing:</w:t>
+        <w:t>However, instead of dynamically preserving the exact casing of the incoming public request path (/</w:t>
+      </w:r>
+      <w:proofErr w:type="spellStart"/>
+      <w:r>
+        <w:t>InteractiveWebAssembly</w:t>
+      </w:r>
+      <w:proofErr w:type="spellEnd"/>
+      <w:r>
+        <w:t>/), the &lt;</w:t>
+      </w:r>
+      <w:proofErr w:type="spellStart"/>
+      <w:r>
+        <w:t>BasePath</w:t>
+      </w:r>
+      <w:proofErr w:type="spellEnd"/>
+      <w:r>
+        <w:t xml:space="preserve"> /&gt; component renders the &lt;base&gt; element using the backend application's configured path casing:</w:t>
       </w:r>
     </w:p>
     <w:p>
       <w:r>
-        <w:t>/interactivewebassembly/</w:t>
+        <w:t>/</w:t>
+      </w:r>
+      <w:proofErr w:type="spellStart"/>
+      <w:r>
+        <w:t>interactivewebassembly</w:t>
+      </w:r>
+      <w:proofErr w:type="spellEnd"/>
+      <w:r>
+        <w:t>/</w:t>
       </w:r>
     </w:p>
     <w:p>
@@ -13132,7 +14345,15 @@
     </w:p>
     <w:p>
       <w:r>
-        <w:t>The &lt;BasePath /&gt; component should dynamically inspect the request path and preserve the exact casing of the requested public URL path, producing:</w:t>
+        <w:t>The &lt;</w:t>
+      </w:r>
+      <w:proofErr w:type="spellStart"/>
+      <w:r>
+        <w:t>BasePath</w:t>
+      </w:r>
+      <w:proofErr w:type="spellEnd"/>
+      <w:r>
+        <w:t xml:space="preserve"> /&gt; component should dynamically inspect the request path and preserve the exact casing of the requested public URL path, producing:</w:t>
       </w:r>
     </w:p>
     <w:p>
@@ -13142,7 +14363,15 @@
     </w:p>
     <w:p>
       <w:r>
-        <w:t>/InteractiveWebAssembly/</w:t>
+        <w:t>/</w:t>
+      </w:r>
+      <w:proofErr w:type="spellStart"/>
+      <w:r>
+        <w:t>InteractiveWebAssembly</w:t>
+      </w:r>
+      <w:proofErr w:type="spellEnd"/>
+      <w:r>
+        <w:t>/</w:t>
       </w:r>
     </w:p>
     <w:p>
@@ -13240,7 +14469,15 @@
         </w:numPr>
       </w:pPr>
       <w:r>
-        <w:t>Physical path: Map it to a new empty folder, since the actual application will run inside a sub-path application node.</w:t>
+        <w:t xml:space="preserve">Physical path: Map it </w:t>
+      </w:r>
+      <w:proofErr w:type="gramStart"/>
+      <w:r>
+        <w:t>to</w:t>
+      </w:r>
+      <w:proofErr w:type="gramEnd"/>
+      <w:r>
+        <w:t xml:space="preserve"> a new empty folder, since the actual application will run inside a sub-path application node.</w:t>
       </w:r>
     </w:p>
     <w:p>
@@ -13318,7 +14555,15 @@
         </w:numPr>
       </w:pPr>
       <w:r>
-        <w:t>A self-signed certificate can be used for local validation.</w:t>
+        <w:t>A self-</w:t>
+      </w:r>
+      <w:proofErr w:type="gramStart"/>
+      <w:r>
+        <w:t>signed</w:t>
+      </w:r>
+      <w:proofErr w:type="gramEnd"/>
+      <w:r>
+        <w:t xml:space="preserve"> certificate can be used for local validation.</w:t>
       </w:r>
     </w:p>
     <w:p>
@@ -13373,7 +14618,31 @@
         </w:numPr>
       </w:pPr>
       <w:r>
-        <w:t>Alias: Enter a lowercase application path alias (for example, staticssr, interactiveserver, or interactivewebassembly).</w:t>
+        <w:t xml:space="preserve">Alias: Enter a lowercase application path alias (for example, </w:t>
+      </w:r>
+      <w:proofErr w:type="spellStart"/>
+      <w:r>
+        <w:t>staticssr</w:t>
+      </w:r>
+      <w:proofErr w:type="spellEnd"/>
+      <w:r>
+        <w:t xml:space="preserve">, </w:t>
+      </w:r>
+      <w:proofErr w:type="spellStart"/>
+      <w:r>
+        <w:t>interactiveserver</w:t>
+      </w:r>
+      <w:proofErr w:type="spellEnd"/>
+      <w:r>
+        <w:t xml:space="preserve">, or </w:t>
+      </w:r>
+      <w:proofErr w:type="spellStart"/>
+      <w:r>
+        <w:t>interactivewebassembly</w:t>
+      </w:r>
+      <w:proofErr w:type="spellEnd"/>
+      <w:r>
+        <w:t>).</w:t>
       </w:r>
     </w:p>
     <w:p>
@@ -13486,7 +14755,15 @@
       </w:pPr>
       <w:r>
         <w:lastRenderedPageBreak/>
-        <w:t>Physical path: Map it to a new empty folder.</w:t>
+        <w:t xml:space="preserve">Physical path: Map it </w:t>
+      </w:r>
+      <w:proofErr w:type="gramStart"/>
+      <w:r>
+        <w:t>to</w:t>
+      </w:r>
+      <w:proofErr w:type="gramEnd"/>
+      <w:r>
+        <w:t xml:space="preserve"> a new empty folder.</w:t>
       </w:r>
     </w:p>
     <w:p>
@@ -13563,7 +14840,15 @@
         </w:numPr>
       </w:pPr>
       <w:r>
-        <w:t>A self-signed certificate can be used for local validation.</w:t>
+        <w:t>A self-</w:t>
+      </w:r>
+      <w:proofErr w:type="gramStart"/>
+      <w:r>
+        <w:t>signed</w:t>
+      </w:r>
+      <w:proofErr w:type="gramEnd"/>
+      <w:r>
+        <w:t xml:space="preserve"> certificate can be used for local validation.</w:t>
       </w:r>
     </w:p>
     <w:p>
@@ -13625,7 +14910,31 @@
         <w:t>Alias:</w:t>
       </w:r>
       <w:r>
-        <w:t xml:space="preserve"> Enter a lowercase application path alias (for example, staticssr, interactiveserver, or interactivewebassembly).</w:t>
+        <w:t xml:space="preserve"> Enter a lowercase application path alias (for example, </w:t>
+      </w:r>
+      <w:proofErr w:type="spellStart"/>
+      <w:r>
+        <w:t>staticssr</w:t>
+      </w:r>
+      <w:proofErr w:type="spellEnd"/>
+      <w:r>
+        <w:t xml:space="preserve">, </w:t>
+      </w:r>
+      <w:proofErr w:type="spellStart"/>
+      <w:r>
+        <w:t>interactiveserver</w:t>
+      </w:r>
+      <w:proofErr w:type="spellEnd"/>
+      <w:r>
+        <w:t xml:space="preserve">, or </w:t>
+      </w:r>
+      <w:proofErr w:type="spellStart"/>
+      <w:r>
+        <w:t>interactivewebassembly</w:t>
+      </w:r>
+      <w:proofErr w:type="spellEnd"/>
+      <w:r>
+        <w:t>).</w:t>
       </w:r>
     </w:p>
     <w:p>
@@ -13643,7 +14952,15 @@
         <w:t>Physical path:</w:t>
       </w:r>
       <w:r>
-        <w:t xml:space="preserve"> Map it to a new empty folder.</w:t>
+        <w:t xml:space="preserve"> Map it </w:t>
+      </w:r>
+      <w:proofErr w:type="gramStart"/>
+      <w:r>
+        <w:t>to</w:t>
+      </w:r>
+      <w:proofErr w:type="gramEnd"/>
+      <w:r>
+        <w:t xml:space="preserve"> a new empty folder.</w:t>
       </w:r>
     </w:p>
     <w:p>
@@ -13711,7 +15028,15 @@
         </w:numPr>
       </w:pPr>
       <w:r>
-        <w:t>After adding the rule, the following web.config file is created in the mapped</w:t>
+        <w:t xml:space="preserve">After adding the rule, the following </w:t>
+      </w:r>
+      <w:proofErr w:type="spellStart"/>
+      <w:r>
+        <w:t>web.config</w:t>
+      </w:r>
+      <w:proofErr w:type="spellEnd"/>
+      <w:r>
+        <w:t xml:space="preserve"> file is created in the mapped</w:t>
       </w:r>
       <w:r>
         <w:rPr>
@@ -13744,7 +15069,17 @@
     </w:p>
     <w:p>
       <w:r>
-        <w:t xml:space="preserve">    &lt;system.webServer&gt;</w:t>
+        <w:t xml:space="preserve">    &lt;</w:t>
+      </w:r>
+      <w:proofErr w:type="spellStart"/>
+      <w:proofErr w:type="gramStart"/>
+      <w:r>
+        <w:t>system.webServer</w:t>
+      </w:r>
+      <w:proofErr w:type="spellEnd"/>
+      <w:proofErr w:type="gramEnd"/>
+      <w:r>
+        <w:t>&gt;</w:t>
       </w:r>
     </w:p>
     <w:p>
@@ -13760,12 +15095,36 @@
     </w:p>
     <w:p>
       <w:r>
-        <w:t xml:space="preserve">                &lt;rule name="ReverseProxyInboundRule1" stopProcessing="true"&gt;</w:t>
+        <w:t xml:space="preserve">                &lt;rule name="ReverseProxyInboundRule1" </w:t>
+      </w:r>
+      <w:proofErr w:type="spellStart"/>
+      <w:r>
+        <w:t>stopProcessing</w:t>
+      </w:r>
+      <w:proofErr w:type="spellEnd"/>
+      <w:r>
+        <w:t>="true"&gt;</w:t>
       </w:r>
     </w:p>
     <w:p>
       <w:r>
-        <w:t xml:space="preserve">                    &lt;match url="(.*)" /&gt;</w:t>
+        <w:t xml:space="preserve">                    &lt;match </w:t>
+      </w:r>
+      <w:proofErr w:type="spellStart"/>
+      <w:r>
+        <w:t>url</w:t>
+      </w:r>
+      <w:proofErr w:type="spellEnd"/>
+      <w:r>
+        <w:t>="</w:t>
+      </w:r>
+      <w:proofErr w:type="gramStart"/>
+      <w:r>
+        <w:t>(.*</w:t>
+      </w:r>
+      <w:proofErr w:type="gramEnd"/>
+      <w:r>
+        <w:t>)" /&gt;</w:t>
       </w:r>
     </w:p>
     <w:p>
@@ -13790,7 +15149,17 @@
     </w:p>
     <w:p>
       <w:r>
-        <w:t xml:space="preserve">    &lt;/system.webServer&gt;</w:t>
+        <w:t xml:space="preserve">    &lt;/</w:t>
+      </w:r>
+      <w:proofErr w:type="spellStart"/>
+      <w:proofErr w:type="gramStart"/>
+      <w:r>
+        <w:t>system.webServer</w:t>
+      </w:r>
+      <w:proofErr w:type="spellEnd"/>
+      <w:proofErr w:type="gramEnd"/>
+      <w:r>
+        <w:t>&gt;</w:t>
       </w:r>
     </w:p>
     <w:p>
@@ -13872,7 +15241,15 @@
         </w:numPr>
       </w:pPr>
       <w:r>
-        <w:t>Open the browser developer tools and inspect the rendered HTML within the &lt;head&gt; element.</w:t>
+        <w:t xml:space="preserve">Open the browser developer tools and inspect the </w:t>
+      </w:r>
+      <w:proofErr w:type="gramStart"/>
+      <w:r>
+        <w:t>rendered HTML</w:t>
+      </w:r>
+      <w:proofErr w:type="gramEnd"/>
+      <w:r>
+        <w:t xml:space="preserve"> within the &lt;head&gt; element.</w:t>
       </w:r>
       <w:r>
         <w:br/>
@@ -13912,7 +15289,15 @@
     <w:p>
       <w:r>
         <w:lastRenderedPageBreak/>
-        <w:t>This mismatch causes console errors in the browser for the Interactive Server and Interactive WebAssembly samples. For the Static SSR sample, no console errors occur; however, the casing change in the browser URL is not reflected in the rendered &lt;base&gt; element.</w:t>
+        <w:t xml:space="preserve">This mismatch causes console errors in the browser for the Interactive Server and Interactive </w:t>
+      </w:r>
+      <w:proofErr w:type="spellStart"/>
+      <w:r>
+        <w:t>WebAssembly</w:t>
+      </w:r>
+      <w:proofErr w:type="spellEnd"/>
+      <w:r>
+        <w:t xml:space="preserve"> samples. For the Static SSR sample, no console errors occur; however, the casing change in the browser URL is not reflected in the rendered &lt;base&gt; element.</w:t>
       </w:r>
     </w:p>
     <w:p>
@@ -13922,7 +15307,15 @@
     </w:p>
     <w:p>
       <w:r>
-        <w:t>The &lt;BasePath /&gt; component renders:</w:t>
+        <w:t>The &lt;</w:t>
+      </w:r>
+      <w:proofErr w:type="spellStart"/>
+      <w:r>
+        <w:t>BasePath</w:t>
+      </w:r>
+      <w:proofErr w:type="spellEnd"/>
+      <w:r>
+        <w:t xml:space="preserve"> /&gt; component renders:</w:t>
       </w:r>
     </w:p>
     <w:p>
@@ -13932,7 +15325,15 @@
     </w:p>
     <w:p>
       <w:r>
-        <w:t>/interactivewebassembly/</w:t>
+        <w:t>/</w:t>
+      </w:r>
+      <w:proofErr w:type="spellStart"/>
+      <w:r>
+        <w:t>interactivewebassembly</w:t>
+      </w:r>
+      <w:proofErr w:type="spellEnd"/>
+      <w:r>
+        <w:t>/</w:t>
       </w:r>
     </w:p>
     <w:p>
@@ -13952,7 +15353,15 @@
     </w:p>
     <w:p>
       <w:r>
-        <w:t>/InteractiveWebAssembly/</w:t>
+        <w:t>/</w:t>
+      </w:r>
+      <w:proofErr w:type="spellStart"/>
+      <w:r>
+        <w:t>InteractiveWebAssembly</w:t>
+      </w:r>
+      <w:proofErr w:type="spellEnd"/>
+      <w:r>
+        <w:t>/</w:t>
       </w:r>
     </w:p>
     <w:p>
@@ -13976,14 +15385,38 @@
     </w:p>
     <w:p>
       <w:r>
-        <w:t xml:space="preserve">The application should load successfully regardless of the subpath casing used in the incoming request URL. The </w:t>
+        <w:t xml:space="preserve">The application should load successfully regardless of the </w:t>
+      </w:r>
+      <w:proofErr w:type="spellStart"/>
+      <w:r>
+        <w:t>subpath</w:t>
+      </w:r>
+      <w:proofErr w:type="spellEnd"/>
+      <w:r>
+        <w:t xml:space="preserve"> casing used in the incoming request URL. The </w:t>
       </w:r>
       <w:r>
         <w:rPr>
           <w:b/>
           <w:bCs/>
         </w:rPr>
-        <w:t>&lt;BasePath /&gt;</w:t>
+        <w:t>&lt;</w:t>
+      </w:r>
+      <w:proofErr w:type="spellStart"/>
+      <w:r>
+        <w:rPr>
+          <w:b/>
+          <w:bCs/>
+        </w:rPr>
+        <w:t>BasePath</w:t>
+      </w:r>
+      <w:proofErr w:type="spellEnd"/>
+      <w:r>
+        <w:rPr>
+          <w:b/>
+          <w:bCs/>
+        </w:rPr>
+        <w:t xml:space="preserve"> /&gt;</w:t>
       </w:r>
       <w:r>
         <w:t xml:space="preserve"> component should preserve the exact casing of the requested path, ensuring that all static asset URLs resolve correctly using that same casing from the reverse proxy URL.</w:t>
@@ -14030,14 +15463,37 @@
           <w:rPr>
             <w:rStyle w:val="Hyperlink"/>
           </w:rPr>
-          <w:t>BlazorWebApp-BasePath-Validation/Evidence/net11-new-app/ReverseProxy at main · BharatRamsf3693/BlazorWebApp-BasePath-Validation</w:t>
+          <w:t>BlazorWebApp-BasePath-Validation/Evidence/net11-new-app/ReverseProxy at main · BharatRamsf3693/</w:t>
+        </w:r>
+        <w:proofErr w:type="spellStart"/>
+        <w:r>
+          <w:rPr>
+            <w:rStyle w:val="Hyperlink"/>
+          </w:rPr>
+          <w:t>BlazorWebApp</w:t>
+        </w:r>
+        <w:proofErr w:type="spellEnd"/>
+        <w:r>
+          <w:rPr>
+            <w:rStyle w:val="Hyperlink"/>
+          </w:rPr>
+          <w:t>-</w:t>
+        </w:r>
+        <w:proofErr w:type="spellStart"/>
+        <w:r>
+          <w:rPr>
+            <w:rStyle w:val="Hyperlink"/>
+          </w:rPr>
+          <w:t>BasePath</w:t>
+        </w:r>
+        <w:proofErr w:type="spellEnd"/>
+        <w:r>
+          <w:rPr>
+            <w:rStyle w:val="Hyperlink"/>
+          </w:rPr>
+          <w:t>-Validation</w:t>
         </w:r>
       </w:hyperlink>
-    </w:p>
-    <w:p>
-      <w:r>
-        <w:t> </w:t>
-      </w:r>
     </w:p>
     <w:p>
       <w:r>
@@ -14052,7 +15508,541 @@
           <w:rPr>
             <w:rStyle w:val="Hyperlink"/>
           </w:rPr>
-          <w:t>BlazorWebApp-BasePath-Validation/Evidence/net10-to-net11-upgrade/ReverseProxy at main · BharatRamsf3693/BlazorWebApp-BasePath-Validation</w:t>
+          <w:t>BlazorWebApp-BasePath-Validation/Evidence/net10-to-net11-upgrade/ReverseProxy at main · BharatRamsf3693/</w:t>
+        </w:r>
+        <w:proofErr w:type="spellStart"/>
+        <w:r>
+          <w:rPr>
+            <w:rStyle w:val="Hyperlink"/>
+          </w:rPr>
+          <w:t>BlazorWebApp</w:t>
+        </w:r>
+        <w:proofErr w:type="spellEnd"/>
+        <w:r>
+          <w:rPr>
+            <w:rStyle w:val="Hyperlink"/>
+          </w:rPr>
+          <w:t>-</w:t>
+        </w:r>
+        <w:proofErr w:type="spellStart"/>
+        <w:r>
+          <w:rPr>
+            <w:rStyle w:val="Hyperlink"/>
+          </w:rPr>
+          <w:t>BasePath</w:t>
+        </w:r>
+        <w:proofErr w:type="spellEnd"/>
+        <w:r>
+          <w:rPr>
+            <w:rStyle w:val="Hyperlink"/>
+          </w:rPr>
+          <w:t>-Validation</w:t>
+        </w:r>
+      </w:hyperlink>
+    </w:p>
+    <w:p/>
+    <w:p>
+      <w:r>
+        <w:rPr>
+          <w:b/>
+          <w:bCs/>
+        </w:rPr>
+        <w:t>3.</w:t>
+      </w:r>
+      <w:r>
+        <w:rPr>
+          <w:b/>
+          <w:bCs/>
+        </w:rPr>
+        <w:t xml:space="preserve"> </w:t>
+      </w:r>
+      <w:r>
+        <w:rPr>
+          <w:b/>
+          <w:bCs/>
+        </w:rPr>
+        <w:t>Static SSR fails to use proxy domain when constructing absolute URIs</w:t>
+      </w:r>
+    </w:p>
+    <w:p>
+      <w:r>
+        <w:lastRenderedPageBreak/>
+        <w:t> </w:t>
+      </w:r>
+    </w:p>
+    <w:p>
+      <w:r>
+        <w:rPr>
+          <w:b/>
+          <w:bCs/>
+        </w:rPr>
+        <w:t>Short Summary</w:t>
+      </w:r>
+    </w:p>
+    <w:p>
+      <w:r>
+        <w:t xml:space="preserve">When a Blazor Web App using Static SSR is deployed behind a reverse proxy, generating an absolute URI from a relative path incorrectly utilizes the backend application's host domain instead of the proxy's public domain. This issue is uniquely reproducible in the Static SSR render mode, while working correctly in Interactive Server and Interactive </w:t>
+      </w:r>
+      <w:proofErr w:type="spellStart"/>
+      <w:r>
+        <w:t>WebAssembly</w:t>
+      </w:r>
+      <w:proofErr w:type="spellEnd"/>
+      <w:r>
+        <w:t xml:space="preserve"> modes.</w:t>
+      </w:r>
+    </w:p>
+    <w:p/>
+    <w:p>
+      <w:r>
+        <w:rPr>
+          <w:b/>
+          <w:bCs/>
+        </w:rPr>
+        <w:t>What Happened</w:t>
+      </w:r>
+    </w:p>
+    <w:p>
+      <w:r>
+        <w:t xml:space="preserve">In a Static SSR Blazor application running behind an IIS reverse proxy, absolute URIs generated dynamically default to the backend application URL (e.g., </w:t>
+      </w:r>
+      <w:hyperlink r:id="rId44" w:history="1">
+        <w:r>
+          <w:rPr>
+            <w:rStyle w:val="Hyperlink"/>
+          </w:rPr>
+          <w:t>https://basepathvalidation.com</w:t>
+        </w:r>
+      </w:hyperlink>
+      <w:r>
+        <w:t xml:space="preserve">...) instead of preserving the public-facing reverse proxy domain (e.g., </w:t>
+      </w:r>
+      <w:hyperlink r:id="rId45" w:history="1">
+        <w:r>
+          <w:rPr>
+            <w:rStyle w:val="Hyperlink"/>
+          </w:rPr>
+          <w:t>https://proxy.com</w:t>
+        </w:r>
+      </w:hyperlink>
+      <w:r>
+        <w:t>...).</w:t>
+      </w:r>
+    </w:p>
+    <w:p>
+      <w:r>
+        <w:t>As shown in the below image, providing a relative path like reports/summary generates an absolute URL mapped directly to the backend domain hidden behind the proxy.</w:t>
+      </w:r>
+    </w:p>
+    <w:p>
+      <w:r>
+        <w:drawing>
+          <wp:inline distT="0" distB="0" distL="0" distR="0" wp14:anchorId="210388A4" wp14:editId="50EAEDC7">
+            <wp:extent cx="3181350" cy="1143000"/>
+            <wp:effectExtent l="0" t="0" r="0" b="0"/>
+            <wp:docPr id="1080199386" name="Picture 2"/>
+            <wp:cNvGraphicFramePr>
+              <a:graphicFrameLocks xmlns:a="http://schemas.openxmlformats.org/drawingml/2006/main" noChangeAspect="1"/>
+            </wp:cNvGraphicFramePr>
+            <a:graphic xmlns:a="http://schemas.openxmlformats.org/drawingml/2006/main">
+              <a:graphicData uri="http://schemas.openxmlformats.org/drawingml/2006/picture">
+                <pic:pic xmlns:pic="http://schemas.openxmlformats.org/drawingml/2006/picture">
+                  <pic:nvPicPr>
+                    <pic:cNvPr id="0" name="Picture 6"/>
+                    <pic:cNvPicPr>
+                      <a:picLocks noChangeAspect="1" noChangeArrowheads="1"/>
+                    </pic:cNvPicPr>
+                  </pic:nvPicPr>
+                  <pic:blipFill>
+                    <a:blip r:embed="rId18" cstate="print">
+                      <a:extLst>
+                        <a:ext uri="{28A0092B-C50C-407E-A947-70E740481C1C}">
+                          <a14:useLocalDpi xmlns:a14="http://schemas.microsoft.com/office/drawing/2010/main" val="0"/>
+                        </a:ext>
+                      </a:extLst>
+                    </a:blip>
+                    <a:srcRect/>
+                    <a:stretch>
+                      <a:fillRect/>
+                    </a:stretch>
+                  </pic:blipFill>
+                  <pic:spPr bwMode="auto">
+                    <a:xfrm>
+                      <a:off x="0" y="0"/>
+                      <a:ext cx="3181350" cy="1143000"/>
+                    </a:xfrm>
+                    <a:prstGeom prst="rect">
+                      <a:avLst/>
+                    </a:prstGeom>
+                    <a:noFill/>
+                    <a:ln>
+                      <a:noFill/>
+                    </a:ln>
+                  </pic:spPr>
+                </pic:pic>
+              </a:graphicData>
+            </a:graphic>
+          </wp:inline>
+        </w:drawing>
+      </w:r>
+    </w:p>
+    <w:p>
+      <w:r>
+        <w:t> </w:t>
+      </w:r>
+    </w:p>
+    <w:p>
+      <w:r>
+        <w:rPr>
+          <w:b/>
+          <w:bCs/>
+        </w:rPr>
+        <w:t>What You Expected Instead</w:t>
+      </w:r>
+    </w:p>
+    <w:p>
+      <w:r>
+        <w:t xml:space="preserve">The </w:t>
+      </w:r>
+      <w:proofErr w:type="spellStart"/>
+      <w:r>
+        <w:t>NavigationManager</w:t>
+      </w:r>
+      <w:proofErr w:type="spellEnd"/>
+      <w:r>
+        <w:t xml:space="preserve"> should detect and construct the absolute URI using the proxy's public URL domain. Absolute URLs generated within the application should match the public domain that the user interacts with rather than falling back to the backend hosting domain.</w:t>
+      </w:r>
+    </w:p>
+    <w:p/>
+    <w:p>
+      <w:r>
+        <w:rPr>
+          <w:b/>
+          <w:bCs/>
+        </w:rPr>
+        <w:t>Steps to Reproduce</w:t>
+      </w:r>
+    </w:p>
+    <w:p>
+      <w:pPr>
+        <w:numPr>
+          <w:ilvl w:val="0"/>
+          <w:numId w:val="16"/>
+        </w:numPr>
+      </w:pPr>
+      <w:r>
+        <w:t xml:space="preserve">Set up the backend application and the IIS reverse proxy architecture by following the </w:t>
+      </w:r>
+      <w:r>
+        <w:rPr>
+          <w:b/>
+          <w:bCs/>
+        </w:rPr>
+        <w:t>Phase 1 (Deploying the Backend Application in IIS)</w:t>
+      </w:r>
+      <w:r>
+        <w:t xml:space="preserve"> and </w:t>
+      </w:r>
+      <w:r>
+        <w:rPr>
+          <w:b/>
+          <w:bCs/>
+        </w:rPr>
+        <w:t xml:space="preserve">Phase 2 (Setting up </w:t>
+      </w:r>
+      <w:r>
+        <w:rPr>
+          <w:b/>
+          <w:bCs/>
+        </w:rPr>
+        <w:lastRenderedPageBreak/>
+        <w:t>the Reverse Proxy)</w:t>
+      </w:r>
+      <w:r>
+        <w:t xml:space="preserve"> infrastructure configurations detailed in the </w:t>
+      </w:r>
+      <w:r>
+        <w:rPr>
+          <w:b/>
+          <w:bCs/>
+        </w:rPr>
+        <w:t>"</w:t>
+      </w:r>
+      <w:proofErr w:type="spellStart"/>
+      <w:r>
+        <w:rPr>
+          <w:b/>
+          <w:bCs/>
+        </w:rPr>
+        <w:t>BasePath</w:t>
+      </w:r>
+      <w:proofErr w:type="spellEnd"/>
+      <w:r>
+        <w:rPr>
+          <w:b/>
+          <w:bCs/>
+        </w:rPr>
+        <w:t xml:space="preserve"> Component Fails to Preserve Sub-path Casing Behind a Reverse Proxy</w:t>
+      </w:r>
+      <w:r>
+        <w:t>" issue.</w:t>
+      </w:r>
+    </w:p>
+    <w:p>
+      <w:pPr>
+        <w:numPr>
+          <w:ilvl w:val="0"/>
+          <w:numId w:val="16"/>
+        </w:numPr>
+      </w:pPr>
+      <w:r>
+        <w:t xml:space="preserve">Ensure that during deployment, you choose the </w:t>
+      </w:r>
+      <w:r>
+        <w:rPr>
+          <w:b/>
+          <w:bCs/>
+        </w:rPr>
+        <w:t>Static SSR</w:t>
+      </w:r>
+      <w:r>
+        <w:t xml:space="preserve"> application for the backend node configuration.</w:t>
+      </w:r>
+    </w:p>
+    <w:p>
+      <w:pPr>
+        <w:numPr>
+          <w:ilvl w:val="0"/>
+          <w:numId w:val="16"/>
+        </w:numPr>
+      </w:pPr>
+      <w:r>
+        <w:t xml:space="preserve">Open a web browser and navigate to the URL builder page via the public proxy endpoint address: </w:t>
+      </w:r>
+      <w:hyperlink r:id="rId46" w:history="1">
+        <w:r>
+          <w:rPr>
+            <w:rStyle w:val="Hyperlink"/>
+          </w:rPr>
+          <w:t>https://proxy.com</w:t>
+        </w:r>
+      </w:hyperlink>
+    </w:p>
+    <w:p>
+      <w:pPr>
+        <w:numPr>
+          <w:ilvl w:val="0"/>
+          <w:numId w:val="16"/>
+        </w:numPr>
+      </w:pPr>
+      <w:r>
+        <w:t>Observe the generated absolute path string displayed on the UI.</w:t>
+      </w:r>
+    </w:p>
+    <w:p>
+      <w:pPr>
+        <w:numPr>
+          <w:ilvl w:val="1"/>
+          <w:numId w:val="16"/>
+        </w:numPr>
+      </w:pPr>
+      <w:r>
+        <w:rPr>
+          <w:b/>
+          <w:bCs/>
+        </w:rPr>
+        <w:t>Actual Result:</w:t>
+      </w:r>
+      <w:r>
+        <w:t xml:space="preserve"> The absolute URL resolves with the backend server domain (</w:t>
+      </w:r>
+      <w:hyperlink r:id="rId47" w:history="1">
+        <w:r>
+          <w:rPr>
+            <w:rStyle w:val="Hyperlink"/>
+          </w:rPr>
+          <w:t>https://basepathvalidation.com</w:t>
+        </w:r>
+      </w:hyperlink>
+      <w:r>
+        <w:t>), bypassing the public proxy host domain completely.</w:t>
+      </w:r>
+    </w:p>
+    <w:p>
+      <w:pPr>
+        <w:numPr>
+          <w:ilvl w:val="1"/>
+          <w:numId w:val="16"/>
+        </w:numPr>
+      </w:pPr>
+      <w:r>
+        <w:rPr>
+          <w:b/>
+          <w:bCs/>
+        </w:rPr>
+        <w:t>Expected Result:</w:t>
+      </w:r>
+      <w:r>
+        <w:t xml:space="preserve"> The absolute URL should build seamlessly using the public reverse proxy endpoint domain (</w:t>
+      </w:r>
+      <w:hyperlink r:id="rId48" w:history="1">
+        <w:r>
+          <w:rPr>
+            <w:rStyle w:val="Hyperlink"/>
+          </w:rPr>
+          <w:t>https://proxy.com</w:t>
+        </w:r>
+      </w:hyperlink>
+      <w:r>
+        <w:t>).</w:t>
+      </w:r>
+    </w:p>
+    <w:p>
+      <w:r>
+        <w:rPr>
+          <w:i/>
+          <w:iCs/>
+        </w:rPr>
+        <w:t xml:space="preserve">(Note: This issue is not reproducible when switching the application backend node to use the Interactive Server or Interactive </w:t>
+      </w:r>
+      <w:proofErr w:type="spellStart"/>
+      <w:r>
+        <w:rPr>
+          <w:i/>
+          <w:iCs/>
+        </w:rPr>
+        <w:t>WebAssembly</w:t>
+      </w:r>
+      <w:proofErr w:type="spellEnd"/>
+      <w:r>
+        <w:rPr>
+          <w:i/>
+          <w:iCs/>
+        </w:rPr>
+        <w:t xml:space="preserve"> render modes.)</w:t>
+      </w:r>
+    </w:p>
+    <w:p>
+      <w:r>
+        <w:t> </w:t>
+      </w:r>
+    </w:p>
+    <w:p>
+      <w:pPr>
+        <w:rPr>
+          <w:b/>
+          <w:bCs/>
+        </w:rPr>
+      </w:pPr>
+      <w:r>
+        <w:rPr>
+          <w:b/>
+          <w:bCs/>
+        </w:rPr>
+        <w:t xml:space="preserve">Evidence: </w:t>
+      </w:r>
+    </w:p>
+    <w:p>
+      <w:r>
+        <w:rPr>
+          <w:b/>
+          <w:bCs/>
+        </w:rPr>
+        <w:t>New .NET 11 App (Created &amp; Published)</w:t>
+      </w:r>
+      <w:r>
+        <w:rPr>
+          <w:b/>
+          <w:bCs/>
+        </w:rPr>
+        <w:t xml:space="preserve"> scenario</w:t>
+      </w:r>
+      <w:r>
+        <w:rPr>
+          <w:b/>
+          <w:bCs/>
+        </w:rPr>
+        <w:t xml:space="preserve">: </w:t>
+      </w:r>
+      <w:hyperlink r:id="rId49" w:history="1">
+        <w:r>
+          <w:rPr>
+            <w:rStyle w:val="Hyperlink"/>
+          </w:rPr>
+          <w:t>BlazorWebApp-BasePath-Validation/Evidence/net11-new-app/ReverseProxy at main · BharatRamsf3693/</w:t>
+        </w:r>
+        <w:proofErr w:type="spellStart"/>
+        <w:r>
+          <w:rPr>
+            <w:rStyle w:val="Hyperlink"/>
+          </w:rPr>
+          <w:t>BlazorWebApp</w:t>
+        </w:r>
+        <w:proofErr w:type="spellEnd"/>
+        <w:r>
+          <w:rPr>
+            <w:rStyle w:val="Hyperlink"/>
+          </w:rPr>
+          <w:t>-</w:t>
+        </w:r>
+        <w:proofErr w:type="spellStart"/>
+        <w:r>
+          <w:rPr>
+            <w:rStyle w:val="Hyperlink"/>
+          </w:rPr>
+          <w:t>BasePath</w:t>
+        </w:r>
+        <w:proofErr w:type="spellEnd"/>
+        <w:r>
+          <w:rPr>
+            <w:rStyle w:val="Hyperlink"/>
+          </w:rPr>
+          <w:t>-Validation</w:t>
+        </w:r>
+      </w:hyperlink>
+    </w:p>
+    <w:p>
+      <w:r>
+        <w:rPr>
+          <w:b/>
+          <w:bCs/>
+        </w:rPr>
+        <w:t xml:space="preserve">Upgraded App (from .NET 10 to .NET 11) and then published scenario: </w:t>
+      </w:r>
+      <w:hyperlink r:id="rId50" w:history="1">
+        <w:r>
+          <w:rPr>
+            <w:rStyle w:val="Hyperlink"/>
+          </w:rPr>
+          <w:t>BlazorWebApp-BasePath-Validation/Evidence/net10-to-net11-upgrade/ReverseProxy at main · BharatRamsf3693/</w:t>
+        </w:r>
+        <w:proofErr w:type="spellStart"/>
+        <w:r>
+          <w:rPr>
+            <w:rStyle w:val="Hyperlink"/>
+          </w:rPr>
+          <w:t>BlazorWebApp</w:t>
+        </w:r>
+        <w:proofErr w:type="spellEnd"/>
+        <w:r>
+          <w:rPr>
+            <w:rStyle w:val="Hyperlink"/>
+          </w:rPr>
+          <w:t>-</w:t>
+        </w:r>
+        <w:proofErr w:type="spellStart"/>
+        <w:r>
+          <w:rPr>
+            <w:rStyle w:val="Hyperlink"/>
+          </w:rPr>
+          <w:t>BasePath</w:t>
+        </w:r>
+        <w:proofErr w:type="spellEnd"/>
+        <w:r>
+          <w:rPr>
+            <w:rStyle w:val="Hyperlink"/>
+          </w:rPr>
+          <w:t>-Validation</w:t>
         </w:r>
       </w:hyperlink>
     </w:p>
@@ -15118,9 +17108,9 @@
     </w:lvl>
   </w:abstractNum>
   <w:abstractNum w:abstractNumId="8" w15:restartNumberingAfterBreak="0">
-    <w:nsid w:val="42C11B26"/>
+    <w:nsid w:val="3AC67699"/>
     <w:multiLevelType w:val="multilevel"/>
-    <w:tmpl w:val="7AE64520"/>
+    <w:tmpl w:val="24C03800"/>
     <w:lvl w:ilvl="0">
       <w:start w:val="1"/>
       <w:numFmt w:val="decimal"/>
@@ -15235,6 +17225,123 @@
     </w:lvl>
   </w:abstractNum>
   <w:abstractNum w:abstractNumId="9" w15:restartNumberingAfterBreak="0">
+    <w:nsid w:val="42C11B26"/>
+    <w:multiLevelType w:val="multilevel"/>
+    <w:tmpl w:val="7AE64520"/>
+    <w:lvl w:ilvl="0">
+      <w:start w:val="1"/>
+      <w:numFmt w:val="decimal"/>
+      <w:lvlText w:val="%1."/>
+      <w:lvlJc w:val="left"/>
+      <w:pPr>
+        <w:tabs>
+          <w:tab w:val="num" w:pos="720"/>
+        </w:tabs>
+        <w:ind w:left="720" w:hanging="360"/>
+      </w:pPr>
+    </w:lvl>
+    <w:lvl w:ilvl="1">
+      <w:start w:val="1"/>
+      <w:numFmt w:val="bullet"/>
+      <w:lvlText w:val="o"/>
+      <w:lvlJc w:val="left"/>
+      <w:pPr>
+        <w:tabs>
+          <w:tab w:val="num" w:pos="1440"/>
+        </w:tabs>
+        <w:ind w:left="1440" w:hanging="360"/>
+      </w:pPr>
+      <w:rPr>
+        <w:rFonts w:ascii="Courier New" w:hAnsi="Courier New" w:hint="default"/>
+        <w:sz w:val="20"/>
+      </w:rPr>
+    </w:lvl>
+    <w:lvl w:ilvl="2" w:tentative="1">
+      <w:start w:val="1"/>
+      <w:numFmt w:val="decimal"/>
+      <w:lvlText w:val="%3."/>
+      <w:lvlJc w:val="left"/>
+      <w:pPr>
+        <w:tabs>
+          <w:tab w:val="num" w:pos="2160"/>
+        </w:tabs>
+        <w:ind w:left="2160" w:hanging="360"/>
+      </w:pPr>
+    </w:lvl>
+    <w:lvl w:ilvl="3" w:tentative="1">
+      <w:start w:val="1"/>
+      <w:numFmt w:val="decimal"/>
+      <w:lvlText w:val="%4."/>
+      <w:lvlJc w:val="left"/>
+      <w:pPr>
+        <w:tabs>
+          <w:tab w:val="num" w:pos="2880"/>
+        </w:tabs>
+        <w:ind w:left="2880" w:hanging="360"/>
+      </w:pPr>
+    </w:lvl>
+    <w:lvl w:ilvl="4" w:tentative="1">
+      <w:start w:val="1"/>
+      <w:numFmt w:val="decimal"/>
+      <w:lvlText w:val="%5."/>
+      <w:lvlJc w:val="left"/>
+      <w:pPr>
+        <w:tabs>
+          <w:tab w:val="num" w:pos="3600"/>
+        </w:tabs>
+        <w:ind w:left="3600" w:hanging="360"/>
+      </w:pPr>
+    </w:lvl>
+    <w:lvl w:ilvl="5" w:tentative="1">
+      <w:start w:val="1"/>
+      <w:numFmt w:val="decimal"/>
+      <w:lvlText w:val="%6."/>
+      <w:lvlJc w:val="left"/>
+      <w:pPr>
+        <w:tabs>
+          <w:tab w:val="num" w:pos="4320"/>
+        </w:tabs>
+        <w:ind w:left="4320" w:hanging="360"/>
+      </w:pPr>
+    </w:lvl>
+    <w:lvl w:ilvl="6" w:tentative="1">
+      <w:start w:val="1"/>
+      <w:numFmt w:val="decimal"/>
+      <w:lvlText w:val="%7."/>
+      <w:lvlJc w:val="left"/>
+      <w:pPr>
+        <w:tabs>
+          <w:tab w:val="num" w:pos="5040"/>
+        </w:tabs>
+        <w:ind w:left="5040" w:hanging="360"/>
+      </w:pPr>
+    </w:lvl>
+    <w:lvl w:ilvl="7" w:tentative="1">
+      <w:start w:val="1"/>
+      <w:numFmt w:val="decimal"/>
+      <w:lvlText w:val="%8."/>
+      <w:lvlJc w:val="left"/>
+      <w:pPr>
+        <w:tabs>
+          <w:tab w:val="num" w:pos="5760"/>
+        </w:tabs>
+        <w:ind w:left="5760" w:hanging="360"/>
+      </w:pPr>
+    </w:lvl>
+    <w:lvl w:ilvl="8" w:tentative="1">
+      <w:start w:val="1"/>
+      <w:numFmt w:val="decimal"/>
+      <w:lvlText w:val="%9."/>
+      <w:lvlJc w:val="left"/>
+      <w:pPr>
+        <w:tabs>
+          <w:tab w:val="num" w:pos="6480"/>
+        </w:tabs>
+        <w:ind w:left="6480" w:hanging="360"/>
+      </w:pPr>
+    </w:lvl>
+  </w:abstractNum>
+  <w:abstractNum w:abstractNumId="10" w15:restartNumberingAfterBreak="0">
     <w:nsid w:val="4F8D0DB7"/>
     <w:multiLevelType w:val="multilevel"/>
     <w:tmpl w:val="B4E4FFA4"/>
@@ -15347,7 +17454,7 @@
       </w:pPr>
     </w:lvl>
   </w:abstractNum>
-  <w:abstractNum w:abstractNumId="10" w15:restartNumberingAfterBreak="0">
+  <w:abstractNum w:abstractNumId="11" w15:restartNumberingAfterBreak="0">
     <w:nsid w:val="53DE3B48"/>
     <w:multiLevelType w:val="multilevel"/>
     <w:tmpl w:val="FC8E9762"/>
@@ -15472,7 +17579,7 @@
       </w:pPr>
     </w:lvl>
   </w:abstractNum>
-  <w:abstractNum w:abstractNumId="11" w15:restartNumberingAfterBreak="0">
+  <w:abstractNum w:abstractNumId="12" w15:restartNumberingAfterBreak="0">
     <w:nsid w:val="586270B3"/>
     <w:multiLevelType w:val="multilevel"/>
     <w:tmpl w:val="8C8A0E9E"/>
@@ -15593,7 +17700,7 @@
       </w:pPr>
     </w:lvl>
   </w:abstractNum>
-  <w:abstractNum w:abstractNumId="12" w15:restartNumberingAfterBreak="0">
+  <w:abstractNum w:abstractNumId="13" w15:restartNumberingAfterBreak="0">
     <w:nsid w:val="6544398A"/>
     <w:multiLevelType w:val="multilevel"/>
     <w:tmpl w:val="33D860BE"/>
@@ -15742,7 +17849,7 @@
       </w:rPr>
     </w:lvl>
   </w:abstractNum>
-  <w:abstractNum w:abstractNumId="13" w15:restartNumberingAfterBreak="0">
+  <w:abstractNum w:abstractNumId="14" w15:restartNumberingAfterBreak="0">
     <w:nsid w:val="6E4A6323"/>
     <w:multiLevelType w:val="multilevel"/>
     <w:tmpl w:val="FC2CE164"/>
@@ -15891,7 +17998,7 @@
       </w:rPr>
     </w:lvl>
   </w:abstractNum>
-  <w:abstractNum w:abstractNumId="14" w15:restartNumberingAfterBreak="0">
+  <w:abstractNum w:abstractNumId="15" w15:restartNumberingAfterBreak="0">
     <w:nsid w:val="7D283401"/>
     <w:multiLevelType w:val="multilevel"/>
     <w:tmpl w:val="7B2CC87A"/>
@@ -16044,10 +18151,10 @@
     <w:abstractNumId w:val="6"/>
   </w:num>
   <w:num w:numId="2" w16cid:durableId="1421364274">
-    <w:abstractNumId w:val="14"/>
+    <w:abstractNumId w:val="15"/>
   </w:num>
   <w:num w:numId="3" w16cid:durableId="550532365">
-    <w:abstractNumId w:val="13"/>
+    <w:abstractNumId w:val="14"/>
   </w:num>
   <w:num w:numId="4" w16cid:durableId="963272197">
     <w:abstractNumId w:val="0"/>
@@ -16056,7 +18163,7 @@
     </w:lvlOverride>
   </w:num>
   <w:num w:numId="5" w16cid:durableId="1933584062">
-    <w:abstractNumId w:val="12"/>
+    <w:abstractNumId w:val="13"/>
   </w:num>
   <w:num w:numId="6" w16cid:durableId="724834537">
     <w:abstractNumId w:val="1"/>
@@ -16074,19 +18181,19 @@
     </w:lvlOverride>
   </w:num>
   <w:num w:numId="10" w16cid:durableId="1406948550">
-    <w:abstractNumId w:val="8"/>
+    <w:abstractNumId w:val="9"/>
     <w:lvlOverride w:ilvl="0">
       <w:startOverride w:val="1"/>
     </w:lvlOverride>
   </w:num>
   <w:num w:numId="11" w16cid:durableId="460808568">
-    <w:abstractNumId w:val="11"/>
+    <w:abstractNumId w:val="12"/>
     <w:lvlOverride w:ilvl="0">
       <w:startOverride w:val="1"/>
     </w:lvlOverride>
   </w:num>
   <w:num w:numId="12" w16cid:durableId="233244041">
-    <w:abstractNumId w:val="10"/>
+    <w:abstractNumId w:val="11"/>
     <w:lvlOverride w:ilvl="0">
       <w:startOverride w:val="1"/>
     </w:lvlOverride>
@@ -16098,7 +18205,7 @@
     </w:lvlOverride>
   </w:num>
   <w:num w:numId="14" w16cid:durableId="1746797326">
-    <w:abstractNumId w:val="9"/>
+    <w:abstractNumId w:val="10"/>
     <w:lvlOverride w:ilvl="0">
       <w:startOverride w:val="2"/>
     </w:lvlOverride>
@@ -16107,6 +18214,12 @@
     <w:abstractNumId w:val="7"/>
     <w:lvlOverride w:ilvl="0">
       <w:startOverride w:val="3"/>
+    </w:lvlOverride>
+  </w:num>
+  <w:num w:numId="16" w16cid:durableId="1790854044">
+    <w:abstractNumId w:val="8"/>
+    <w:lvlOverride w:ilvl="0">
+      <w:startOverride w:val="1"/>
     </w:lvlOverride>
   </w:num>
 </w:numbering>
@@ -16512,7 +18625,7 @@
   <w:style w:type="paragraph" w:default="1" w:styleId="Normal">
     <w:name w:val="Normal"/>
     <w:qFormat/>
-    <w:rsid w:val="005F6B66"/>
+    <w:rsid w:val="00632D10"/>
   </w:style>
   <w:style w:type="paragraph" w:styleId="Heading1">
     <w:name w:val="heading 1"/>

</xml_diff>

<commit_message>
Add "Subpath Mismatches between Reverse Proxy and Backend Application Cause Crash / Asset Breakage" issue details
</commit_message>
<xml_diff>
--- a/Evidence/BlazorWebApp-BasePath-Validation.docx
+++ b/Evidence/BlazorWebApp-BasePath-Validation.docx
@@ -503,15 +503,7 @@
             </w:r>
             <w:r>
               <w:lastRenderedPageBreak/>
-              <w:t xml:space="preserve">scripts, </w:t>
-            </w:r>
-            <w:proofErr w:type="gramStart"/>
-            <w:r>
-              <w:t>stylesheets</w:t>
-            </w:r>
-            <w:proofErr w:type="gramEnd"/>
-            <w:r>
-              <w:t xml:space="preserve"> and images.</w:t>
+              <w:t>scripts, stylesheets and images.</w:t>
             </w:r>
           </w:p>
         </w:tc>
@@ -3221,13 +3213,8 @@
                   </w:r>
                   <w:r>
                     <w:br/>
-                    <w:t xml:space="preserve">Failure </w:t>
-                  </w:r>
-                  <w:proofErr w:type="gramStart"/>
-                  <w:r>
-                    <w:t>reason:.</w:t>
-                  </w:r>
-                  <w:proofErr w:type="gramEnd"/>
+                    <w:t>Failure reason:.</w:t>
+                  </w:r>
                   <w:r>
                     <w:br/>
                     <w:t> </w:t>
@@ -3887,13 +3874,8 @@
                   </w:r>
                   <w:r>
                     <w:br/>
-                    <w:t xml:space="preserve">Failure </w:t>
-                  </w:r>
-                  <w:proofErr w:type="gramStart"/>
-                  <w:r>
-                    <w:t>reason:.</w:t>
-                  </w:r>
-                  <w:proofErr w:type="gramEnd"/>
+                    <w:t>Failure reason:.</w:t>
+                  </w:r>
                   <w:r>
                     <w:br/>
                     <w:t> </w:t>
@@ -9464,15 +9446,7 @@
           </w:tcPr>
           <w:p>
             <w:r>
-              <w:t xml:space="preserve">A page that shows a </w:t>
-            </w:r>
-            <w:proofErr w:type="gramStart"/>
-            <w:r>
-              <w:t>URL it</w:t>
-            </w:r>
-            <w:proofErr w:type="gramEnd"/>
-            <w:r>
-              <w:t xml:space="preserve"> built itself from a relative path.</w:t>
+              <w:t>A page that shows a URL it built itself from a relative path.</w:t>
             </w:r>
           </w:p>
         </w:tc>
@@ -11469,12 +11443,10 @@
               <w:t xml:space="preserve"> /&gt;. The component lives in </w:t>
             </w:r>
             <w:proofErr w:type="spellStart"/>
-            <w:proofErr w:type="gramStart"/>
             <w:r>
               <w:t>Microsoft.AspNetCore.Components.Endpoints</w:t>
             </w:r>
             <w:proofErr w:type="spellEnd"/>
-            <w:proofErr w:type="gramEnd"/>
             <w:r>
               <w:t xml:space="preserve">, which the .NET </w:t>
             </w:r>
@@ -11732,33 +11704,15 @@
                 </w:p>
                 <w:p>
                   <w:r>
-                    <w:t xml:space="preserve">No build errors are encountered </w:t>
-                  </w:r>
-                  <w:proofErr w:type="gramStart"/>
-                  <w:r>
-                    <w:t>when @</w:t>
-                  </w:r>
-                  <w:proofErr w:type="gramEnd"/>
-                  <w:r>
-                    <w:t xml:space="preserve">using </w:t>
+                    <w:t xml:space="preserve">No build errors are encountered when @using </w:t>
                   </w:r>
                   <w:proofErr w:type="spellStart"/>
-                  <w:proofErr w:type="gramStart"/>
                   <w:r>
                     <w:t>Microsoft.AspNetCore.Components.Endpoints</w:t>
                   </w:r>
                   <w:proofErr w:type="spellEnd"/>
-                  <w:proofErr w:type="gramEnd"/>
-                  <w:r>
-                    <w:t xml:space="preserve"> </w:t>
-                  </w:r>
-                  <w:proofErr w:type="gramStart"/>
-                  <w:r>
-                    <w:t>is</w:t>
-                  </w:r>
-                  <w:proofErr w:type="gramEnd"/>
-                  <w:r>
-                    <w:t xml:space="preserve"> not added; the app is launched successfully with elements </w:t>
+                  <w:r>
+                    <w:t xml:space="preserve"> is not added; the app is launched successfully with elements </w:t>
                   </w:r>
                   <w:r>
                     <w:lastRenderedPageBreak/>
@@ -11866,33 +11820,15 @@
                 </w:p>
                 <w:p>
                   <w:r>
-                    <w:t xml:space="preserve">No build errors are encountered </w:t>
-                  </w:r>
-                  <w:proofErr w:type="gramStart"/>
-                  <w:r>
-                    <w:t>when @</w:t>
-                  </w:r>
-                  <w:proofErr w:type="gramEnd"/>
-                  <w:r>
-                    <w:t xml:space="preserve">using </w:t>
+                    <w:t xml:space="preserve">No build errors are encountered when @using </w:t>
                   </w:r>
                   <w:proofErr w:type="spellStart"/>
-                  <w:proofErr w:type="gramStart"/>
                   <w:r>
                     <w:t>Microsoft.AspNetCore.Components.Endpoints</w:t>
                   </w:r>
                   <w:proofErr w:type="spellEnd"/>
-                  <w:proofErr w:type="gramEnd"/>
-                  <w:r>
-                    <w:t xml:space="preserve"> </w:t>
-                  </w:r>
-                  <w:proofErr w:type="gramStart"/>
-                  <w:r>
-                    <w:t>is</w:t>
-                  </w:r>
-                  <w:proofErr w:type="gramEnd"/>
-                  <w:r>
-                    <w:t xml:space="preserve"> not added; the app is launched successfully with elements missing from the Head element.</w:t>
+                  <w:r>
+                    <w:t xml:space="preserve"> is not added; the app is launched successfully with elements missing from the Head element.</w:t>
                   </w:r>
                 </w:p>
               </w:tc>
@@ -12004,33 +11940,15 @@
                 </w:p>
                 <w:p>
                   <w:r>
-                    <w:t xml:space="preserve">No build errors are encountered </w:t>
-                  </w:r>
-                  <w:proofErr w:type="gramStart"/>
-                  <w:r>
-                    <w:t>when @</w:t>
-                  </w:r>
-                  <w:proofErr w:type="gramEnd"/>
-                  <w:r>
-                    <w:t xml:space="preserve">using </w:t>
+                    <w:t xml:space="preserve">No build errors are encountered when @using </w:t>
                   </w:r>
                   <w:proofErr w:type="spellStart"/>
-                  <w:proofErr w:type="gramStart"/>
                   <w:r>
                     <w:t>Microsoft.AspNetCore.Components.Endpoints</w:t>
                   </w:r>
                   <w:proofErr w:type="spellEnd"/>
-                  <w:proofErr w:type="gramEnd"/>
-                  <w:r>
-                    <w:t xml:space="preserve"> </w:t>
-                  </w:r>
-                  <w:proofErr w:type="gramStart"/>
-                  <w:r>
-                    <w:t>is</w:t>
-                  </w:r>
-                  <w:proofErr w:type="gramEnd"/>
-                  <w:r>
-                    <w:t xml:space="preserve"> not added; the app is launched successfully with elements missing from the Head element.</w:t>
+                  <w:r>
+                    <w:t xml:space="preserve"> is not added; the app is launched successfully with elements missing from the Head element.</w:t>
                   </w:r>
                 </w:p>
               </w:tc>
@@ -12197,15 +12115,7 @@
             </w:r>
             <w:r>
               <w:lastRenderedPageBreak/>
-              <w:t xml:space="preserve">casing of the requested path, which is the behavior this scenario is mainly about, and it does not mention the namespace the component lives in. Say so in the report if either gap </w:t>
-            </w:r>
-            <w:proofErr w:type="gramStart"/>
-            <w:r>
-              <w:t>cost</w:t>
-            </w:r>
-            <w:proofErr w:type="gramEnd"/>
-            <w:r>
-              <w:t xml:space="preserve"> you time.</w:t>
+              <w:t>casing of the requested path, which is the behavior this scenario is mainly about, and it does not mention the namespace the component lives in. Say so in the report if either gap cost you time.</w:t>
             </w:r>
           </w:p>
         </w:tc>
@@ -12339,23 +12249,7 @@
           <w:b/>
           <w:bCs/>
         </w:rPr>
-        <w:t xml:space="preserve">IIS </w:t>
-      </w:r>
-      <w:proofErr w:type="gramStart"/>
-      <w:r>
-        <w:rPr>
-          <w:b/>
-          <w:bCs/>
-        </w:rPr>
-        <w:t>Deployment (.</w:t>
-      </w:r>
-      <w:proofErr w:type="gramEnd"/>
-      <w:r>
-        <w:rPr>
-          <w:b/>
-          <w:bCs/>
-        </w:rPr>
-        <w:t xml:space="preserve">zip): </w:t>
+        <w:t xml:space="preserve">IIS Deployment (.zip): </w:t>
       </w:r>
       <w:r>
         <w:t>Extracting this file provides the verification logs for the corresponding render mode. It includes a video recording tracking the first 10 testing scenarios alongside a complete network log (.</w:t>
@@ -12385,23 +12279,7 @@
           <w:b/>
           <w:bCs/>
         </w:rPr>
-        <w:t xml:space="preserve">Deployed Behind </w:t>
-      </w:r>
-      <w:proofErr w:type="gramStart"/>
-      <w:r>
-        <w:rPr>
-          <w:b/>
-          <w:bCs/>
-        </w:rPr>
-        <w:t>Proxy (.</w:t>
-      </w:r>
-      <w:proofErr w:type="gramEnd"/>
-      <w:r>
-        <w:rPr>
-          <w:b/>
-          <w:bCs/>
-        </w:rPr>
-        <w:t xml:space="preserve">zip): </w:t>
+        <w:t xml:space="preserve">Deployed Behind Proxy (.zip): </w:t>
       </w:r>
       <w:r>
         <w:t>Extracting this file provides the proxy validation evidence. It includes a video recording tracking the first 9 testing scenarios, the reverse proxy routing rules (</w:t>
@@ -13634,12 +13512,10 @@
         <w:t xml:space="preserve"> /&gt; component in a Blazor Web App upgraded from .NET 10 to .NET 11, the application builds and launches successfully with only a warning—even when the required @using </w:t>
       </w:r>
       <w:proofErr w:type="spellStart"/>
-      <w:proofErr w:type="gramStart"/>
       <w:r>
         <w:t>Microsoft.AspNetCore.Components.Endpoints</w:t>
       </w:r>
       <w:proofErr w:type="spellEnd"/>
-      <w:proofErr w:type="gramEnd"/>
       <w:r>
         <w:t xml:space="preserve"> namespace is missing from _</w:t>
       </w:r>
@@ -13654,15 +13530,7 @@
     </w:p>
     <w:p>
       <w:r>
-        <w:t xml:space="preserve">No build errors are reported, and the current documentation lacks explicit instructions regarding this </w:t>
-      </w:r>
-      <w:proofErr w:type="gramStart"/>
-      <w:r>
-        <w:t>setup</w:t>
-      </w:r>
-      <w:proofErr w:type="gramEnd"/>
-      <w:r>
-        <w:t>. Because the component is unrecognized by the compiler, the literal &lt;</w:t>
+        <w:t>No build errors are reported, and the current documentation lacks explicit instructions regarding this setup. Because the component is unrecognized by the compiler, the literal &lt;</w:t>
       </w:r>
       <w:proofErr w:type="spellStart"/>
       <w:r>
@@ -13670,15 +13538,7 @@
       </w:r>
       <w:proofErr w:type="spellEnd"/>
       <w:r>
-        <w:t xml:space="preserve"> /&gt; tag is </w:t>
-      </w:r>
-      <w:proofErr w:type="gramStart"/>
-      <w:r>
-        <w:t>outputted</w:t>
-      </w:r>
-      <w:proofErr w:type="gramEnd"/>
-      <w:r>
-        <w:t xml:space="preserve"> directly to the browser. This invalid HTML structure causes the browser to prematurely close the &lt;head&gt; section and force all subsequent expected &lt;head&gt; elements into the &lt;body&gt; tag at runtime.</w:t>
+        <w:t xml:space="preserve"> /&gt; tag is outputted directly to the browser. This invalid HTML structure causes the browser to prematurely close the &lt;head&gt; section and force all subsequent expected &lt;head&gt; elements into the &lt;body&gt; tag at runtime.</w:t>
       </w:r>
       <w:r>
         <w:br/>
@@ -13837,12 +13697,10 @@
         <w:t>="</w:t>
       </w:r>
       <w:proofErr w:type="spellStart"/>
-      <w:proofErr w:type="gramStart"/>
       <w:r>
         <w:t>Microsoft.NET.Sdk.Web</w:t>
       </w:r>
       <w:proofErr w:type="spellEnd"/>
-      <w:proofErr w:type="gramEnd"/>
       <w:r>
         <w:t>"&gt;</w:t>
       </w:r>
@@ -14006,12 +13864,10 @@
         <w:t xml:space="preserve">@using </w:t>
       </w:r>
       <w:proofErr w:type="spellStart"/>
-      <w:proofErr w:type="gramStart"/>
       <w:r>
         <w:t>Microsoft.AspNetCore.Components.Endpoints</w:t>
       </w:r>
       <w:proofErr w:type="spellEnd"/>
-      <w:proofErr w:type="gramEnd"/>
     </w:p>
     <w:p/>
     <w:p>
@@ -14051,12 +13907,10 @@
         <w:t xml:space="preserve">The build should fail with a clear compiler error indicating that the </w:t>
       </w:r>
       <w:proofErr w:type="spellStart"/>
-      <w:proofErr w:type="gramStart"/>
       <w:r>
         <w:t>Microsoft.AspNetCore.Components.Endpoints</w:t>
       </w:r>
       <w:proofErr w:type="spellEnd"/>
-      <w:proofErr w:type="gramEnd"/>
       <w:r>
         <w:t xml:space="preserve"> namespace is required to use the &lt;</w:t>
       </w:r>
@@ -14198,15 +14052,7 @@
       </w:r>
       <w:proofErr w:type="spellEnd"/>
       <w:r>
-        <w:t xml:space="preserve"> /</w:t>
-      </w:r>
-      <w:proofErr w:type="gramStart"/>
-      <w:r>
-        <w:t>&gt; component</w:t>
-      </w:r>
-      <w:proofErr w:type="gramEnd"/>
-      <w:r>
-        <w:t xml:space="preserve"> incorrectly falls back to the backend application's casing instead of preserving the casing of the public request path.</w:t>
+        <w:t xml:space="preserve"> /&gt; component incorrectly falls back to the backend application's casing instead of preserving the casing of the public request path.</w:t>
       </w:r>
     </w:p>
     <w:p>
@@ -14248,15 +14094,7 @@
     </w:p>
     <w:p>
       <w:r>
-        <w:t xml:space="preserve">When an IIS reverse proxy is configured to forward traffic from a public URL with a specific casing to a backend application path, </w:t>
-      </w:r>
-      <w:proofErr w:type="gramStart"/>
-      <w:r>
-        <w:t>casing</w:t>
-      </w:r>
-      <w:proofErr w:type="gramEnd"/>
-      <w:r>
-        <w:t xml:space="preserve"> variations in the incoming request are ignored. For example, requests arriving through the reverse proxy at:</w:t>
+        <w:t>When an IIS reverse proxy is configured to forward traffic from a public URL with a specific casing to a backend application path, casing variations in the incoming request are ignored. For example, requests arriving through the reverse proxy at:</w:t>
       </w:r>
     </w:p>
     <w:p>
@@ -14469,15 +14307,7 @@
         </w:numPr>
       </w:pPr>
       <w:r>
-        <w:t xml:space="preserve">Physical path: Map it </w:t>
-      </w:r>
-      <w:proofErr w:type="gramStart"/>
-      <w:r>
-        <w:t>to</w:t>
-      </w:r>
-      <w:proofErr w:type="gramEnd"/>
-      <w:r>
-        <w:t xml:space="preserve"> a new empty folder, since the actual application will run inside a sub-path application node.</w:t>
+        <w:t>Physical path: Map it to a new empty folder, since the actual application will run inside a sub-path application node.</w:t>
       </w:r>
     </w:p>
     <w:p>
@@ -14555,15 +14385,7 @@
         </w:numPr>
       </w:pPr>
       <w:r>
-        <w:t>A self-</w:t>
-      </w:r>
-      <w:proofErr w:type="gramStart"/>
-      <w:r>
-        <w:t>signed</w:t>
-      </w:r>
-      <w:proofErr w:type="gramEnd"/>
-      <w:r>
-        <w:t xml:space="preserve"> certificate can be used for local validation.</w:t>
+        <w:t>A self-signed certificate can be used for local validation.</w:t>
       </w:r>
     </w:p>
     <w:p>
@@ -14755,15 +14577,7 @@
       </w:pPr>
       <w:r>
         <w:lastRenderedPageBreak/>
-        <w:t xml:space="preserve">Physical path: Map it </w:t>
-      </w:r>
-      <w:proofErr w:type="gramStart"/>
-      <w:r>
-        <w:t>to</w:t>
-      </w:r>
-      <w:proofErr w:type="gramEnd"/>
-      <w:r>
-        <w:t xml:space="preserve"> a new empty folder.</w:t>
+        <w:t>Physical path: Map it to a new empty folder.</w:t>
       </w:r>
     </w:p>
     <w:p>
@@ -14840,15 +14654,7 @@
         </w:numPr>
       </w:pPr>
       <w:r>
-        <w:t>A self-</w:t>
-      </w:r>
-      <w:proofErr w:type="gramStart"/>
-      <w:r>
-        <w:t>signed</w:t>
-      </w:r>
-      <w:proofErr w:type="gramEnd"/>
-      <w:r>
-        <w:t xml:space="preserve"> certificate can be used for local validation.</w:t>
+        <w:t>A self-signed certificate can be used for local validation.</w:t>
       </w:r>
     </w:p>
     <w:p>
@@ -14952,15 +14758,7 @@
         <w:t>Physical path:</w:t>
       </w:r>
       <w:r>
-        <w:t xml:space="preserve"> Map it </w:t>
-      </w:r>
-      <w:proofErr w:type="gramStart"/>
-      <w:r>
-        <w:t>to</w:t>
-      </w:r>
-      <w:proofErr w:type="gramEnd"/>
-      <w:r>
-        <w:t xml:space="preserve"> a new empty folder.</w:t>
+        <w:t xml:space="preserve"> Map it to a new empty folder.</w:t>
       </w:r>
     </w:p>
     <w:p>
@@ -15072,12 +14870,10 @@
         <w:t xml:space="preserve">    &lt;</w:t>
       </w:r>
       <w:proofErr w:type="spellStart"/>
-      <w:proofErr w:type="gramStart"/>
       <w:r>
         <w:t>system.webServer</w:t>
       </w:r>
       <w:proofErr w:type="spellEnd"/>
-      <w:proofErr w:type="gramEnd"/>
       <w:r>
         <w:t>&gt;</w:t>
       </w:r>
@@ -15116,15 +14912,7 @@
       </w:r>
       <w:proofErr w:type="spellEnd"/>
       <w:r>
-        <w:t>="</w:t>
-      </w:r>
-      <w:proofErr w:type="gramStart"/>
-      <w:r>
-        <w:t>(.*</w:t>
-      </w:r>
-      <w:proofErr w:type="gramEnd"/>
-      <w:r>
-        <w:t>)" /&gt;</w:t>
+        <w:t>="(.*)" /&gt;</w:t>
       </w:r>
     </w:p>
     <w:p>
@@ -15152,12 +14940,10 @@
         <w:t xml:space="preserve">    &lt;/</w:t>
       </w:r>
       <w:proofErr w:type="spellStart"/>
-      <w:proofErr w:type="gramStart"/>
       <w:r>
         <w:t>system.webServer</w:t>
       </w:r>
       <w:proofErr w:type="spellEnd"/>
-      <w:proofErr w:type="gramEnd"/>
       <w:r>
         <w:t>&gt;</w:t>
       </w:r>
@@ -15241,15 +15027,7 @@
         </w:numPr>
       </w:pPr>
       <w:r>
-        <w:t xml:space="preserve">Open the browser developer tools and inspect the </w:t>
-      </w:r>
-      <w:proofErr w:type="gramStart"/>
-      <w:r>
-        <w:t>rendered HTML</w:t>
-      </w:r>
-      <w:proofErr w:type="gramEnd"/>
-      <w:r>
-        <w:t xml:space="preserve"> within the &lt;head&gt; element.</w:t>
+        <w:t>Open the browser developer tools and inspect the rendered HTML within the &lt;head&gt; element.</w:t>
       </w:r>
       <w:r>
         <w:br/>
@@ -15636,6 +15414,9 @@
     </w:p>
     <w:p>
       <w:r>
+        <w:rPr>
+          <w:noProof/>
+        </w:rPr>
         <w:drawing>
           <wp:inline distT="0" distB="0" distL="0" distR="0" wp14:anchorId="210388A4" wp14:editId="50EAEDC7">
             <wp:extent cx="3181350" cy="1143000"/>
@@ -16047,6 +15828,741 @@
       </w:hyperlink>
     </w:p>
     <w:p/>
+    <w:p>
+      <w:pPr>
+        <w:rPr>
+          <w:b/>
+          <w:bCs/>
+        </w:rPr>
+      </w:pPr>
+      <w:r>
+        <w:rPr>
+          <w:b/>
+          <w:bCs/>
+        </w:rPr>
+        <w:t>Observation</w:t>
+      </w:r>
+    </w:p>
+    <w:p>
+      <w:r>
+        <w:rPr>
+          <w:b/>
+          <w:bCs/>
+        </w:rPr>
+        <w:t xml:space="preserve">1. </w:t>
+      </w:r>
+      <w:proofErr w:type="spellStart"/>
+      <w:r>
+        <w:rPr>
+          <w:b/>
+          <w:bCs/>
+        </w:rPr>
+        <w:t>Subpath</w:t>
+      </w:r>
+      <w:proofErr w:type="spellEnd"/>
+      <w:r>
+        <w:rPr>
+          <w:b/>
+          <w:bCs/>
+        </w:rPr>
+        <w:t xml:space="preserve"> Mismatches between Reverse Proxy and Backend Application Cause Crash / Asset Breakage</w:t>
+      </w:r>
+    </w:p>
+    <w:p>
+      <w:r>
+        <w:t> </w:t>
+      </w:r>
+    </w:p>
+    <w:p>
+      <w:r>
+        <w:rPr>
+          <w:b/>
+          <w:bCs/>
+        </w:rPr>
+        <w:t>Short Summary</w:t>
+      </w:r>
+    </w:p>
+    <w:p>
+      <w:r>
+        <w:t xml:space="preserve">Deploying a Blazor application at the root domain while hosting it behind a reverse proxy using a </w:t>
+      </w:r>
+      <w:proofErr w:type="spellStart"/>
+      <w:r>
+        <w:t>subpath</w:t>
+      </w:r>
+      <w:proofErr w:type="spellEnd"/>
+      <w:r>
+        <w:t xml:space="preserve"> (e.g., /</w:t>
+      </w:r>
+      <w:proofErr w:type="spellStart"/>
+      <w:r>
+        <w:t>staticssr</w:t>
+      </w:r>
+      <w:proofErr w:type="spellEnd"/>
+      <w:r>
+        <w:t xml:space="preserve">/) causes the application to break. Static assets fail to load, </w:t>
+      </w:r>
+      <w:r>
+        <w:lastRenderedPageBreak/>
+        <w:t xml:space="preserve">and routing fails, causing a crash across all render modes: </w:t>
+      </w:r>
+      <w:r>
+        <w:rPr>
+          <w:b/>
+          <w:bCs/>
+        </w:rPr>
+        <w:t>Static SSR</w:t>
+      </w:r>
+      <w:r>
+        <w:t xml:space="preserve">, </w:t>
+      </w:r>
+      <w:r>
+        <w:rPr>
+          <w:b/>
+          <w:bCs/>
+        </w:rPr>
+        <w:t>Interactive Server</w:t>
+      </w:r>
+      <w:r>
+        <w:t xml:space="preserve">, and </w:t>
+      </w:r>
+      <w:r>
+        <w:rPr>
+          <w:b/>
+          <w:bCs/>
+        </w:rPr>
+        <w:t xml:space="preserve">Interactive </w:t>
+      </w:r>
+      <w:proofErr w:type="spellStart"/>
+      <w:r>
+        <w:rPr>
+          <w:b/>
+          <w:bCs/>
+        </w:rPr>
+        <w:t>WebAssembly</w:t>
+      </w:r>
+      <w:proofErr w:type="spellEnd"/>
+      <w:r>
+        <w:t>.</w:t>
+      </w:r>
+    </w:p>
+    <w:p>
+      <w:r>
+        <w:rPr>
+          <w:b/>
+          <w:bCs/>
+        </w:rPr>
+        <w:t>What Happened</w:t>
+      </w:r>
+    </w:p>
+    <w:p>
+      <w:r>
+        <w:t xml:space="preserve">When the </w:t>
+      </w:r>
+      <w:proofErr w:type="spellStart"/>
+      <w:r>
+        <w:t>subpath</w:t>
+      </w:r>
+      <w:proofErr w:type="spellEnd"/>
+      <w:r>
+        <w:t xml:space="preserve"> configured in the reverse proxy does not match the base path of the backend Blazor application, the application cannot resolve its static assets or routing endpoints.</w:t>
+      </w:r>
+    </w:p>
+    <w:p>
+      <w:r>
+        <w:t>For example:</w:t>
+      </w:r>
+    </w:p>
+    <w:p>
+      <w:pPr>
+        <w:numPr>
+          <w:ilvl w:val="0"/>
+          <w:numId w:val="17"/>
+        </w:numPr>
+      </w:pPr>
+      <w:r>
+        <w:rPr>
+          <w:b/>
+          <w:bCs/>
+        </w:rPr>
+        <w:t xml:space="preserve">Reverse Proxy URL: </w:t>
+      </w:r>
+      <w:hyperlink r:id="rId51" w:history="1">
+        <w:r>
+          <w:rPr>
+            <w:rStyle w:val="Hyperlink"/>
+          </w:rPr>
+          <w:t>https://reverse.proxy.com/staticssr/</w:t>
+        </w:r>
+      </w:hyperlink>
+    </w:p>
+    <w:p>
+      <w:pPr>
+        <w:numPr>
+          <w:ilvl w:val="0"/>
+          <w:numId w:val="17"/>
+        </w:numPr>
+      </w:pPr>
+      <w:r>
+        <w:rPr>
+          <w:b/>
+          <w:bCs/>
+        </w:rPr>
+        <w:t xml:space="preserve">Backend App URL: </w:t>
+      </w:r>
+      <w:hyperlink r:id="rId52" w:history="1">
+        <w:r>
+          <w:rPr>
+            <w:rStyle w:val="Hyperlink"/>
+          </w:rPr>
+          <w:t>https://blazorwebapp.basepathvalidation.com/</w:t>
+        </w:r>
+      </w:hyperlink>
+    </w:p>
+    <w:p>
+      <w:r>
+        <w:t> </w:t>
+      </w:r>
+    </w:p>
+    <w:p>
+      <w:r>
+        <w:rPr>
+          <w:b/>
+          <w:bCs/>
+        </w:rPr>
+        <w:t>Attempted Configurations (IIS Rewrite Rules)</w:t>
+      </w:r>
+    </w:p>
+    <w:p>
+      <w:r>
+        <w:t xml:space="preserve">The following patterns were tried in the reverse proxy's </w:t>
+      </w:r>
+      <w:proofErr w:type="spellStart"/>
+      <w:r>
+        <w:t>web.config</w:t>
+      </w:r>
+      <w:proofErr w:type="spellEnd"/>
+      <w:r>
+        <w:t xml:space="preserve"> to match and rewrite requests, but </w:t>
+      </w:r>
+      <w:r>
+        <w:rPr>
+          <w:b/>
+          <w:bCs/>
+        </w:rPr>
+        <w:t>both failed</w:t>
+      </w:r>
+      <w:r>
+        <w:t>:</w:t>
+      </w:r>
+    </w:p>
+    <w:p>
+      <w:r>
+        <w:rPr>
+          <w:b/>
+          <w:bCs/>
+        </w:rPr>
+        <w:t>Pattern 1: (.*)</w:t>
+      </w:r>
+    </w:p>
+    <w:p>
+      <w:r>
+        <w:t>&lt;?xml version="1.0" encoding="UTF-8"?&gt;</w:t>
+      </w:r>
+      <w:r>
+        <w:br/>
+        <w:t>&lt;configuration&gt;</w:t>
+      </w:r>
+      <w:r>
+        <w:br/>
+        <w:t xml:space="preserve">    &lt;</w:t>
+      </w:r>
+      <w:proofErr w:type="spellStart"/>
+      <w:r>
+        <w:t>system.webServer</w:t>
+      </w:r>
+      <w:proofErr w:type="spellEnd"/>
+      <w:r>
+        <w:t>&gt;</w:t>
+      </w:r>
+      <w:r>
+        <w:br/>
+        <w:t xml:space="preserve">        &lt;rewrite&gt;</w:t>
+      </w:r>
+      <w:r>
+        <w:br/>
+        <w:t xml:space="preserve">            &lt;rules&gt;</w:t>
+      </w:r>
+      <w:r>
+        <w:br/>
+        <w:t xml:space="preserve">                &lt;rule name="ReverseProxyInboundRule1" </w:t>
+      </w:r>
+      <w:proofErr w:type="spellStart"/>
+      <w:r>
+        <w:t>stopProcessing</w:t>
+      </w:r>
+      <w:proofErr w:type="spellEnd"/>
+      <w:r>
+        <w:t>="true"&gt;</w:t>
+      </w:r>
+      <w:r>
+        <w:br/>
+        <w:t xml:space="preserve">                    &lt;match </w:t>
+      </w:r>
+      <w:proofErr w:type="spellStart"/>
+      <w:r>
+        <w:t>url</w:t>
+      </w:r>
+      <w:proofErr w:type="spellEnd"/>
+      <w:r>
+        <w:t>="(.*)" /&gt;</w:t>
+      </w:r>
+      <w:r>
+        <w:br/>
+        <w:t xml:space="preserve">                    &lt;action type="Rewrite" </w:t>
+      </w:r>
+      <w:proofErr w:type="spellStart"/>
+      <w:r>
+        <w:t>url</w:t>
+      </w:r>
+      <w:proofErr w:type="spellEnd"/>
+      <w:r>
+        <w:t>="https://blazorwebapp.basepathvalidation.com/{R:1}" /&gt;</w:t>
+      </w:r>
+      <w:r>
+        <w:br/>
+        <w:t xml:space="preserve">                &lt;/rule&gt;</w:t>
+      </w:r>
+      <w:r>
+        <w:br/>
+        <w:t xml:space="preserve">            &lt;/rules&gt;</w:t>
+      </w:r>
+      <w:r>
+        <w:br/>
+        <w:t xml:space="preserve">        &lt;/rewrite&gt;</w:t>
+      </w:r>
+      <w:r>
+        <w:br/>
+        <w:t xml:space="preserve">    &lt;/</w:t>
+      </w:r>
+      <w:proofErr w:type="spellStart"/>
+      <w:r>
+        <w:t>system.webServer</w:t>
+      </w:r>
+      <w:proofErr w:type="spellEnd"/>
+      <w:r>
+        <w:t>&gt;</w:t>
+      </w:r>
+      <w:r>
+        <w:br/>
+        <w:t>&lt;/configuration&gt;</w:t>
+      </w:r>
+    </w:p>
+    <w:p>
+      <w:r>
+        <w:rPr>
+          <w:b/>
+          <w:bCs/>
+        </w:rPr>
+        <w:t>Pattern 2: ^</w:t>
+      </w:r>
+      <w:proofErr w:type="spellStart"/>
+      <w:r>
+        <w:rPr>
+          <w:b/>
+          <w:bCs/>
+        </w:rPr>
+        <w:t>staticssr</w:t>
+      </w:r>
+      <w:proofErr w:type="spellEnd"/>
+      <w:r>
+        <w:rPr>
+          <w:b/>
+          <w:bCs/>
+        </w:rPr>
+        <w:t>/(.*)</w:t>
+      </w:r>
+    </w:p>
+    <w:p>
+      <w:r>
+        <w:t>&lt;?xml version="1.0" encoding="UTF-8"?&gt;</w:t>
+      </w:r>
+      <w:r>
+        <w:br/>
+        <w:t>&lt;configuration&gt;</w:t>
+      </w:r>
+      <w:r>
+        <w:br/>
+        <w:t xml:space="preserve">    &lt;</w:t>
+      </w:r>
+      <w:proofErr w:type="spellStart"/>
+      <w:r>
+        <w:t>system.webServer</w:t>
+      </w:r>
+      <w:proofErr w:type="spellEnd"/>
+      <w:r>
+        <w:t>&gt;</w:t>
+      </w:r>
+      <w:r>
+        <w:br/>
+      </w:r>
+      <w:r>
+        <w:lastRenderedPageBreak/>
+        <w:t xml:space="preserve">        &lt;rewrite&gt;</w:t>
+      </w:r>
+      <w:r>
+        <w:br/>
+        <w:t xml:space="preserve">            &lt;rules&gt;</w:t>
+      </w:r>
+      <w:r>
+        <w:br/>
+        <w:t xml:space="preserve">                &lt;rule name="ReverseProxyInboundRule1" </w:t>
+      </w:r>
+      <w:proofErr w:type="spellStart"/>
+      <w:r>
+        <w:t>stopProcessing</w:t>
+      </w:r>
+      <w:proofErr w:type="spellEnd"/>
+      <w:r>
+        <w:t>="true"&gt;</w:t>
+      </w:r>
+      <w:r>
+        <w:br/>
+        <w:t xml:space="preserve">                    &lt;match </w:t>
+      </w:r>
+      <w:proofErr w:type="spellStart"/>
+      <w:r>
+        <w:t>url</w:t>
+      </w:r>
+      <w:proofErr w:type="spellEnd"/>
+      <w:r>
+        <w:t>="^</w:t>
+      </w:r>
+      <w:proofErr w:type="spellStart"/>
+      <w:r>
+        <w:t>staticssr</w:t>
+      </w:r>
+      <w:proofErr w:type="spellEnd"/>
+      <w:r>
+        <w:t>/(.*)" /&gt;</w:t>
+      </w:r>
+      <w:r>
+        <w:br/>
+        <w:t xml:space="preserve">                    &lt;action type="Rewrite" </w:t>
+      </w:r>
+      <w:proofErr w:type="spellStart"/>
+      <w:r>
+        <w:t>url</w:t>
+      </w:r>
+      <w:proofErr w:type="spellEnd"/>
+      <w:r>
+        <w:t>="https://blazorwebapp.basepathvalidation.com/{R:1}" /&gt;</w:t>
+      </w:r>
+      <w:r>
+        <w:br/>
+        <w:t xml:space="preserve">                &lt;/rule&gt;</w:t>
+      </w:r>
+      <w:r>
+        <w:br/>
+        <w:t xml:space="preserve">            &lt;/rules&gt;</w:t>
+      </w:r>
+      <w:r>
+        <w:br/>
+        <w:t xml:space="preserve">        &lt;/rewrite&gt;</w:t>
+      </w:r>
+      <w:r>
+        <w:br/>
+        <w:t xml:space="preserve">    &lt;/</w:t>
+      </w:r>
+      <w:proofErr w:type="spellStart"/>
+      <w:r>
+        <w:t>system.webServer</w:t>
+      </w:r>
+      <w:proofErr w:type="spellEnd"/>
+      <w:r>
+        <w:t>&gt;</w:t>
+      </w:r>
+      <w:r>
+        <w:br/>
+        <w:t>&lt;/configuration&gt;</w:t>
+      </w:r>
+    </w:p>
+    <w:p>
+      <w:r>
+        <w:t> </w:t>
+      </w:r>
+    </w:p>
+    <w:p>
+      <w:r>
+        <w:rPr>
+          <w:b/>
+          <w:bCs/>
+        </w:rPr>
+        <w:t>What Was Expected Instead</w:t>
+      </w:r>
+    </w:p>
+    <w:p>
+      <w:r>
+        <w:t xml:space="preserve">The Blazor application should either load successfully behind a reverse proxy that uses a different </w:t>
+      </w:r>
+      <w:proofErr w:type="spellStart"/>
+      <w:r>
+        <w:t>subpath</w:t>
+      </w:r>
+      <w:proofErr w:type="spellEnd"/>
+      <w:r>
+        <w:t>, or the documentation should explicitly state that this scenario is not supported.</w:t>
+      </w:r>
+    </w:p>
+    <w:p/>
+    <w:p>
+      <w:r>
+        <w:rPr>
+          <w:b/>
+          <w:bCs/>
+        </w:rPr>
+        <w:t>Steps to Reproduce</w:t>
+      </w:r>
+    </w:p>
+    <w:p>
+      <w:pPr>
+        <w:numPr>
+          <w:ilvl w:val="0"/>
+          <w:numId w:val="18"/>
+        </w:numPr>
+        <w:rPr>
+          <w:b/>
+          <w:bCs/>
+        </w:rPr>
+      </w:pPr>
+      <w:r>
+        <w:rPr>
+          <w:b/>
+          <w:bCs/>
+        </w:rPr>
+        <w:t>Deploy the backend Blazor Web App</w:t>
+      </w:r>
+      <w:r>
+        <w:t xml:space="preserve"> directly to a root domain without a </w:t>
+      </w:r>
+      <w:proofErr w:type="spellStart"/>
+      <w:r>
+        <w:t>subpath</w:t>
+      </w:r>
+      <w:proofErr w:type="spellEnd"/>
+      <w:r>
+        <w:t xml:space="preserve"> (e.g., </w:t>
+      </w:r>
+      <w:hyperlink r:id="rId53" w:history="1">
+        <w:r>
+          <w:rPr>
+            <w:rStyle w:val="Hyperlink"/>
+            <w:b/>
+            <w:bCs/>
+          </w:rPr>
+          <w:t>https://blazorwebapp.basepathvalidation.com/</w:t>
+        </w:r>
+      </w:hyperlink>
+      <w:r>
+        <w:t>).</w:t>
+      </w:r>
+    </w:p>
+    <w:p>
+      <w:pPr>
+        <w:numPr>
+          <w:ilvl w:val="0"/>
+          <w:numId w:val="18"/>
+        </w:numPr>
+        <w:rPr>
+          <w:b/>
+          <w:bCs/>
+        </w:rPr>
+      </w:pPr>
+      <w:r>
+        <w:rPr>
+          <w:b/>
+          <w:bCs/>
+        </w:rPr>
+        <w:t>Configure a reverse proxy</w:t>
+      </w:r>
+      <w:r>
+        <w:t xml:space="preserve"> </w:t>
+      </w:r>
+      <w:r>
+        <w:t xml:space="preserve">with </w:t>
+      </w:r>
+      <w:proofErr w:type="spellStart"/>
+      <w:r>
+        <w:t>subpath</w:t>
+      </w:r>
+      <w:proofErr w:type="spellEnd"/>
+      <w:r>
+        <w:t xml:space="preserve"> (e.g.,</w:t>
+      </w:r>
+      <w:r>
+        <w:t xml:space="preserve"> </w:t>
+      </w:r>
+      <w:hyperlink r:id="rId54" w:history="1">
+        <w:r>
+          <w:rPr>
+            <w:rStyle w:val="Hyperlink"/>
+            <w:b/>
+            <w:bCs/>
+          </w:rPr>
+          <w:t>https://reverse.proxy.com/staticssr/</w:t>
+        </w:r>
+      </w:hyperlink>
+      <w:r>
+        <w:t>).</w:t>
+      </w:r>
+    </w:p>
+    <w:p>
+      <w:pPr>
+        <w:numPr>
+          <w:ilvl w:val="0"/>
+          <w:numId w:val="18"/>
+        </w:numPr>
+        <w:rPr>
+          <w:b/>
+          <w:bCs/>
+        </w:rPr>
+      </w:pPr>
+      <w:r>
+        <w:rPr>
+          <w:b/>
+          <w:bCs/>
+        </w:rPr>
+        <w:t>Add a rewrite rule</w:t>
+      </w:r>
+      <w:r>
+        <w:t xml:space="preserve"> </w:t>
+      </w:r>
+      <w:r>
+        <w:t>by using reverse</w:t>
+      </w:r>
+      <w:r>
+        <w:t xml:space="preserve"> proxy </w:t>
+      </w:r>
+      <w:r>
+        <w:t xml:space="preserve">rule template </w:t>
+      </w:r>
+      <w:r>
+        <w:t>to forward requests from proxy to the backend root domain.</w:t>
+      </w:r>
+    </w:p>
+    <w:p>
+      <w:pPr>
+        <w:numPr>
+          <w:ilvl w:val="0"/>
+          <w:numId w:val="18"/>
+        </w:numPr>
+        <w:rPr>
+          <w:b/>
+          <w:bCs/>
+        </w:rPr>
+      </w:pPr>
+      <w:r>
+        <w:rPr>
+          <w:b/>
+          <w:bCs/>
+        </w:rPr>
+        <w:t>Launch the application</w:t>
+      </w:r>
+      <w:r>
+        <w:t xml:space="preserve"> via the proxy URL (</w:t>
+      </w:r>
+      <w:hyperlink r:id="rId55" w:history="1">
+        <w:r>
+          <w:rPr>
+            <w:rStyle w:val="Hyperlink"/>
+            <w:b/>
+            <w:bCs/>
+          </w:rPr>
+          <w:t>https://reverse.proxy.com/staticssr/</w:t>
+        </w:r>
+      </w:hyperlink>
+      <w:r>
+        <w:t>).</w:t>
+      </w:r>
+    </w:p>
+    <w:p>
+      <w:pPr>
+        <w:numPr>
+          <w:ilvl w:val="0"/>
+          <w:numId w:val="18"/>
+        </w:numPr>
+        <w:rPr>
+          <w:b/>
+          <w:bCs/>
+        </w:rPr>
+      </w:pPr>
+      <w:r>
+        <w:rPr>
+          <w:b/>
+          <w:bCs/>
+        </w:rPr>
+        <w:t>Observe the failure:</w:t>
+      </w:r>
+      <w:r>
+        <w:t xml:space="preserve"> The page layout may load without </w:t>
+      </w:r>
+      <w:r>
+        <w:t>styles;</w:t>
+      </w:r>
+      <w:r>
+        <w:t xml:space="preserve"> the console will show 404 errors for blazor.web.js and other assets.</w:t>
+      </w:r>
+    </w:p>
+    <w:p>
+      <w:r>
+        <w:t> </w:t>
+      </w:r>
+    </w:p>
+    <w:p>
+      <w:r>
+        <w:rPr>
+          <w:b/>
+          <w:bCs/>
+        </w:rPr>
+        <w:t xml:space="preserve">Evidence: </w:t>
+      </w:r>
+      <w:hyperlink r:id="rId56" w:history="1">
+        <w:r>
+          <w:rPr>
+            <w:rStyle w:val="Hyperlink"/>
+          </w:rPr>
+          <w:t>BlazorWebApp-BasePath-Validation/Evidence/net11-new-app/ProxyBackendSubpathMismatch at main · BharatRamsf3693/</w:t>
+        </w:r>
+        <w:proofErr w:type="spellStart"/>
+        <w:r>
+          <w:rPr>
+            <w:rStyle w:val="Hyperlink"/>
+          </w:rPr>
+          <w:t>BlazorWebApp</w:t>
+        </w:r>
+        <w:proofErr w:type="spellEnd"/>
+        <w:r>
+          <w:rPr>
+            <w:rStyle w:val="Hyperlink"/>
+          </w:rPr>
+          <w:t>-</w:t>
+        </w:r>
+        <w:proofErr w:type="spellStart"/>
+        <w:r>
+          <w:rPr>
+            <w:rStyle w:val="Hyperlink"/>
+          </w:rPr>
+          <w:t>BasePath</w:t>
+        </w:r>
+        <w:proofErr w:type="spellEnd"/>
+        <w:r>
+          <w:rPr>
+            <w:rStyle w:val="Hyperlink"/>
+          </w:rPr>
+          <w:t>-Validation</w:t>
+        </w:r>
+      </w:hyperlink>
+    </w:p>
     <w:sectPr>
       <w:pgSz w:w="12240" w:h="15840"/>
       <w:pgMar w:top="1440" w:right="1440" w:bottom="1440" w:left="1440" w:header="720" w:footer="720" w:gutter="0"/>
@@ -17701,6 +18217,268 @@
     </w:lvl>
   </w:abstractNum>
   <w:abstractNum w:abstractNumId="13" w15:restartNumberingAfterBreak="0">
+    <w:nsid w:val="64124366"/>
+    <w:multiLevelType w:val="multilevel"/>
+    <w:tmpl w:val="E8744DD2"/>
+    <w:lvl w:ilvl="0">
+      <w:start w:val="1"/>
+      <w:numFmt w:val="bullet"/>
+      <w:lvlText w:val=""/>
+      <w:lvlJc w:val="left"/>
+      <w:pPr>
+        <w:tabs>
+          <w:tab w:val="num" w:pos="720"/>
+        </w:tabs>
+        <w:ind w:left="720" w:hanging="360"/>
+      </w:pPr>
+      <w:rPr>
+        <w:rFonts w:ascii="Symbol" w:hAnsi="Symbol" w:hint="default"/>
+        <w:sz w:val="20"/>
+      </w:rPr>
+    </w:lvl>
+    <w:lvl w:ilvl="1" w:tentative="1">
+      <w:start w:val="1"/>
+      <w:numFmt w:val="bullet"/>
+      <w:lvlText w:val=""/>
+      <w:lvlJc w:val="left"/>
+      <w:pPr>
+        <w:tabs>
+          <w:tab w:val="num" w:pos="1440"/>
+        </w:tabs>
+        <w:ind w:left="1440" w:hanging="360"/>
+      </w:pPr>
+      <w:rPr>
+        <w:rFonts w:ascii="Symbol" w:hAnsi="Symbol" w:hint="default"/>
+        <w:sz w:val="20"/>
+      </w:rPr>
+    </w:lvl>
+    <w:lvl w:ilvl="2" w:tentative="1">
+      <w:start w:val="1"/>
+      <w:numFmt w:val="bullet"/>
+      <w:lvlText w:val=""/>
+      <w:lvlJc w:val="left"/>
+      <w:pPr>
+        <w:tabs>
+          <w:tab w:val="num" w:pos="2160"/>
+        </w:tabs>
+        <w:ind w:left="2160" w:hanging="360"/>
+      </w:pPr>
+      <w:rPr>
+        <w:rFonts w:ascii="Symbol" w:hAnsi="Symbol" w:hint="default"/>
+        <w:sz w:val="20"/>
+      </w:rPr>
+    </w:lvl>
+    <w:lvl w:ilvl="3" w:tentative="1">
+      <w:start w:val="1"/>
+      <w:numFmt w:val="bullet"/>
+      <w:lvlText w:val=""/>
+      <w:lvlJc w:val="left"/>
+      <w:pPr>
+        <w:tabs>
+          <w:tab w:val="num" w:pos="2880"/>
+        </w:tabs>
+        <w:ind w:left="2880" w:hanging="360"/>
+      </w:pPr>
+      <w:rPr>
+        <w:rFonts w:ascii="Symbol" w:hAnsi="Symbol" w:hint="default"/>
+        <w:sz w:val="20"/>
+      </w:rPr>
+    </w:lvl>
+    <w:lvl w:ilvl="4" w:tentative="1">
+      <w:start w:val="1"/>
+      <w:numFmt w:val="bullet"/>
+      <w:lvlText w:val=""/>
+      <w:lvlJc w:val="left"/>
+      <w:pPr>
+        <w:tabs>
+          <w:tab w:val="num" w:pos="3600"/>
+        </w:tabs>
+        <w:ind w:left="3600" w:hanging="360"/>
+      </w:pPr>
+      <w:rPr>
+        <w:rFonts w:ascii="Symbol" w:hAnsi="Symbol" w:hint="default"/>
+        <w:sz w:val="20"/>
+      </w:rPr>
+    </w:lvl>
+    <w:lvl w:ilvl="5" w:tentative="1">
+      <w:start w:val="1"/>
+      <w:numFmt w:val="bullet"/>
+      <w:lvlText w:val=""/>
+      <w:lvlJc w:val="left"/>
+      <w:pPr>
+        <w:tabs>
+          <w:tab w:val="num" w:pos="4320"/>
+        </w:tabs>
+        <w:ind w:left="4320" w:hanging="360"/>
+      </w:pPr>
+      <w:rPr>
+        <w:rFonts w:ascii="Symbol" w:hAnsi="Symbol" w:hint="default"/>
+        <w:sz w:val="20"/>
+      </w:rPr>
+    </w:lvl>
+    <w:lvl w:ilvl="6" w:tentative="1">
+      <w:start w:val="1"/>
+      <w:numFmt w:val="bullet"/>
+      <w:lvlText w:val=""/>
+      <w:lvlJc w:val="left"/>
+      <w:pPr>
+        <w:tabs>
+          <w:tab w:val="num" w:pos="5040"/>
+        </w:tabs>
+        <w:ind w:left="5040" w:hanging="360"/>
+      </w:pPr>
+      <w:rPr>
+        <w:rFonts w:ascii="Symbol" w:hAnsi="Symbol" w:hint="default"/>
+        <w:sz w:val="20"/>
+      </w:rPr>
+    </w:lvl>
+    <w:lvl w:ilvl="7" w:tentative="1">
+      <w:start w:val="1"/>
+      <w:numFmt w:val="bullet"/>
+      <w:lvlText w:val=""/>
+      <w:lvlJc w:val="left"/>
+      <w:pPr>
+        <w:tabs>
+          <w:tab w:val="num" w:pos="5760"/>
+        </w:tabs>
+        <w:ind w:left="5760" w:hanging="360"/>
+      </w:pPr>
+      <w:rPr>
+        <w:rFonts w:ascii="Symbol" w:hAnsi="Symbol" w:hint="default"/>
+        <w:sz w:val="20"/>
+      </w:rPr>
+    </w:lvl>
+    <w:lvl w:ilvl="8" w:tentative="1">
+      <w:start w:val="1"/>
+      <w:numFmt w:val="bullet"/>
+      <w:lvlText w:val=""/>
+      <w:lvlJc w:val="left"/>
+      <w:pPr>
+        <w:tabs>
+          <w:tab w:val="num" w:pos="6480"/>
+        </w:tabs>
+        <w:ind w:left="6480" w:hanging="360"/>
+      </w:pPr>
+      <w:rPr>
+        <w:rFonts w:ascii="Symbol" w:hAnsi="Symbol" w:hint="default"/>
+        <w:sz w:val="20"/>
+      </w:rPr>
+    </w:lvl>
+  </w:abstractNum>
+  <w:abstractNum w:abstractNumId="14" w15:restartNumberingAfterBreak="0">
+    <w:nsid w:val="64B12C23"/>
+    <w:multiLevelType w:val="multilevel"/>
+    <w:tmpl w:val="F0E8A494"/>
+    <w:lvl w:ilvl="0">
+      <w:start w:val="1"/>
+      <w:numFmt w:val="decimal"/>
+      <w:lvlText w:val="%1."/>
+      <w:lvlJc w:val="left"/>
+      <w:pPr>
+        <w:tabs>
+          <w:tab w:val="num" w:pos="720"/>
+        </w:tabs>
+        <w:ind w:left="720" w:hanging="360"/>
+      </w:pPr>
+    </w:lvl>
+    <w:lvl w:ilvl="1" w:tentative="1">
+      <w:start w:val="1"/>
+      <w:numFmt w:val="decimal"/>
+      <w:lvlText w:val="%2."/>
+      <w:lvlJc w:val="left"/>
+      <w:pPr>
+        <w:tabs>
+          <w:tab w:val="num" w:pos="1440"/>
+        </w:tabs>
+        <w:ind w:left="1440" w:hanging="360"/>
+      </w:pPr>
+    </w:lvl>
+    <w:lvl w:ilvl="2" w:tentative="1">
+      <w:start w:val="1"/>
+      <w:numFmt w:val="decimal"/>
+      <w:lvlText w:val="%3."/>
+      <w:lvlJc w:val="left"/>
+      <w:pPr>
+        <w:tabs>
+          <w:tab w:val="num" w:pos="2160"/>
+        </w:tabs>
+        <w:ind w:left="2160" w:hanging="360"/>
+      </w:pPr>
+    </w:lvl>
+    <w:lvl w:ilvl="3" w:tentative="1">
+      <w:start w:val="1"/>
+      <w:numFmt w:val="decimal"/>
+      <w:lvlText w:val="%4."/>
+      <w:lvlJc w:val="left"/>
+      <w:pPr>
+        <w:tabs>
+          <w:tab w:val="num" w:pos="2880"/>
+        </w:tabs>
+        <w:ind w:left="2880" w:hanging="360"/>
+      </w:pPr>
+    </w:lvl>
+    <w:lvl w:ilvl="4" w:tentative="1">
+      <w:start w:val="1"/>
+      <w:numFmt w:val="decimal"/>
+      <w:lvlText w:val="%5."/>
+      <w:lvlJc w:val="left"/>
+      <w:pPr>
+        <w:tabs>
+          <w:tab w:val="num" w:pos="3600"/>
+        </w:tabs>
+        <w:ind w:left="3600" w:hanging="360"/>
+      </w:pPr>
+    </w:lvl>
+    <w:lvl w:ilvl="5" w:tentative="1">
+      <w:start w:val="1"/>
+      <w:numFmt w:val="decimal"/>
+      <w:lvlText w:val="%6."/>
+      <w:lvlJc w:val="left"/>
+      <w:pPr>
+        <w:tabs>
+          <w:tab w:val="num" w:pos="4320"/>
+        </w:tabs>
+        <w:ind w:left="4320" w:hanging="360"/>
+      </w:pPr>
+    </w:lvl>
+    <w:lvl w:ilvl="6" w:tentative="1">
+      <w:start w:val="1"/>
+      <w:numFmt w:val="decimal"/>
+      <w:lvlText w:val="%7."/>
+      <w:lvlJc w:val="left"/>
+      <w:pPr>
+        <w:tabs>
+          <w:tab w:val="num" w:pos="5040"/>
+        </w:tabs>
+        <w:ind w:left="5040" w:hanging="360"/>
+      </w:pPr>
+    </w:lvl>
+    <w:lvl w:ilvl="7" w:tentative="1">
+      <w:start w:val="1"/>
+      <w:numFmt w:val="decimal"/>
+      <w:lvlText w:val="%8."/>
+      <w:lvlJc w:val="left"/>
+      <w:pPr>
+        <w:tabs>
+          <w:tab w:val="num" w:pos="5760"/>
+        </w:tabs>
+        <w:ind w:left="5760" w:hanging="360"/>
+      </w:pPr>
+    </w:lvl>
+    <w:lvl w:ilvl="8" w:tentative="1">
+      <w:start w:val="1"/>
+      <w:numFmt w:val="decimal"/>
+      <w:lvlText w:val="%9."/>
+      <w:lvlJc w:val="left"/>
+      <w:pPr>
+        <w:tabs>
+          <w:tab w:val="num" w:pos="6480"/>
+        </w:tabs>
+        <w:ind w:left="6480" w:hanging="360"/>
+      </w:pPr>
+    </w:lvl>
+  </w:abstractNum>
+  <w:abstractNum w:abstractNumId="15" w15:restartNumberingAfterBreak="0">
     <w:nsid w:val="6544398A"/>
     <w:multiLevelType w:val="multilevel"/>
     <w:tmpl w:val="33D860BE"/>
@@ -17849,7 +18627,7 @@
       </w:rPr>
     </w:lvl>
   </w:abstractNum>
-  <w:abstractNum w:abstractNumId="14" w15:restartNumberingAfterBreak="0">
+  <w:abstractNum w:abstractNumId="16" w15:restartNumberingAfterBreak="0">
     <w:nsid w:val="6E4A6323"/>
     <w:multiLevelType w:val="multilevel"/>
     <w:tmpl w:val="FC2CE164"/>
@@ -17998,7 +18776,7 @@
       </w:rPr>
     </w:lvl>
   </w:abstractNum>
-  <w:abstractNum w:abstractNumId="15" w15:restartNumberingAfterBreak="0">
+  <w:abstractNum w:abstractNumId="17" w15:restartNumberingAfterBreak="0">
     <w:nsid w:val="7D283401"/>
     <w:multiLevelType w:val="multilevel"/>
     <w:tmpl w:val="7B2CC87A"/>
@@ -18151,10 +18929,10 @@
     <w:abstractNumId w:val="6"/>
   </w:num>
   <w:num w:numId="2" w16cid:durableId="1421364274">
-    <w:abstractNumId w:val="15"/>
+    <w:abstractNumId w:val="17"/>
   </w:num>
   <w:num w:numId="3" w16cid:durableId="550532365">
-    <w:abstractNumId w:val="14"/>
+    <w:abstractNumId w:val="16"/>
   </w:num>
   <w:num w:numId="4" w16cid:durableId="963272197">
     <w:abstractNumId w:val="0"/>
@@ -18163,7 +18941,7 @@
     </w:lvlOverride>
   </w:num>
   <w:num w:numId="5" w16cid:durableId="1933584062">
-    <w:abstractNumId w:val="13"/>
+    <w:abstractNumId w:val="15"/>
   </w:num>
   <w:num w:numId="6" w16cid:durableId="724834537">
     <w:abstractNumId w:val="1"/>
@@ -18218,6 +18996,15 @@
   </w:num>
   <w:num w:numId="16" w16cid:durableId="1790854044">
     <w:abstractNumId w:val="8"/>
+    <w:lvlOverride w:ilvl="0">
+      <w:startOverride w:val="1"/>
+    </w:lvlOverride>
+  </w:num>
+  <w:num w:numId="17" w16cid:durableId="1995067589">
+    <w:abstractNumId w:val="13"/>
+  </w:num>
+  <w:num w:numId="18" w16cid:durableId="218245054">
+    <w:abstractNumId w:val="14"/>
     <w:lvlOverride w:ilvl="0">
       <w:startOverride w:val="1"/>
     </w:lvlOverride>

</xml_diff>